<commit_message>
Deploying to gh-pages from @ Morrison-Lab/mds@7cd4bc1e1e2795701ee5964c543e3e908e8b0eb2 🚀
</commit_message>
<xml_diff>
--- a/algebra-sums.docx
+++ b/algebra-sums.docx
@@ -15,10 +15,10 @@
         <w:pStyle w:val="Date"/>
       </w:pPr>
       <w:r>
-        <w:t xml:space="preserve">Last modified: 2026-10-12 22:45:08 (PDT)</w:t>
+        <w:t xml:space="preserve">Last modified: 2026-10-13 01:20:47 (PDT)</w:t>
       </w:r>
     </w:p>
-    <w:bookmarkStart w:id="30" w:name="sec-convexity"/>
+    <w:bookmarkStart w:id="31" w:name="sec-convexity"/>
     <w:p>
       <w:pPr>
         <w:pStyle w:val="Heading2"/>
@@ -8970,7 +8970,7 @@
         </m:oMath>
       </m:oMathPara>
     </w:p>
-    <w:bookmarkStart w:id="27" w:name="exm-jensen"/>
+    <w:bookmarkStart w:id="28" w:name="exm-jensen"/>
     <w:p>
       <w:pPr>
         <w:pStyle w:val="FirstParagraph"/>
@@ -8980,7 +8980,7 @@
           <w:b/>
           <w:bCs/>
         </w:rPr>
-        <w:t xml:space="preserve">Example 5 (The mean of the squares is at least the square of the mean)</w:t>
+        <w:t xml:space="preserve">Example 5 (The average of the squares is at least the square of the average)</w:t>
       </w:r>
       <w:r>
         <w:t xml:space="preserve"> </w:t>
@@ -9530,7 +9530,7 @@
         <w:pStyle w:val="FirstParagraph"/>
       </w:pPr>
       <w:r>
-        <w:t xml:space="preserve">The weighted average of the points is their mean,</w:t>
+        <w:t xml:space="preserve">The weighted average of the points is their ordinary average,</w:t>
       </w:r>
       <w:r>
         <w:t xml:space="preserve"> </w:t>
@@ -9659,7 +9659,7 @@
         <w:t xml:space="preserve"> </w:t>
       </w:r>
       <w:r>
-        <w:t xml:space="preserve">The right side is the mean of the squares,</w:t>
+        <w:t xml:space="preserve">The right side is the average of the squares,</w:t>
       </w:r>
       <w:r>
         <w:t xml:space="preserve"> </w:t>
@@ -9841,7 +9841,7 @@
         <w:t xml:space="preserve"> </w:t>
       </w:r>
       <w:r>
-        <w:t xml:space="preserve">That is the average squared distance of the points from their mean,</w:t>
+        <w:t xml:space="preserve">That is the average squared distance of the points from their average,</w:t>
       </w:r>
       <w:r>
         <w:t xml:space="preserve"> </w:t>
@@ -10018,7 +10018,27 @@
         <w:t xml:space="preserve"> </w:t>
       </w:r>
       <w:r>
-        <w:t xml:space="preserve">which is the variance of the three points.</w:t>
+        <w:t xml:space="preserve">which statistics calls the variance of the three points</w:t>
+      </w:r>
+      <w:r>
+        <w:t xml:space="preserve"> </w:t>
+      </w:r>
+      <w:r>
+        <w:t xml:space="preserve">(about their</w:t>
+      </w:r>
+      <w:r>
+        <w:t xml:space="preserve"> </w:t>
+      </w:r>
+      <w:hyperlink r:id="rId27">
+        <w:r>
+          <w:rPr>
+            <w:rStyle w:val="Hyperlink"/>
+          </w:rPr>
+          <w:t xml:space="preserve">mean</w:t>
+        </w:r>
+      </w:hyperlink>
+      <w:r>
+        <w:t xml:space="preserve">, defined later).</w:t>
       </w:r>
       <w:r>
         <w:t xml:space="preserve"> </w:t>
@@ -10068,11 +10088,11 @@
         </m:sSup>
       </m:oMath>
       <w:r>
-        <w:t xml:space="preserve">, Jensen’s inequality says a variance is never negative.</w:t>
+        <w:t xml:space="preserve">, Jensen’s inequality says this average squared distance is never negative.</w:t>
       </w:r>
     </w:p>
-    <w:bookmarkEnd w:id="27"/>
-    <w:bookmarkStart w:id="29" w:name="rem-jensen-concave"/>
+    <w:bookmarkEnd w:id="28"/>
+    <w:bookmarkStart w:id="30" w:name="rem-jensen-concave"/>
     <w:p>
       <w:pPr>
         <w:pStyle w:val="BodyText"/>
@@ -10107,7 +10127,7 @@
       <w:r>
         <w:t xml:space="preserve"> </w:t>
       </w:r>
-      <w:hyperlink r:id="rId28">
+      <w:hyperlink r:id="rId29">
         <w:r>
           <w:rPr>
             <w:rStyle w:val="Hyperlink"/>
@@ -10459,9 +10479,9 @@
         <w:t xml:space="preserve">.</w:t>
       </w:r>
     </w:p>
-    <w:bookmarkEnd w:id="29"/>
     <w:bookmarkEnd w:id="30"/>
-    <w:bookmarkStart w:id="45" w:name="infimum-and-supremum"/>
+    <w:bookmarkEnd w:id="31"/>
+    <w:bookmarkStart w:id="46" w:name="infimum-and-supremum"/>
     <w:p>
       <w:pPr>
         <w:pStyle w:val="Heading2"/>
@@ -10470,7 +10490,7 @@
         <w:t xml:space="preserve">2 Infimum and supremum</w:t>
       </w:r>
     </w:p>
-    <w:bookmarkStart w:id="32" w:name="def-bounded"/>
+    <w:bookmarkStart w:id="33" w:name="def-bounded"/>
     <w:p>
       <w:pPr>
         <w:pStyle w:val="FirstParagraph"/>
@@ -10818,7 +10838,7 @@
       <w:r>
         <w:t xml:space="preserve"> </w:t>
       </w:r>
-      <w:hyperlink r:id="rId31">
+      <w:hyperlink r:id="rId32">
         <w:r>
           <w:rPr>
             <w:rStyle w:val="Hyperlink"/>
@@ -10833,8 +10853,8 @@
         <w:t xml:space="preserve">is.</w:t>
       </w:r>
     </w:p>
-    <w:bookmarkEnd w:id="32"/>
-    <w:bookmarkStart w:id="33" w:name="exm-bounded"/>
+    <w:bookmarkEnd w:id="33"/>
+    <w:bookmarkStart w:id="34" w:name="exm-bounded"/>
     <w:p>
       <w:pPr>
         <w:pStyle w:val="BodyText"/>
@@ -11212,8 +11232,8 @@
         <w:t xml:space="preserve">.</w:t>
       </w:r>
     </w:p>
-    <w:bookmarkEnd w:id="33"/>
-    <w:bookmarkStart w:id="36" w:name="thm-completeness"/>
+    <w:bookmarkEnd w:id="34"/>
+    <w:bookmarkStart w:id="37" w:name="thm-completeness"/>
     <w:p>
       <w:pPr>
         <w:pStyle w:val="FirstParagraph"/>
@@ -11321,7 +11341,7 @@
       <w:r>
         <w:t xml:space="preserve"> </w:t>
       </w:r>
-      <w:hyperlink r:id="rId34">
+      <w:hyperlink r:id="rId35">
         <w:r>
           <w:rPr>
             <w:rStyle w:val="Hyperlink"/>
@@ -11381,7 +11401,7 @@
       <w:r>
         <w:t xml:space="preserve"> </w:t>
       </w:r>
-      <w:hyperlink r:id="rId35">
+      <w:hyperlink r:id="rId36">
         <w:r>
           <w:rPr>
             <w:rStyle w:val="Hyperlink"/>
@@ -11393,7 +11413,7 @@
         <w:t xml:space="preserve">.</w:t>
       </w:r>
     </w:p>
-    <w:bookmarkEnd w:id="36"/>
+    <w:bookmarkEnd w:id="37"/>
     <w:p>
       <w:pPr>
         <w:pStyle w:val="FirstParagraph"/>
@@ -11510,7 +11530,7 @@
       <w:r>
         <w:t xml:space="preserve">Negating both sides of an inequality reverses it (</w:t>
       </w:r>
-      <w:hyperlink r:id="rId37">
+      <w:hyperlink r:id="rId38">
         <w:r>
           <w:rPr>
             <w:rStyle w:val="Hyperlink"/>
@@ -11673,7 +11693,7 @@
         <w:t xml:space="preserve">.</w:t>
       </w:r>
     </w:p>
-    <w:bookmarkStart w:id="38" w:name="exm-completeness"/>
+    <w:bookmarkStart w:id="39" w:name="exm-completeness"/>
     <w:p>
       <w:pPr>
         <w:pStyle w:val="BodyText"/>
@@ -11847,8 +11867,8 @@
         <w:t xml:space="preserve">.</w:t>
       </w:r>
     </w:p>
-    <w:bookmarkEnd w:id="38"/>
-    <w:bookmarkStart w:id="39" w:name="def-infimum"/>
+    <w:bookmarkEnd w:id="39"/>
+    <w:bookmarkStart w:id="40" w:name="def-infimum"/>
     <w:p>
       <w:pPr>
         <w:pStyle w:val="BodyText"/>
@@ -12219,8 +12239,8 @@
         <w:t xml:space="preserve">by convention.</w:t>
       </w:r>
     </w:p>
-    <w:bookmarkEnd w:id="39"/>
-    <w:bookmarkStart w:id="40" w:name="rem-infimum-exists"/>
+    <w:bookmarkEnd w:id="40"/>
+    <w:bookmarkStart w:id="41" w:name="rem-infimum-exists"/>
     <w:p>
       <w:pPr>
         <w:pStyle w:val="BodyText"/>
@@ -12711,8 +12731,8 @@
         <w:t xml:space="preserve">has no minimum.</w:t>
       </w:r>
     </w:p>
-    <w:bookmarkEnd w:id="40"/>
-    <w:bookmarkStart w:id="41" w:name="exm-infimum"/>
+    <w:bookmarkEnd w:id="41"/>
+    <w:bookmarkStart w:id="42" w:name="exm-infimum"/>
     <w:p>
       <w:pPr>
         <w:pStyle w:val="BodyText"/>
@@ -13301,8 +13321,8 @@
         <w:t xml:space="preserve">because no real number is less than or equal to every element of that set.</w:t>
       </w:r>
     </w:p>
-    <w:bookmarkEnd w:id="41"/>
-    <w:bookmarkStart w:id="42" w:name="def-supremum"/>
+    <w:bookmarkEnd w:id="42"/>
+    <w:bookmarkStart w:id="43" w:name="def-supremum"/>
     <w:p>
       <w:pPr>
         <w:pStyle w:val="FirstParagraph"/>
@@ -13673,8 +13693,8 @@
         <w:t xml:space="preserve">by convention.</w:t>
       </w:r>
     </w:p>
-    <w:bookmarkEnd w:id="42"/>
-    <w:bookmarkStart w:id="43" w:name="rem-supremum-exists"/>
+    <w:bookmarkEnd w:id="43"/>
+    <w:bookmarkStart w:id="44" w:name="rem-supremum-exists"/>
     <w:p>
       <w:pPr>
         <w:pStyle w:val="BodyText"/>
@@ -14165,8 +14185,8 @@
         <w:t xml:space="preserve">has no maximum.</w:t>
       </w:r>
     </w:p>
-    <w:bookmarkEnd w:id="43"/>
-    <w:bookmarkStart w:id="44" w:name="exm-supremum"/>
+    <w:bookmarkEnd w:id="44"/>
+    <w:bookmarkStart w:id="45" w:name="exm-supremum"/>
     <w:p>
       <w:pPr>
         <w:pStyle w:val="BodyText"/>
@@ -14441,9 +14461,9 @@
         <w:t xml:space="preserve">because no real number is greater than or equal to every element of that set.</w:t>
       </w:r>
     </w:p>
-    <w:bookmarkEnd w:id="44"/>
     <w:bookmarkEnd w:id="45"/>
-    <w:bookmarkStart w:id="58" w:name="sums"/>
+    <w:bookmarkEnd w:id="46"/>
+    <w:bookmarkStart w:id="59" w:name="sums"/>
     <w:p>
       <w:pPr>
         <w:pStyle w:val="Heading2"/>
@@ -14452,7 +14472,7 @@
         <w:t xml:space="preserve">3 Sums</w:t>
       </w:r>
     </w:p>
-    <w:bookmarkStart w:id="46" w:name="def-term"/>
+    <w:bookmarkStart w:id="47" w:name="def-term"/>
     <w:p>
       <w:pPr>
         <w:pStyle w:val="FirstParagraph"/>
@@ -14638,8 +14658,8 @@
         <w:t xml:space="preserve">of the sum.</w:t>
       </w:r>
     </w:p>
-    <w:bookmarkEnd w:id="46"/>
-    <w:bookmarkStart w:id="47" w:name="exm-term"/>
+    <w:bookmarkEnd w:id="47"/>
+    <w:bookmarkStart w:id="48" w:name="exm-term"/>
     <w:p>
       <w:pPr>
         <w:pStyle w:val="BodyText"/>
@@ -14911,8 +14931,8 @@
         <w:t xml:space="preserve">A subtracted expression counts as a term with a minus sign.</w:t>
       </w:r>
     </w:p>
-    <w:bookmarkEnd w:id="47"/>
-    <w:bookmarkStart w:id="48" w:name="def-identity-element"/>
+    <w:bookmarkEnd w:id="48"/>
+    <w:bookmarkStart w:id="49" w:name="def-identity-element"/>
     <w:p>
       <w:pPr>
         <w:pStyle w:val="FirstParagraph"/>
@@ -15250,8 +15270,8 @@
         <w:t xml:space="preserve">.</w:t>
       </w:r>
     </w:p>
-    <w:bookmarkEnd w:id="48"/>
-    <w:bookmarkStart w:id="49" w:name="exm-identity-element"/>
+    <w:bookmarkEnd w:id="49"/>
+    <w:bookmarkStart w:id="50" w:name="exm-identity-element"/>
     <w:p>
       <w:pPr>
         <w:pStyle w:val="BodyText"/>
@@ -15565,8 +15585,8 @@
         <w:t xml:space="preserve">.</w:t>
       </w:r>
     </w:p>
-    <w:bookmarkEnd w:id="49"/>
-    <w:bookmarkStart w:id="50" w:name="def-commutative"/>
+    <w:bookmarkEnd w:id="50"/>
+    <w:bookmarkStart w:id="51" w:name="def-commutative"/>
     <w:p>
       <w:pPr>
         <w:pStyle w:val="FirstParagraph"/>
@@ -15781,8 +15801,8 @@
         <w:t xml:space="preserve">.</w:t>
       </w:r>
     </w:p>
-    <w:bookmarkEnd w:id="50"/>
-    <w:bookmarkStart w:id="51" w:name="exm-commutative"/>
+    <w:bookmarkEnd w:id="51"/>
+    <w:bookmarkStart w:id="52" w:name="exm-commutative"/>
     <w:p>
       <w:pPr>
         <w:pStyle w:val="BodyText"/>
@@ -15956,8 +15976,8 @@
         <w:t xml:space="preserve">.</w:t>
       </w:r>
     </w:p>
-    <w:bookmarkEnd w:id="51"/>
-    <w:bookmarkStart w:id="52" w:name="def-associative"/>
+    <w:bookmarkEnd w:id="52"/>
+    <w:bookmarkStart w:id="53" w:name="def-associative"/>
     <w:p>
       <w:pPr>
         <w:pStyle w:val="FirstParagraph"/>
@@ -16167,8 +16187,8 @@
         <w:t xml:space="preserve">which pair is combined first does not matter.</w:t>
       </w:r>
     </w:p>
-    <w:bookmarkEnd w:id="52"/>
-    <w:bookmarkStart w:id="53" w:name="exm-associative"/>
+    <w:bookmarkEnd w:id="53"/>
+    <w:bookmarkStart w:id="54" w:name="exm-associative"/>
     <w:p>
       <w:pPr>
         <w:pStyle w:val="BodyText"/>
@@ -16591,8 +16611,8 @@
         </m:oMath>
       </m:oMathPara>
     </w:p>
-    <w:bookmarkEnd w:id="53"/>
-    <w:bookmarkStart w:id="54" w:name="thm-add-ident"/>
+    <w:bookmarkEnd w:id="54"/>
+    <w:bookmarkStart w:id="55" w:name="thm-add-ident"/>
     <w:p>
       <w:pPr>
         <w:pStyle w:val="FirstParagraph"/>
@@ -16638,8 +16658,8 @@
         </m:oMath>
       </m:oMathPara>
     </w:p>
-    <w:bookmarkEnd w:id="54"/>
-    <w:bookmarkStart w:id="55" w:name="thm-sum-symmetric"/>
+    <w:bookmarkEnd w:id="55"/>
+    <w:bookmarkStart w:id="56" w:name="thm-sum-symmetric"/>
     <w:p>
       <w:pPr>
         <w:pStyle w:val="FirstParagraph"/>
@@ -16694,8 +16714,8 @@
         </m:oMath>
       </m:oMathPara>
     </w:p>
-    <w:bookmarkEnd w:id="55"/>
-    <w:bookmarkStart w:id="56" w:name="thm-sum-assoc"/>
+    <w:bookmarkEnd w:id="56"/>
+    <w:bookmarkStart w:id="57" w:name="thm-sum-assoc"/>
     <w:p>
       <w:pPr>
         <w:pStyle w:val="FirstParagraph"/>
@@ -16804,8 +16824,8 @@
         </m:oMath>
       </m:oMathPara>
     </w:p>
-    <w:bookmarkEnd w:id="56"/>
-    <w:bookmarkStart w:id="57" w:name="exm-sum-assoc"/>
+    <w:bookmarkEnd w:id="57"/>
+    <w:bookmarkStart w:id="58" w:name="exm-sum-assoc"/>
     <w:p>
       <w:pPr>
         <w:pStyle w:val="FirstParagraph"/>
@@ -17006,9 +17026,9 @@
         </m:oMath>
       </m:oMathPara>
     </w:p>
-    <w:bookmarkEnd w:id="57"/>
     <w:bookmarkEnd w:id="58"/>
-    <w:bookmarkStart w:id="62" w:name="products"/>
+    <w:bookmarkEnd w:id="59"/>
+    <w:bookmarkStart w:id="63" w:name="products"/>
     <w:p>
       <w:pPr>
         <w:pStyle w:val="Heading2"/>
@@ -17017,7 +17037,7 @@
         <w:t xml:space="preserve">4 Products</w:t>
       </w:r>
     </w:p>
-    <w:bookmarkStart w:id="59" w:name="thm-mult-one"/>
+    <w:bookmarkStart w:id="60" w:name="thm-mult-one"/>
     <w:p>
       <w:pPr>
         <w:pStyle w:val="FirstParagraph"/>
@@ -17063,8 +17083,8 @@
         </m:oMath>
       </m:oMathPara>
     </w:p>
-    <w:bookmarkEnd w:id="59"/>
-    <w:bookmarkStart w:id="60" w:name="thm-prod-symmetric"/>
+    <w:bookmarkEnd w:id="60"/>
+    <w:bookmarkStart w:id="61" w:name="thm-prod-symmetric"/>
     <w:p>
       <w:pPr>
         <w:pStyle w:val="FirstParagraph"/>
@@ -17119,8 +17139,8 @@
         </m:oMath>
       </m:oMathPara>
     </w:p>
-    <w:bookmarkEnd w:id="60"/>
-    <w:bookmarkStart w:id="61" w:name="thm-prod-assoc"/>
+    <w:bookmarkEnd w:id="61"/>
+    <w:bookmarkStart w:id="62" w:name="thm-prod-assoc"/>
     <w:p>
       <w:pPr>
         <w:pStyle w:val="FirstParagraph"/>
@@ -17217,9 +17237,9 @@
         </m:oMath>
       </m:oMathPara>
     </w:p>
-    <w:bookmarkEnd w:id="61"/>
     <w:bookmarkEnd w:id="62"/>
-    <w:bookmarkStart w:id="64" w:name="division"/>
+    <w:bookmarkEnd w:id="63"/>
+    <w:bookmarkStart w:id="65" w:name="division"/>
     <w:p>
       <w:pPr>
         <w:pStyle w:val="Heading2"/>
@@ -17228,7 +17248,7 @@
         <w:t xml:space="preserve">5 Division</w:t>
       </w:r>
     </w:p>
-    <w:bookmarkStart w:id="63" w:name="thm-prod-div"/>
+    <w:bookmarkStart w:id="64" w:name="thm-prod-div"/>
     <w:p>
       <w:pPr>
         <w:pStyle w:val="FirstParagraph"/>
@@ -17324,9 +17344,9 @@
         </m:oMath>
       </m:oMathPara>
     </w:p>
-    <w:bookmarkEnd w:id="63"/>
     <w:bookmarkEnd w:id="64"/>
-    <w:bookmarkStart w:id="74" w:name="sums-and-products-together"/>
+    <w:bookmarkEnd w:id="65"/>
+    <w:bookmarkStart w:id="75" w:name="sums-and-products-together"/>
     <w:p>
       <w:pPr>
         <w:pStyle w:val="Heading2"/>
@@ -17335,7 +17355,7 @@
         <w:t xml:space="preserve">6 Sums and products together</w:t>
       </w:r>
     </w:p>
-    <w:bookmarkStart w:id="65" w:name="def-distributive"/>
+    <w:bookmarkStart w:id="66" w:name="def-distributive"/>
     <w:p>
       <w:pPr>
         <w:pStyle w:val="FirstParagraph"/>
@@ -17750,8 +17770,8 @@
         <w:t xml:space="preserve">.</w:t>
       </w:r>
     </w:p>
-    <w:bookmarkEnd w:id="65"/>
-    <w:bookmarkStart w:id="66" w:name="exm-distributive"/>
+    <w:bookmarkEnd w:id="66"/>
+    <w:bookmarkStart w:id="67" w:name="exm-distributive"/>
     <w:p>
       <w:pPr>
         <w:pStyle w:val="BodyText"/>
@@ -18205,8 +18225,8 @@
         </m:oMath>
       </m:oMathPara>
     </w:p>
-    <w:bookmarkEnd w:id="66"/>
-    <w:bookmarkStart w:id="67" w:name="thm-mult-distr"/>
+    <w:bookmarkEnd w:id="67"/>
+    <w:bookmarkStart w:id="68" w:name="thm-mult-distr"/>
     <w:p>
       <w:pPr>
         <w:pStyle w:val="FirstParagraph"/>
@@ -18282,8 +18302,8 @@
         </m:oMath>
       </m:oMathPara>
     </w:p>
-    <w:bookmarkEnd w:id="67"/>
-    <w:bookmarkStart w:id="68" w:name="def-like-terms"/>
+    <w:bookmarkEnd w:id="68"/>
+    <w:bookmarkStart w:id="69" w:name="def-like-terms"/>
     <w:p>
       <w:pPr>
         <w:pStyle w:val="FirstParagraph"/>
@@ -18590,8 +18610,8 @@
         <w:t xml:space="preserve">.</w:t>
       </w:r>
     </w:p>
-    <w:bookmarkEnd w:id="68"/>
-    <w:bookmarkStart w:id="69" w:name="exm-like-terms"/>
+    <w:bookmarkEnd w:id="69"/>
+    <w:bookmarkStart w:id="70" w:name="exm-like-terms"/>
     <w:p>
       <w:pPr>
         <w:pStyle w:val="BodyText"/>
@@ -18858,8 +18878,8 @@
         <w:t xml:space="preserve">appears to different powers.</w:t>
       </w:r>
     </w:p>
-    <w:bookmarkEnd w:id="69"/>
-    <w:bookmarkStart w:id="70" w:name="exr-square-of-a-sum"/>
+    <w:bookmarkEnd w:id="70"/>
+    <w:bookmarkStart w:id="71" w:name="exr-square-of-a-sum"/>
     <w:p>
       <w:pPr>
         <w:pStyle w:val="FirstParagraph"/>
@@ -19041,8 +19061,8 @@
         <w:t xml:space="preserve">using only the distributive law and the rules above.</w:t>
       </w:r>
     </w:p>
-    <w:bookmarkEnd w:id="70"/>
-    <w:bookmarkStart w:id="71" w:name="sol-square-of-a-sum"/>
+    <w:bookmarkEnd w:id="71"/>
+    <w:bookmarkStart w:id="72" w:name="sol-square-of-a-sum"/>
     <w:p>
       <w:pPr>
         <w:pStyle w:val="BodyText"/>
@@ -19906,8 +19926,8 @@
         <w:t xml:space="preserve">to drop the parentheses.</w:t>
       </w:r>
     </w:p>
-    <w:bookmarkEnd w:id="71"/>
-    <w:bookmarkStart w:id="72" w:name="thm-square-of-a-sum"/>
+    <w:bookmarkEnd w:id="72"/>
+    <w:bookmarkStart w:id="73" w:name="thm-square-of-a-sum"/>
     <w:p>
       <w:pPr>
         <w:pStyle w:val="BodyText"/>
@@ -20047,7 +20067,7 @@
         </m:oMath>
       </m:oMathPara>
     </w:p>
-    <w:bookmarkEnd w:id="72"/>
+    <w:bookmarkEnd w:id="73"/>
     <w:p>
       <w:pPr>
         <w:pStyle w:val="FirstParagraph"/>
@@ -20080,7 +20100,7 @@
         <w:t xml:space="preserve">.</w:t>
       </w:r>
     </w:p>
-    <w:bookmarkStart w:id="73" w:name="rem-square-of-a-difference"/>
+    <w:bookmarkStart w:id="74" w:name="rem-square-of-a-difference"/>
     <w:p>
       <w:pPr>
         <w:pStyle w:val="BodyText"/>
@@ -20617,9 +20637,9 @@
         </m:oMath>
       </m:oMathPara>
     </w:p>
-    <w:bookmarkEnd w:id="73"/>
     <w:bookmarkEnd w:id="74"/>
-    <w:bookmarkStart w:id="93" w:name="sec-summation"/>
+    <w:bookmarkEnd w:id="75"/>
+    <w:bookmarkStart w:id="94" w:name="sec-summation"/>
     <w:p>
       <w:pPr>
         <w:pStyle w:val="Heading2"/>
@@ -20628,7 +20648,7 @@
         <w:t xml:space="preserve">7 Summation notation</w:t>
       </w:r>
     </w:p>
-    <w:bookmarkStart w:id="75" w:name="exr-expand-a-sum"/>
+    <w:bookmarkStart w:id="76" w:name="exr-expand-a-sum"/>
     <w:p>
       <w:pPr>
         <w:pStyle w:val="FirstParagraph"/>
@@ -20880,8 +20900,8 @@
         <w:t xml:space="preserve">symbol.</w:t>
       </w:r>
     </w:p>
-    <w:bookmarkEnd w:id="75"/>
-    <w:bookmarkStart w:id="76" w:name="sol-expand-a-sum"/>
+    <w:bookmarkEnd w:id="76"/>
+    <w:bookmarkStart w:id="77" w:name="sol-expand-a-sum"/>
     <w:p>
       <w:pPr>
         <w:pStyle w:val="FirstParagraph"/>
@@ -21595,8 +21615,8 @@
         </m:oMath>
       </m:oMathPara>
     </w:p>
-    <w:bookmarkEnd w:id="76"/>
-    <w:bookmarkStart w:id="77" w:name="def-summation"/>
+    <w:bookmarkEnd w:id="77"/>
+    <w:bookmarkStart w:id="78" w:name="def-summation"/>
     <w:p>
       <w:pPr>
         <w:pStyle w:val="FirstParagraph"/>
@@ -22053,8 +22073,8 @@
         <w:t xml:space="preserve">.</w:t>
       </w:r>
     </w:p>
-    <w:bookmarkEnd w:id="77"/>
-    <w:bookmarkStart w:id="78" w:name="rem-summation-index"/>
+    <w:bookmarkEnd w:id="78"/>
+    <w:bookmarkStart w:id="79" w:name="rem-summation-index"/>
     <w:p>
       <w:pPr>
         <w:pStyle w:val="BodyText"/>
@@ -22381,8 +22401,8 @@
         </m:oMath>
       </m:oMathPara>
     </w:p>
-    <w:bookmarkEnd w:id="78"/>
-    <w:bookmarkStart w:id="79" w:name="def-empty-sum"/>
+    <w:bookmarkEnd w:id="79"/>
+    <w:bookmarkStart w:id="80" w:name="def-empty-sum"/>
     <w:p>
       <w:pPr>
         <w:pStyle w:val="FirstParagraph"/>
@@ -22573,8 +22593,8 @@
         <w:t xml:space="preserve">.</w:t>
       </w:r>
     </w:p>
-    <w:bookmarkEnd w:id="79"/>
-    <w:bookmarkStart w:id="80" w:name="exr-sum-rules"/>
+    <w:bookmarkEnd w:id="80"/>
+    <w:bookmarkStart w:id="81" w:name="exr-sum-rules"/>
     <w:p>
       <w:pPr>
         <w:pStyle w:val="BodyText"/>
@@ -23050,8 +23070,8 @@
         <w:t xml:space="preserve">Does either argument depend on there being exactly three terms?</w:t>
       </w:r>
     </w:p>
-    <w:bookmarkEnd w:id="80"/>
-    <w:bookmarkStart w:id="81" w:name="sol-sum-rules"/>
+    <w:bookmarkEnd w:id="81"/>
+    <w:bookmarkStart w:id="82" w:name="sol-sum-rules"/>
     <w:p>
       <w:pPr>
         <w:pStyle w:val="BodyText"/>
@@ -24031,8 +24051,8 @@
         <w:t xml:space="preserve">the same steps work for any lower and upper limits.</w:t>
       </w:r>
     </w:p>
-    <w:bookmarkEnd w:id="81"/>
-    <w:bookmarkStart w:id="82" w:name="thm-sum-constant-factor"/>
+    <w:bookmarkEnd w:id="82"/>
+    <w:bookmarkStart w:id="83" w:name="thm-sum-constant-factor"/>
     <w:p>
       <w:pPr>
         <w:pStyle w:val="BodyText"/>
@@ -24224,7 +24244,7 @@
         </m:oMath>
       </m:oMathPara>
     </w:p>
-    <w:bookmarkEnd w:id="82"/>
+    <w:bookmarkEnd w:id="83"/>
     <w:p>
       <w:pPr>
         <w:pStyle w:val="FirstParagraph"/>
@@ -24257,7 +24277,7 @@
         <w:t xml:space="preserve">, part 1.</w:t>
       </w:r>
     </w:p>
-    <w:bookmarkStart w:id="83" w:name="thm-sum-of-sums"/>
+    <w:bookmarkStart w:id="84" w:name="thm-sum-of-sums"/>
     <w:p>
       <w:pPr>
         <w:pStyle w:val="BodyText"/>
@@ -24560,7 +24580,7 @@
         </m:oMath>
       </m:oMathPara>
     </w:p>
-    <w:bookmarkEnd w:id="83"/>
+    <w:bookmarkEnd w:id="84"/>
     <w:p>
       <w:pPr>
         <w:pStyle w:val="FirstParagraph"/>
@@ -24593,7 +24613,7 @@
         <w:t xml:space="preserve">, part 2.</w:t>
       </w:r>
     </w:p>
-    <w:bookmarkStart w:id="84" w:name="exr-sum-over-set"/>
+    <w:bookmarkStart w:id="85" w:name="exr-sum-over-set"/>
     <w:p>
       <w:pPr>
         <w:pStyle w:val="BodyText"/>
@@ -24968,8 +24988,8 @@
         <w:t xml:space="preserve">Is the total the same?</w:t>
       </w:r>
     </w:p>
-    <w:bookmarkEnd w:id="84"/>
-    <w:bookmarkStart w:id="85" w:name="sol-sum-over-set"/>
+    <w:bookmarkEnd w:id="85"/>
+    <w:bookmarkStart w:id="86" w:name="sol-sum-over-set"/>
     <w:p>
       <w:pPr>
         <w:pStyle w:val="FirstParagraph"/>
@@ -25429,8 +25449,8 @@
         <w:t xml:space="preserve">because addition does not depend on the order of the terms.</w:t>
       </w:r>
     </w:p>
-    <w:bookmarkEnd w:id="85"/>
-    <w:bookmarkStart w:id="88" w:name="def-sum-over-set"/>
+    <w:bookmarkEnd w:id="86"/>
+    <w:bookmarkStart w:id="89" w:name="def-sum-over-set"/>
     <w:p>
       <w:pPr>
         <w:pStyle w:val="FirstParagraph"/>
@@ -25547,7 +25567,7 @@
       <w:r>
         <w:t xml:space="preserve"> </w:t>
       </w:r>
-      <w:hyperlink r:id="rId86">
+      <w:hyperlink r:id="rId87">
         <w:r>
           <w:rPr>
             <w:rStyle w:val="Hyperlink"/>
@@ -25558,7 +25578,7 @@
       <w:r>
         <w:t xml:space="preserve"> </w:t>
       </w:r>
-      <w:hyperlink r:id="rId87">
+      <w:hyperlink r:id="rId88">
         <w:r>
           <w:rPr>
             <w:rStyle w:val="Hyperlink"/>
@@ -26045,8 +26065,8 @@
         <w:t xml:space="preserve">.</w:t>
       </w:r>
     </w:p>
-    <w:bookmarkEnd w:id="88"/>
-    <w:bookmarkStart w:id="89" w:name="rem-sum-over-set-order"/>
+    <w:bookmarkEnd w:id="89"/>
+    <w:bookmarkStart w:id="90" w:name="rem-sum-over-set-order"/>
     <w:p>
       <w:pPr>
         <w:pStyle w:val="BodyText"/>
@@ -26559,8 +26579,8 @@
         <w:t xml:space="preserve">.</w:t>
       </w:r>
     </w:p>
-    <w:bookmarkEnd w:id="89"/>
-    <w:bookmarkStart w:id="92" w:name="rem-sum-without-set"/>
+    <w:bookmarkEnd w:id="90"/>
+    <w:bookmarkStart w:id="93" w:name="rem-sum-without-set"/>
     <w:p>
       <w:pPr>
         <w:pStyle w:val="BodyText"/>
@@ -26760,7 +26780,7 @@
       <w:r>
         <w:t xml:space="preserve"> </w:t>
       </w:r>
-      <w:hyperlink r:id="rId90">
+      <w:hyperlink r:id="rId91">
         <w:r>
           <w:rPr>
             <w:rStyle w:val="Hyperlink"/>
@@ -26985,7 +27005,7 @@
       <w:r>
         <w:t xml:space="preserve"> </w:t>
       </w:r>
-      <w:hyperlink r:id="rId91">
+      <w:hyperlink r:id="rId92">
         <w:r>
           <w:rPr>
             <w:rStyle w:val="Hyperlink"/>
@@ -26997,9 +27017,9 @@
         <w:t xml:space="preserve">).</w:t>
       </w:r>
     </w:p>
-    <w:bookmarkEnd w:id="92"/>
     <w:bookmarkEnd w:id="93"/>
-    <w:bookmarkStart w:id="114" w:name="quotients"/>
+    <w:bookmarkEnd w:id="94"/>
+    <w:bookmarkStart w:id="115" w:name="quotients"/>
     <w:p>
       <w:pPr>
         <w:pStyle w:val="Heading2"/>
@@ -27008,7 +27028,7 @@
         <w:t xml:space="preserve">8 Quotients</w:t>
       </w:r>
     </w:p>
-    <w:bookmarkStart w:id="94" w:name="def-quotient"/>
+    <w:bookmarkStart w:id="95" w:name="def-quotient"/>
     <w:p>
       <w:pPr>
         <w:pStyle w:val="FirstParagraph"/>
@@ -27177,8 +27197,8 @@
         </m:oMath>
       </m:oMathPara>
     </w:p>
-    <w:bookmarkEnd w:id="94"/>
-    <w:bookmarkStart w:id="95" w:name="def-fraction"/>
+    <w:bookmarkEnd w:id="95"/>
+    <w:bookmarkStart w:id="96" w:name="def-fraction"/>
     <w:p>
       <w:pPr>
         <w:pStyle w:val="FirstParagraph"/>
@@ -27361,8 +27381,8 @@
         <w:t xml:space="preserve">.</w:t>
       </w:r>
     </w:p>
-    <w:bookmarkEnd w:id="95"/>
-    <w:bookmarkStart w:id="96" w:name="exm-quotient"/>
+    <w:bookmarkEnd w:id="96"/>
+    <w:bookmarkStart w:id="97" w:name="exm-quotient"/>
     <w:p>
       <w:pPr>
         <w:pStyle w:val="BodyText"/>
@@ -27498,8 +27518,8 @@
         <w:t xml:space="preserve">requires a nonzero denominator.</w:t>
       </w:r>
     </w:p>
-    <w:bookmarkEnd w:id="96"/>
-    <w:bookmarkStart w:id="97" w:name="def-person-years"/>
+    <w:bookmarkEnd w:id="97"/>
+    <w:bookmarkStart w:id="98" w:name="def-person-years"/>
     <w:p>
       <w:pPr>
         <w:pStyle w:val="BodyText"/>
@@ -27568,8 +27588,8 @@
         <w:t xml:space="preserve">measured in years.</w:t>
       </w:r>
     </w:p>
-    <w:bookmarkEnd w:id="97"/>
-    <w:bookmarkStart w:id="98" w:name="exm-person-years"/>
+    <w:bookmarkEnd w:id="98"/>
+    <w:bookmarkStart w:id="99" w:name="exm-person-years"/>
     <w:p>
       <w:pPr>
         <w:pStyle w:val="BodyText"/>
@@ -27750,8 +27770,8 @@
         <w:t xml:space="preserve">person-years.</w:t>
       </w:r>
     </w:p>
-    <w:bookmarkEnd w:id="98"/>
-    <w:bookmarkStart w:id="99" w:name="def-rate"/>
+    <w:bookmarkEnd w:id="99"/>
+    <w:bookmarkStart w:id="100" w:name="def-rate"/>
     <w:p>
       <w:pPr>
         <w:pStyle w:val="BodyText"/>
@@ -27977,7 +27997,7 @@
         <w:t xml:space="preserve">cases per person-year.</w:t>
       </w:r>
     </w:p>
-    <w:bookmarkEnd w:id="99"/>
+    <w:bookmarkEnd w:id="100"/>
     <w:p>
       <w:pPr>
         <w:pStyle w:val="BodyText"/>
@@ -27985,7 +28005,7 @@
       <w:r>
         <w:t xml:space="preserve">cf. </w:t>
       </w:r>
-      <w:hyperlink r:id="rId100">
+      <w:hyperlink r:id="rId101">
         <w:r>
           <w:rPr>
             <w:rStyle w:val="Hyperlink"/>
@@ -27994,7 +28014,7 @@
         </w:r>
       </w:hyperlink>
     </w:p>
-    <w:bookmarkStart w:id="102" w:name="def-ratio"/>
+    <w:bookmarkStart w:id="103" w:name="def-ratio"/>
     <w:p>
       <w:pPr>
         <w:pStyle w:val="BodyText"/>
@@ -28036,7 +28056,7 @@
       <w:r>
         <w:t xml:space="preserve">cf. </w:t>
       </w:r>
-      <w:hyperlink r:id="rId101">
+      <w:hyperlink r:id="rId102">
         <w:r>
           <w:rPr>
             <w:rStyle w:val="Hyperlink"/>
@@ -28045,8 +28065,8 @@
         </w:r>
       </w:hyperlink>
     </w:p>
-    <w:bookmarkEnd w:id="102"/>
-    <w:bookmarkStart w:id="103" w:name="exm-ratio"/>
+    <w:bookmarkEnd w:id="103"/>
+    <w:bookmarkStart w:id="104" w:name="exm-ratio"/>
     <w:p>
       <w:pPr>
         <w:pStyle w:val="BodyText"/>
@@ -28304,8 +28324,8 @@
         <w:t xml:space="preserve">so this quotient is not a ratio.</w:t>
       </w:r>
     </w:p>
-    <w:bookmarkEnd w:id="103"/>
-    <w:bookmarkStart w:id="106" w:name="def-proportion"/>
+    <w:bookmarkEnd w:id="104"/>
+    <w:bookmarkStart w:id="107" w:name="def-proportion"/>
     <w:p>
       <w:pPr>
         <w:pStyle w:val="FirstParagraph"/>
@@ -28356,7 +28376,7 @@
       <w:r>
         <w:t xml:space="preserve"> </w:t>
       </w:r>
-      <w:hyperlink r:id="rId104">
+      <w:hyperlink r:id="rId105">
         <w:r>
           <w:rPr>
             <w:rStyle w:val="Hyperlink"/>
@@ -28378,7 +28398,7 @@
       <w:r>
         <w:t xml:space="preserve"> </w:t>
       </w:r>
-      <w:hyperlink r:id="rId105">
+      <w:hyperlink r:id="rId106">
         <w:r>
           <w:rPr>
             <w:rStyle w:val="Hyperlink"/>
@@ -28393,8 +28413,8 @@
         <w:t xml:space="preserve">for other meanings.</w:t>
       </w:r>
     </w:p>
-    <w:bookmarkEnd w:id="106"/>
-    <w:bookmarkStart w:id="107" w:name="exm-proportion"/>
+    <w:bookmarkEnd w:id="107"/>
+    <w:bookmarkStart w:id="108" w:name="exm-proportion"/>
     <w:p>
       <w:pPr>
         <w:pStyle w:val="BodyText"/>
@@ -28615,8 +28635,8 @@
         <w:t xml:space="preserve">non-smokers.</w:t>
       </w:r>
     </w:p>
-    <w:bookmarkEnd w:id="107"/>
-    <w:bookmarkStart w:id="109" w:name="def-proportional"/>
+    <w:bookmarkEnd w:id="108"/>
+    <w:bookmarkStart w:id="110" w:name="def-proportional"/>
     <w:p>
       <w:pPr>
         <w:pStyle w:val="FirstParagraph"/>
@@ -28787,7 +28807,7 @@
       <w:r>
         <w:t xml:space="preserve">(cf. </w:t>
       </w:r>
-      <w:hyperlink r:id="rId108">
+      <w:hyperlink r:id="rId109">
         <w:r>
           <w:rPr>
             <w:rStyle w:val="Hyperlink"/>
@@ -28799,8 +28819,8 @@
         <w:t xml:space="preserve">)</w:t>
       </w:r>
     </w:p>
-    <w:bookmarkEnd w:id="109"/>
-    <w:bookmarkStart w:id="110" w:name="exm-proportional"/>
+    <w:bookmarkEnd w:id="110"/>
+    <w:bookmarkStart w:id="111" w:name="exm-proportional"/>
     <w:p>
       <w:pPr>
         <w:pStyle w:val="BodyText"/>
@@ -29493,7 +29513,7 @@
         <w:t xml:space="preserve">.</w:t>
       </w:r>
     </w:p>
-    <w:bookmarkEnd w:id="110"/>
+    <w:bookmarkEnd w:id="111"/>
     <w:p>
       <w:pPr>
         <w:pStyle w:val="FirstParagraph"/>
@@ -29504,7 +29524,7 @@
       <w:r>
         <w:t xml:space="preserve"> </w:t>
       </w:r>
-      <w:hyperlink r:id="rId111">
+      <w:hyperlink r:id="rId112">
         <w:r>
           <w:rPr>
             <w:rStyle w:val="Hyperlink"/>
@@ -29513,8 +29533,8 @@
         </w:r>
       </w:hyperlink>
     </w:p>
-    <w:bookmarkStart w:id="113" w:name="refs"/>
-    <w:bookmarkStart w:id="112" w:name="ref-rudin1976principles"/>
+    <w:bookmarkStart w:id="114" w:name="refs"/>
+    <w:bookmarkStart w:id="113" w:name="ref-rudin1976principles"/>
     <w:p>
       <w:pPr>
         <w:pStyle w:val="Bibliography"/>
@@ -29536,9 +29556,9 @@
         <w:t xml:space="preserve">. 3rd ed. International Series in Pure and Applied Mathematics. McGraw-Hill.</w:t>
       </w:r>
     </w:p>
-    <w:bookmarkEnd w:id="112"/>
     <w:bookmarkEnd w:id="113"/>
     <w:bookmarkEnd w:id="114"/>
+    <w:bookmarkEnd w:id="115"/>
     <w:sectPr>
       <w:footnotePr>
         <w:numRestart w:val="eachSect"/>

</xml_diff>

<commit_message>
Deploying to gh-pages from @ Morrison-Lab/mds@8746a6838b692a63309e8430892e6517761b2734 🚀
</commit_message>
<xml_diff>
--- a/algebra-sums.docx
+++ b/algebra-sums.docx
@@ -15,7 +15,7 @@
         <w:pStyle w:val="Date"/>
       </w:pPr>
       <w:r>
-        <w:t xml:space="preserve">Last modified: 2026-10-13 10:37:49 (PDT)</w:t>
+        <w:t xml:space="preserve">Last modified: 2026-10-13 11:22:25 (PDT)</w:t>
       </w:r>
     </w:p>
     <w:bookmarkStart w:id="31" w:name="sec-convexity"/>
@@ -17346,7 +17346,7 @@
     </w:p>
     <w:bookmarkEnd w:id="64"/>
     <w:bookmarkEnd w:id="65"/>
-    <w:bookmarkStart w:id="75" w:name="sums-and-products-together"/>
+    <w:bookmarkStart w:id="77" w:name="sums-and-products-together"/>
     <w:p>
       <w:pPr>
         <w:pStyle w:val="Heading2"/>
@@ -17355,7 +17355,7 @@
         <w:t xml:space="preserve">6 Sums and products together</w:t>
       </w:r>
     </w:p>
-    <w:bookmarkStart w:id="66" w:name="def-distributive"/>
+    <w:bookmarkStart w:id="66" w:name="def-distributes-over"/>
     <w:p>
       <w:pPr>
         <w:pStyle w:val="FirstParagraph"/>
@@ -17365,7 +17365,7 @@
           <w:b/>
           <w:bCs/>
         </w:rPr>
-        <w:t xml:space="preserve">Definition 11 (Distributive law)</w:t>
+        <w:t xml:space="preserve">Definition 11 (Distributes over)</w:t>
       </w:r>
       <w:r>
         <w:t xml:space="preserve"> </w:t>
@@ -17439,23 +17439,6 @@
           <m:t>S</m:t>
         </m:r>
       </m:oMath>
-      <w:r>
-        <w:t xml:space="preserve"> </w:t>
-      </w:r>
-      <w:r>
-        <w:t xml:space="preserve">(</w:t>
-      </w:r>
-      <w:hyperlink w:anchor="def-identity-element">
-        <w:r>
-          <w:rPr>
-            <w:rStyle w:val="Hyperlink"/>
-          </w:rPr>
-          <w:t xml:space="preserve">Definition 8</w:t>
-        </w:r>
-      </w:hyperlink>
-      <w:r>
-        <w:t xml:space="preserve">)</w:t>
-      </w:r>
       <w:r>
         <w:t xml:space="preserve"> </w:t>
       </w:r>
@@ -17613,181 +17596,19 @@
       <w:r>
         <w:t xml:space="preserve">.</w:t>
       </w:r>
-      <w:r>
-        <w:t xml:space="preserve"> </w:t>
-      </w:r>
-      <w:r>
-        <w:t xml:space="preserve">The</w:t>
-      </w:r>
-      <w:r>
-        <w:t xml:space="preserve"> </w:t>
-      </w:r>
+    </w:p>
+    <w:bookmarkEnd w:id="66"/>
+    <w:bookmarkStart w:id="67" w:name="exm-addition-not-distributive"/>
+    <w:p>
+      <w:pPr>
+        <w:pStyle w:val="BodyText"/>
+      </w:pPr>
       <w:r>
         <w:rPr>
           <w:b/>
           <w:bCs/>
         </w:rPr>
-        <w:t xml:space="preserve">distributive law</w:t>
-      </w:r>
-      <w:r>
-        <w:t xml:space="preserve"> </w:t>
-      </w:r>
-      <w:r>
-        <w:t xml:space="preserve">is the statement that multiplication distributes over addition,</w:t>
-      </w:r>
-      <w:r>
-        <w:t xml:space="preserve"> </w:t>
-      </w:r>
-      <m:oMath>
-        <m:r>
-          <m:t>a</m:t>
-        </m:r>
-        <m:r>
-          <m:rPr>
-            <m:sty m:val="p"/>
-          </m:rPr>
-          <m:t>×</m:t>
-        </m:r>
-        <m:r>
-          <m:rPr>
-            <m:sty m:val="p"/>
-          </m:rPr>
-          <m:t>(</m:t>
-        </m:r>
-        <m:r>
-          <m:t>b</m:t>
-        </m:r>
-        <m:r>
-          <m:rPr>
-            <m:sty m:val="p"/>
-          </m:rPr>
-          <m:t>+</m:t>
-        </m:r>
-        <m:r>
-          <m:t>c</m:t>
-        </m:r>
-        <m:r>
-          <m:rPr>
-            <m:sty m:val="p"/>
-          </m:rPr>
-          <m:t>)</m:t>
-        </m:r>
-        <m:r>
-          <m:rPr>
-            <m:sty m:val="p"/>
-          </m:rPr>
-          <m:t>=</m:t>
-        </m:r>
-        <m:r>
-          <m:rPr>
-            <m:sty m:val="p"/>
-          </m:rPr>
-          <m:t>(</m:t>
-        </m:r>
-        <m:r>
-          <m:t>a</m:t>
-        </m:r>
-        <m:r>
-          <m:rPr>
-            <m:sty m:val="p"/>
-          </m:rPr>
-          <m:t>×</m:t>
-        </m:r>
-        <m:r>
-          <m:t>b</m:t>
-        </m:r>
-        <m:r>
-          <m:rPr>
-            <m:sty m:val="p"/>
-          </m:rPr>
-          <m:t>)</m:t>
-        </m:r>
-        <m:r>
-          <m:rPr>
-            <m:sty m:val="p"/>
-          </m:rPr>
-          <m:t>+</m:t>
-        </m:r>
-        <m:r>
-          <m:rPr>
-            <m:sty m:val="p"/>
-          </m:rPr>
-          <m:t>(</m:t>
-        </m:r>
-        <m:r>
-          <m:t>a</m:t>
-        </m:r>
-        <m:r>
-          <m:rPr>
-            <m:sty m:val="p"/>
-          </m:rPr>
-          <m:t>×</m:t>
-        </m:r>
-        <m:r>
-          <m:t>c</m:t>
-        </m:r>
-        <m:r>
-          <m:rPr>
-            <m:sty m:val="p"/>
-          </m:rPr>
-          <m:t>)</m:t>
-        </m:r>
-      </m:oMath>
-      <w:r>
-        <w:t xml:space="preserve"> </w:t>
-      </w:r>
-      <w:r>
-        <w:t xml:space="preserve">(</w:t>
-      </w:r>
-      <w:hyperlink w:anchor="thm-mult-distr">
-        <w:r>
-          <w:rPr>
-            <w:rStyle w:val="Hyperlink"/>
-          </w:rPr>
-          <w:t xml:space="preserve">Theorem 11</w:t>
-        </w:r>
-      </w:hyperlink>
-      <w:r>
-        <w:t xml:space="preserve">);</w:t>
-      </w:r>
-      <w:r>
-        <w:t xml:space="preserve"> </w:t>
-      </w:r>
-      <w:r>
-        <w:t xml:space="preserve">we then say multiplication is</w:t>
-      </w:r>
-      <w:r>
-        <w:t xml:space="preserve"> </w:t>
-      </w:r>
-      <w:r>
-        <w:rPr>
-          <w:b/>
-          <w:bCs/>
-        </w:rPr>
-        <w:t xml:space="preserve">distributive</w:t>
-      </w:r>
-      <w:r>
-        <w:t xml:space="preserve">.</w:t>
-      </w:r>
-    </w:p>
-    <w:bookmarkEnd w:id="66"/>
-    <w:bookmarkStart w:id="67" w:name="exm-distributive"/>
-    <w:p>
-      <w:pPr>
-        <w:pStyle w:val="BodyText"/>
-      </w:pPr>
-      <w:r>
-        <w:rPr>
-          <w:b/>
-          <w:bCs/>
-        </w:rPr>
-        <w:t xml:space="preserve">Example 15 (Multiplication distributes over addition, but not the reverse)</w:t>
-      </w:r>
-      <w:r>
-        <w:t xml:space="preserve"> </w:t>
-      </w:r>
-      <w:r>
-        <w:t xml:space="preserve"> </w:t>
+        <w:t xml:space="preserve">Example 15 (Addition does not distribute over multiplication)</w:t>
       </w:r>
     </w:p>
     <w:p>
@@ -17802,6 +17623,21 @@
           <m:eqArr>
             <m:e>
               <m:r>
+                <m:t>2</m:t>
+              </m:r>
+              <m:r>
+                <m:rPr>
+                  <m:sty m:val="p"/>
+                </m:rPr>
+                <m:t>+</m:t>
+              </m:r>
+              <m:r>
+                <m:rPr>
+                  <m:sty m:val="p"/>
+                </m:rPr>
+                <m:t>(</m:t>
+              </m:r>
+              <m:r>
                 <m:t>3</m:t>
               </m:r>
               <m:r>
@@ -17811,49 +17647,34 @@
                 <m:t>×</m:t>
               </m:r>
               <m:r>
-                <m:rPr>
-                  <m:sty m:val="p"/>
-                </m:rPr>
-                <m:t>(</m:t>
-              </m:r>
-              <m:r>
                 <m:t>4</m:t>
               </m:r>
               <m:r>
                 <m:rPr>
                   <m:sty m:val="p"/>
                 </m:rPr>
+                <m:t>)</m:t>
+              </m:r>
+              <m:r>
+                <m:t>&amp;</m:t>
+              </m:r>
+              <m:r>
+                <m:rPr>
+                  <m:sty m:val="p"/>
+                </m:rPr>
+                <m:t>=</m:t>
+              </m:r>
+              <m:r>
+                <m:t>2</m:t>
+              </m:r>
+              <m:r>
+                <m:rPr>
+                  <m:sty m:val="p"/>
+                </m:rPr>
                 <m:t>+</m:t>
               </m:r>
               <m:r>
-                <m:t>5</m:t>
-              </m:r>
-              <m:r>
-                <m:rPr>
-                  <m:sty m:val="p"/>
-                </m:rPr>
-                <m:t>)</m:t>
-              </m:r>
-              <m:r>
-                <m:t>&amp;</m:t>
-              </m:r>
-              <m:r>
-                <m:rPr>
-                  <m:sty m:val="p"/>
-                </m:rPr>
-                <m:t>=</m:t>
-              </m:r>
-              <m:r>
-                <m:t>3</m:t>
-              </m:r>
-              <m:r>
-                <m:rPr>
-                  <m:sty m:val="p"/>
-                </m:rPr>
-                <m:t>×</m:t>
-              </m:r>
-              <m:r>
-                <m:t>9</m:t>
+                <m:t>12</m:t>
               </m:r>
             </m:e>
             <m:e>
@@ -17867,7 +17688,7 @@
                 <m:t>=</m:t>
               </m:r>
               <m:r>
-                <m:t>27</m:t>
+                <m:t>14</m:t>
               </m:r>
               <m:r>
                 <m:rPr>
@@ -17882,13 +17703,10 @@
     </w:p>
     <w:p>
       <w:pPr>
-        <w:numPr>
-          <w:ilvl w:val="0"/>
-          <w:numId w:val="1000"/>
-        </w:numPr>
+        <w:pStyle w:val="FirstParagraph"/>
       </w:pPr>
       <w:r>
-        <w:t xml:space="preserve">and</w:t>
+        <w:t xml:space="preserve">but</w:t>
       </w:r>
     </w:p>
     <w:p>
@@ -17909,15 +17727,45 @@
                 <m:t>(</m:t>
               </m:r>
               <m:r>
+                <m:t>2</m:t>
+              </m:r>
+              <m:r>
+                <m:rPr>
+                  <m:sty m:val="p"/>
+                </m:rPr>
+                <m:t>+</m:t>
+              </m:r>
+              <m:r>
                 <m:t>3</m:t>
               </m:r>
               <m:r>
                 <m:rPr>
                   <m:sty m:val="p"/>
                 </m:rPr>
+                <m:t>)</m:t>
+              </m:r>
+              <m:r>
+                <m:rPr>
+                  <m:sty m:val="p"/>
+                </m:rPr>
                 <m:t>×</m:t>
               </m:r>
               <m:r>
+                <m:rPr>
+                  <m:sty m:val="p"/>
+                </m:rPr>
+                <m:t>(</m:t>
+              </m:r>
+              <m:r>
+                <m:t>2</m:t>
+              </m:r>
+              <m:r>
+                <m:rPr>
+                  <m:sty m:val="p"/>
+                </m:rPr>
+                <m:t>+</m:t>
+              </m:r>
+              <m:r>
                 <m:t>4</m:t>
               </m:r>
               <m:r>
@@ -17927,19 +17775,16 @@
                 <m:t>)</m:t>
               </m:r>
               <m:r>
-                <m:rPr>
-                  <m:sty m:val="p"/>
-                </m:rPr>
-                <m:t>+</m:t>
-              </m:r>
-              <m:r>
-                <m:rPr>
-                  <m:sty m:val="p"/>
-                </m:rPr>
-                <m:t>(</m:t>
-              </m:r>
-              <m:r>
-                <m:t>3</m:t>
+                <m:t>&amp;</m:t>
+              </m:r>
+              <m:r>
+                <m:rPr>
+                  <m:sty m:val="p"/>
+                </m:rPr>
+                <m:t>=</m:t>
+              </m:r>
+              <m:r>
+                <m:t>5</m:t>
               </m:r>
               <m:r>
                 <m:rPr>
@@ -17948,34 +17793,7 @@
                 <m:t>×</m:t>
               </m:r>
               <m:r>
-                <m:t>5</m:t>
-              </m:r>
-              <m:r>
-                <m:rPr>
-                  <m:sty m:val="p"/>
-                </m:rPr>
-                <m:t>)</m:t>
-              </m:r>
-              <m:r>
-                <m:t>&amp;</m:t>
-              </m:r>
-              <m:r>
-                <m:rPr>
-                  <m:sty m:val="p"/>
-                </m:rPr>
-                <m:t>=</m:t>
-              </m:r>
-              <m:r>
-                <m:t>12</m:t>
-              </m:r>
-              <m:r>
-                <m:rPr>
-                  <m:sty m:val="p"/>
-                </m:rPr>
-                <m:t>+</m:t>
-              </m:r>
-              <m:r>
-                <m:t>15</m:t>
+                <m:t>6</m:t>
               </m:r>
             </m:e>
             <m:e>
@@ -17989,7 +17807,7 @@
                 <m:t>=</m:t>
               </m:r>
               <m:r>
-                <m:t>27</m:t>
+                <m:t>30</m:t>
               </m:r>
               <m:r>
                 <m:rPr>
@@ -18004,13 +17822,283 @@
     </w:p>
     <w:p>
       <w:pPr>
-        <w:numPr>
-          <w:ilvl w:val="0"/>
-          <w:numId w:val="1012"/>
-        </w:numPr>
+        <w:pStyle w:val="FirstParagraph"/>
       </w:pPr>
       <w:r>
-        <w:t xml:space="preserve">Addition does not distribute over multiplication:</w:t>
+        <w:t xml:space="preserve">So</w:t>
+      </w:r>
+      <w:r>
+        <w:t xml:space="preserve"> </w:t>
+      </w:r>
+      <w:hyperlink w:anchor="def-distributes-over">
+        <w:r>
+          <w:rPr>
+            <w:rStyle w:val="Hyperlink"/>
+          </w:rPr>
+          <w:t xml:space="preserve">Definition 11</w:t>
+        </w:r>
+      </w:hyperlink>
+      <w:r>
+        <w:t xml:space="preserve"> </w:t>
+      </w:r>
+      <w:r>
+        <w:t xml:space="preserve">fails with</w:t>
+      </w:r>
+      <w:r>
+        <w:t xml:space="preserve"> </w:t>
+      </w:r>
+      <m:oMath>
+        <m:r>
+          <m:rPr>
+            <m:sty m:val="p"/>
+          </m:rPr>
+          <m:t>⋆</m:t>
+        </m:r>
+        <m:r>
+          <m:rPr>
+            <m:sty m:val="p"/>
+          </m:rPr>
+          <m:t>=</m:t>
+        </m:r>
+        <m:r>
+          <m:rPr>
+            <m:sty m:val="p"/>
+          </m:rPr>
+          <m:t>+</m:t>
+        </m:r>
+      </m:oMath>
+      <w:r>
+        <w:t xml:space="preserve"> </w:t>
+      </w:r>
+      <w:r>
+        <w:t xml:space="preserve">and</w:t>
+      </w:r>
+      <w:r>
+        <w:t xml:space="preserve"> </w:t>
+      </w:r>
+      <m:oMath>
+        <m:r>
+          <m:rPr>
+            <m:sty m:val="p"/>
+          </m:rPr>
+          <m:t>⋄</m:t>
+        </m:r>
+        <m:r>
+          <m:rPr>
+            <m:sty m:val="p"/>
+          </m:rPr>
+          <m:t>=</m:t>
+        </m:r>
+        <m:r>
+          <m:rPr>
+            <m:sty m:val="p"/>
+          </m:rPr>
+          <m:t>×</m:t>
+        </m:r>
+      </m:oMath>
+      <w:r>
+        <w:t xml:space="preserve">.</w:t>
+      </w:r>
+    </w:p>
+    <w:bookmarkEnd w:id="67"/>
+    <w:bookmarkStart w:id="68" w:name="def-distributive"/>
+    <w:p>
+      <w:pPr>
+        <w:pStyle w:val="BodyText"/>
+      </w:pPr>
+      <w:r>
+        <w:rPr>
+          <w:b/>
+          <w:bCs/>
+        </w:rPr>
+        <w:t xml:space="preserve">Definition 12 (Distributive law)</w:t>
+      </w:r>
+      <w:r>
+        <w:t xml:space="preserve"> </w:t>
+      </w:r>
+      <w:r>
+        <w:t xml:space="preserve">The</w:t>
+      </w:r>
+      <w:r>
+        <w:t xml:space="preserve"> </w:t>
+      </w:r>
+      <w:r>
+        <w:rPr>
+          <w:b/>
+          <w:bCs/>
+        </w:rPr>
+        <w:t xml:space="preserve">distributive law</w:t>
+      </w:r>
+      <w:r>
+        <w:t xml:space="preserve"> </w:t>
+      </w:r>
+      <w:r>
+        <w:t xml:space="preserve">is the statement that multiplication distributes over addition</w:t>
+      </w:r>
+      <w:r>
+        <w:t xml:space="preserve"> </w:t>
+      </w:r>
+      <w:r>
+        <w:t xml:space="preserve">(</w:t>
+      </w:r>
+      <w:hyperlink w:anchor="def-distributes-over">
+        <w:r>
+          <w:rPr>
+            <w:rStyle w:val="Hyperlink"/>
+          </w:rPr>
+          <w:t xml:space="preserve">Definition 11</w:t>
+        </w:r>
+      </w:hyperlink>
+      <w:r>
+        <w:t xml:space="preserve">):</w:t>
+      </w:r>
+      <w:r>
+        <w:t xml:space="preserve"> </w:t>
+      </w:r>
+      <m:oMath>
+        <m:r>
+          <m:t>a</m:t>
+        </m:r>
+        <m:r>
+          <m:rPr>
+            <m:sty m:val="p"/>
+          </m:rPr>
+          <m:t>×</m:t>
+        </m:r>
+        <m:r>
+          <m:rPr>
+            <m:sty m:val="p"/>
+          </m:rPr>
+          <m:t>(</m:t>
+        </m:r>
+        <m:r>
+          <m:t>b</m:t>
+        </m:r>
+        <m:r>
+          <m:rPr>
+            <m:sty m:val="p"/>
+          </m:rPr>
+          <m:t>+</m:t>
+        </m:r>
+        <m:r>
+          <m:t>c</m:t>
+        </m:r>
+        <m:r>
+          <m:rPr>
+            <m:sty m:val="p"/>
+          </m:rPr>
+          <m:t>)</m:t>
+        </m:r>
+        <m:r>
+          <m:rPr>
+            <m:sty m:val="p"/>
+          </m:rPr>
+          <m:t>=</m:t>
+        </m:r>
+        <m:r>
+          <m:rPr>
+            <m:sty m:val="p"/>
+          </m:rPr>
+          <m:t>(</m:t>
+        </m:r>
+        <m:r>
+          <m:t>a</m:t>
+        </m:r>
+        <m:r>
+          <m:rPr>
+            <m:sty m:val="p"/>
+          </m:rPr>
+          <m:t>×</m:t>
+        </m:r>
+        <m:r>
+          <m:t>b</m:t>
+        </m:r>
+        <m:r>
+          <m:rPr>
+            <m:sty m:val="p"/>
+          </m:rPr>
+          <m:t>)</m:t>
+        </m:r>
+        <m:r>
+          <m:rPr>
+            <m:sty m:val="p"/>
+          </m:rPr>
+          <m:t>+</m:t>
+        </m:r>
+        <m:r>
+          <m:rPr>
+            <m:sty m:val="p"/>
+          </m:rPr>
+          <m:t>(</m:t>
+        </m:r>
+        <m:r>
+          <m:t>a</m:t>
+        </m:r>
+        <m:r>
+          <m:rPr>
+            <m:sty m:val="p"/>
+          </m:rPr>
+          <m:t>×</m:t>
+        </m:r>
+        <m:r>
+          <m:t>c</m:t>
+        </m:r>
+        <m:r>
+          <m:rPr>
+            <m:sty m:val="p"/>
+          </m:rPr>
+          <m:t>)</m:t>
+        </m:r>
+      </m:oMath>
+      <w:r>
+        <w:t xml:space="preserve"> </w:t>
+      </w:r>
+      <w:r>
+        <w:t xml:space="preserve">(</w:t>
+      </w:r>
+      <w:hyperlink w:anchor="thm-mult-distr">
+        <w:r>
+          <w:rPr>
+            <w:rStyle w:val="Hyperlink"/>
+          </w:rPr>
+          <w:t xml:space="preserve">Theorem 11</w:t>
+        </w:r>
+      </w:hyperlink>
+      <w:r>
+        <w:t xml:space="preserve">).</w:t>
+      </w:r>
+      <w:r>
+        <w:t xml:space="preserve"> </w:t>
+      </w:r>
+      <w:r>
+        <w:t xml:space="preserve">We then say multiplication is</w:t>
+      </w:r>
+      <w:r>
+        <w:t xml:space="preserve"> </w:t>
+      </w:r>
+      <w:r>
+        <w:rPr>
+          <w:b/>
+          <w:bCs/>
+        </w:rPr>
+        <w:t xml:space="preserve">distributive</w:t>
+      </w:r>
+      <w:r>
+        <w:t xml:space="preserve">.</w:t>
+      </w:r>
+    </w:p>
+    <w:bookmarkEnd w:id="68"/>
+    <w:bookmarkStart w:id="69" w:name="exm-distributive"/>
+    <w:p>
+      <w:pPr>
+        <w:pStyle w:val="BodyText"/>
+      </w:pPr>
+      <w:r>
+        <w:rPr>
+          <w:b/>
+          <w:bCs/>
+        </w:rPr>
+        <w:t xml:space="preserve">Example 16 (Multiplication distributes over addition)</w:t>
       </w:r>
     </w:p>
     <w:p>
@@ -18025,7 +18113,22 @@
           <m:eqArr>
             <m:e>
               <m:r>
-                <m:t>2</m:t>
+                <m:t>3</m:t>
+              </m:r>
+              <m:r>
+                <m:rPr>
+                  <m:sty m:val="p"/>
+                </m:rPr>
+                <m:t>×</m:t>
+              </m:r>
+              <m:r>
+                <m:rPr>
+                  <m:sty m:val="p"/>
+                </m:rPr>
+                <m:t>(</m:t>
+              </m:r>
+              <m:r>
+                <m:t>4</m:t>
               </m:r>
               <m:r>
                 <m:rPr>
@@ -18034,10 +18137,22 @@
                 <m:t>+</m:t>
               </m:r>
               <m:r>
-                <m:rPr>
-                  <m:sty m:val="p"/>
-                </m:rPr>
-                <m:t>(</m:t>
+                <m:t>5</m:t>
+              </m:r>
+              <m:r>
+                <m:rPr>
+                  <m:sty m:val="p"/>
+                </m:rPr>
+                <m:t>)</m:t>
+              </m:r>
+              <m:r>
+                <m:t>&amp;</m:t>
+              </m:r>
+              <m:r>
+                <m:rPr>
+                  <m:sty m:val="p"/>
+                </m:rPr>
+                <m:t>=</m:t>
               </m:r>
               <m:r>
                 <m:t>3</m:t>
@@ -18049,34 +18164,7 @@
                 <m:t>×</m:t>
               </m:r>
               <m:r>
-                <m:t>4</m:t>
-              </m:r>
-              <m:r>
-                <m:rPr>
-                  <m:sty m:val="p"/>
-                </m:rPr>
-                <m:t>)</m:t>
-              </m:r>
-              <m:r>
-                <m:t>&amp;</m:t>
-              </m:r>
-              <m:r>
-                <m:rPr>
-                  <m:sty m:val="p"/>
-                </m:rPr>
-                <m:t>=</m:t>
-              </m:r>
-              <m:r>
-                <m:t>2</m:t>
-              </m:r>
-              <m:r>
-                <m:rPr>
-                  <m:sty m:val="p"/>
-                </m:rPr>
-                <m:t>+</m:t>
-              </m:r>
-              <m:r>
-                <m:t>12</m:t>
+                <m:t>9</m:t>
               </m:r>
             </m:e>
             <m:e>
@@ -18090,7 +18178,7 @@
                 <m:t>=</m:t>
               </m:r>
               <m:r>
-                <m:t>14</m:t>
+                <m:t>27</m:t>
               </m:r>
               <m:r>
                 <m:rPr>
@@ -18105,13 +18193,10 @@
     </w:p>
     <w:p>
       <w:pPr>
-        <w:numPr>
-          <w:ilvl w:val="0"/>
-          <w:numId w:val="1000"/>
-        </w:numPr>
+        <w:pStyle w:val="FirstParagraph"/>
       </w:pPr>
       <w:r>
-        <w:t xml:space="preserve">but</w:t>
+        <w:t xml:space="preserve">and</w:t>
       </w:r>
     </w:p>
     <w:p>
@@ -18132,7 +18217,22 @@
                 <m:t>(</m:t>
               </m:r>
               <m:r>
-                <m:t>2</m:t>
+                <m:t>3</m:t>
+              </m:r>
+              <m:r>
+                <m:rPr>
+                  <m:sty m:val="p"/>
+                </m:rPr>
+                <m:t>×</m:t>
+              </m:r>
+              <m:r>
+                <m:t>4</m:t>
+              </m:r>
+              <m:r>
+                <m:rPr>
+                  <m:sty m:val="p"/>
+                </m:rPr>
+                <m:t>)</m:t>
               </m:r>
               <m:r>
                 <m:rPr>
@@ -18141,28 +18241,40 @@
                 <m:t>+</m:t>
               </m:r>
               <m:r>
+                <m:rPr>
+                  <m:sty m:val="p"/>
+                </m:rPr>
+                <m:t>(</m:t>
+              </m:r>
+              <m:r>
                 <m:t>3</m:t>
               </m:r>
               <m:r>
                 <m:rPr>
                   <m:sty m:val="p"/>
                 </m:rPr>
+                <m:t>×</m:t>
+              </m:r>
+              <m:r>
+                <m:t>5</m:t>
+              </m:r>
+              <m:r>
+                <m:rPr>
+                  <m:sty m:val="p"/>
+                </m:rPr>
                 <m:t>)</m:t>
               </m:r>
               <m:r>
-                <m:rPr>
-                  <m:sty m:val="p"/>
-                </m:rPr>
-                <m:t>×</m:t>
-              </m:r>
-              <m:r>
-                <m:rPr>
-                  <m:sty m:val="p"/>
-                </m:rPr>
-                <m:t>(</m:t>
-              </m:r>
-              <m:r>
-                <m:t>2</m:t>
+                <m:t>&amp;</m:t>
+              </m:r>
+              <m:r>
+                <m:rPr>
+                  <m:sty m:val="p"/>
+                </m:rPr>
+                <m:t>=</m:t>
+              </m:r>
+              <m:r>
+                <m:t>12</m:t>
               </m:r>
               <m:r>
                 <m:rPr>
@@ -18171,34 +18283,7 @@
                 <m:t>+</m:t>
               </m:r>
               <m:r>
-                <m:t>4</m:t>
-              </m:r>
-              <m:r>
-                <m:rPr>
-                  <m:sty m:val="p"/>
-                </m:rPr>
-                <m:t>)</m:t>
-              </m:r>
-              <m:r>
-                <m:t>&amp;</m:t>
-              </m:r>
-              <m:r>
-                <m:rPr>
-                  <m:sty m:val="p"/>
-                </m:rPr>
-                <m:t>=</m:t>
-              </m:r>
-              <m:r>
-                <m:t>5</m:t>
-              </m:r>
-              <m:r>
-                <m:rPr>
-                  <m:sty m:val="p"/>
-                </m:rPr>
-                <m:t>×</m:t>
-              </m:r>
-              <m:r>
-                <m:t>6</m:t>
+                <m:t>15</m:t>
               </m:r>
             </m:e>
             <m:e>
@@ -18212,7 +18297,7 @@
                 <m:t>=</m:t>
               </m:r>
               <m:r>
-                <m:t>30</m:t>
+                <m:t>27</m:t>
               </m:r>
               <m:r>
                 <m:rPr>
@@ -18225,8 +18310,8 @@
         </m:oMath>
       </m:oMathPara>
     </w:p>
-    <w:bookmarkEnd w:id="67"/>
-    <w:bookmarkStart w:id="68" w:name="thm-mult-distr"/>
+    <w:bookmarkEnd w:id="69"/>
+    <w:bookmarkStart w:id="70" w:name="thm-mult-distr"/>
     <w:p>
       <w:pPr>
         <w:pStyle w:val="FirstParagraph"/>
@@ -18302,8 +18387,8 @@
         </m:oMath>
       </m:oMathPara>
     </w:p>
-    <w:bookmarkEnd w:id="68"/>
-    <w:bookmarkStart w:id="69" w:name="def-like-terms"/>
+    <w:bookmarkEnd w:id="70"/>
+    <w:bookmarkStart w:id="71" w:name="def-like-terms"/>
     <w:p>
       <w:pPr>
         <w:pStyle w:val="FirstParagraph"/>
@@ -18313,7 +18398,7 @@
           <w:b/>
           <w:bCs/>
         </w:rPr>
-        <w:t xml:space="preserve">Definition 12 (Like terms)</w:t>
+        <w:t xml:space="preserve">Definition 13 (Like terms)</w:t>
       </w:r>
       <w:r>
         <w:t xml:space="preserve"> </w:t>
@@ -18610,8 +18695,8 @@
         <w:t xml:space="preserve">.</w:t>
       </w:r>
     </w:p>
-    <w:bookmarkEnd w:id="69"/>
-    <w:bookmarkStart w:id="70" w:name="exm-like-terms"/>
+    <w:bookmarkEnd w:id="71"/>
+    <w:bookmarkStart w:id="72" w:name="exm-like-terms"/>
     <w:p>
       <w:pPr>
         <w:pStyle w:val="BodyText"/>
@@ -18621,7 +18706,7 @@
           <w:b/>
           <w:bCs/>
         </w:rPr>
-        <w:t xml:space="preserve">Example 16 (Like and unlike terms)</w:t>
+        <w:t xml:space="preserve">Example 17 (Like and unlike terms)</w:t>
       </w:r>
       <w:r>
         <w:t xml:space="preserve"> </w:t>
@@ -18634,7 +18719,7 @@
       <w:pPr>
         <w:numPr>
           <w:ilvl w:val="0"/>
-          <w:numId w:val="1013"/>
+          <w:numId w:val="1012"/>
         </w:numPr>
       </w:pPr>
       <m:oMath>
@@ -18820,7 +18905,7 @@
       <w:pPr>
         <w:numPr>
           <w:ilvl w:val="0"/>
-          <w:numId w:val="1013"/>
+          <w:numId w:val="1012"/>
         </w:numPr>
       </w:pPr>
       <m:oMath>
@@ -18878,8 +18963,8 @@
         <w:t xml:space="preserve">appears to different powers.</w:t>
       </w:r>
     </w:p>
-    <w:bookmarkEnd w:id="70"/>
-    <w:bookmarkStart w:id="71" w:name="exr-square-of-a-sum"/>
+    <w:bookmarkEnd w:id="72"/>
+    <w:bookmarkStart w:id="73" w:name="exr-square-of-a-sum"/>
     <w:p>
       <w:pPr>
         <w:pStyle w:val="FirstParagraph"/>
@@ -19061,8 +19146,8 @@
         <w:t xml:space="preserve">using only the distributive law and the rules above.</w:t>
       </w:r>
     </w:p>
-    <w:bookmarkEnd w:id="71"/>
-    <w:bookmarkStart w:id="72" w:name="sol-square-of-a-sum"/>
+    <w:bookmarkEnd w:id="73"/>
+    <w:bookmarkStart w:id="74" w:name="sol-square-of-a-sum"/>
     <w:p>
       <w:pPr>
         <w:pStyle w:val="BodyText"/>
@@ -19821,7 +19906,7 @@
                   <m:nor/>
                   <m:sty m:val="p"/>
                 </m:rPr>
-                <m:t>Definition 12</m:t>
+                <m:t>Definition 13</m:t>
               </m:r>
               <m:r>
                 <m:rPr>
@@ -19926,8 +20011,8 @@
         <w:t xml:space="preserve">to drop the parentheses.</w:t>
       </w:r>
     </w:p>
-    <w:bookmarkEnd w:id="72"/>
-    <w:bookmarkStart w:id="73" w:name="thm-square-of-a-sum"/>
+    <w:bookmarkEnd w:id="74"/>
+    <w:bookmarkStart w:id="75" w:name="thm-square-of-a-sum"/>
     <w:p>
       <w:pPr>
         <w:pStyle w:val="BodyText"/>
@@ -20067,7 +20152,7 @@
         </m:oMath>
       </m:oMathPara>
     </w:p>
-    <w:bookmarkEnd w:id="73"/>
+    <w:bookmarkEnd w:id="75"/>
     <w:p>
       <w:pPr>
         <w:pStyle w:val="FirstParagraph"/>
@@ -20100,7 +20185,7 @@
         <w:t xml:space="preserve">.</w:t>
       </w:r>
     </w:p>
-    <w:bookmarkStart w:id="74" w:name="rem-square-of-a-difference"/>
+    <w:bookmarkStart w:id="76" w:name="rem-square-of-a-difference"/>
     <w:p>
       <w:pPr>
         <w:pStyle w:val="BodyText"/>
@@ -20637,9 +20722,9 @@
         </m:oMath>
       </m:oMathPara>
     </w:p>
-    <w:bookmarkEnd w:id="74"/>
-    <w:bookmarkEnd w:id="75"/>
-    <w:bookmarkStart w:id="94" w:name="sec-summation"/>
+    <w:bookmarkEnd w:id="76"/>
+    <w:bookmarkEnd w:id="77"/>
+    <w:bookmarkStart w:id="96" w:name="sec-summation"/>
     <w:p>
       <w:pPr>
         <w:pStyle w:val="Heading2"/>
@@ -20648,7 +20733,7 @@
         <w:t xml:space="preserve">7 Summation notation</w:t>
       </w:r>
     </w:p>
-    <w:bookmarkStart w:id="76" w:name="exr-expand-a-sum"/>
+    <w:bookmarkStart w:id="78" w:name="exr-expand-a-sum"/>
     <w:p>
       <w:pPr>
         <w:pStyle w:val="FirstParagraph"/>
@@ -20724,7 +20809,7 @@
         <w:pStyle w:val="Compact"/>
         <w:numPr>
           <w:ilvl w:val="0"/>
-          <w:numId w:val="1014"/>
+          <w:numId w:val="1013"/>
         </w:numPr>
       </w:pPr>
       <w:r>
@@ -20736,7 +20821,7 @@
         <w:pStyle w:val="Compact"/>
         <w:numPr>
           <w:ilvl w:val="0"/>
-          <w:numId w:val="1014"/>
+          <w:numId w:val="1013"/>
         </w:numPr>
       </w:pPr>
       <w:r>
@@ -20900,8 +20985,8 @@
         <w:t xml:space="preserve">symbol.</w:t>
       </w:r>
     </w:p>
-    <w:bookmarkEnd w:id="76"/>
-    <w:bookmarkStart w:id="77" w:name="sol-expand-a-sum"/>
+    <w:bookmarkEnd w:id="78"/>
+    <w:bookmarkStart w:id="79" w:name="sol-expand-a-sum"/>
     <w:p>
       <w:pPr>
         <w:pStyle w:val="FirstParagraph"/>
@@ -20921,7 +21006,7 @@
       <w:pPr>
         <w:numPr>
           <w:ilvl w:val="0"/>
-          <w:numId w:val="1015"/>
+          <w:numId w:val="1014"/>
         </w:numPr>
       </w:pPr>
       <w:r>
@@ -21174,7 +21259,7 @@
       <w:pPr>
         <w:numPr>
           <w:ilvl w:val="0"/>
-          <w:numId w:val="1015"/>
+          <w:numId w:val="1014"/>
         </w:numPr>
       </w:pPr>
       <w:r>
@@ -21615,8 +21700,8 @@
         </m:oMath>
       </m:oMathPara>
     </w:p>
-    <w:bookmarkEnd w:id="77"/>
-    <w:bookmarkStart w:id="78" w:name="def-summation"/>
+    <w:bookmarkEnd w:id="79"/>
+    <w:bookmarkStart w:id="80" w:name="def-summation"/>
     <w:p>
       <w:pPr>
         <w:pStyle w:val="FirstParagraph"/>
@@ -21626,7 +21711,7 @@
           <w:b/>
           <w:bCs/>
         </w:rPr>
-        <w:t xml:space="preserve">Definition 13 (Summation notation)</w:t>
+        <w:t xml:space="preserve">Definition 14 (Summation notation)</w:t>
       </w:r>
       <w:r>
         <w:t xml:space="preserve"> </w:t>
@@ -22073,8 +22158,8 @@
         <w:t xml:space="preserve">.</w:t>
       </w:r>
     </w:p>
-    <w:bookmarkEnd w:id="78"/>
-    <w:bookmarkStart w:id="79" w:name="rem-summation-index"/>
+    <w:bookmarkEnd w:id="80"/>
+    <w:bookmarkStart w:id="81" w:name="rem-summation-index"/>
     <w:p>
       <w:pPr>
         <w:pStyle w:val="BodyText"/>
@@ -22401,8 +22486,8 @@
         </m:oMath>
       </m:oMathPara>
     </w:p>
-    <w:bookmarkEnd w:id="79"/>
-    <w:bookmarkStart w:id="80" w:name="def-empty-sum"/>
+    <w:bookmarkEnd w:id="81"/>
+    <w:bookmarkStart w:id="82" w:name="def-empty-sum"/>
     <w:p>
       <w:pPr>
         <w:pStyle w:val="FirstParagraph"/>
@@ -22412,7 +22497,7 @@
           <w:b/>
           <w:bCs/>
         </w:rPr>
-        <w:t xml:space="preserve">Definition 14 (Empty sum)</w:t>
+        <w:t xml:space="preserve">Definition 15 (Empty sum)</w:t>
       </w:r>
       <w:r>
         <w:t xml:space="preserve"> </w:t>
@@ -22593,8 +22678,8 @@
         <w:t xml:space="preserve">.</w:t>
       </w:r>
     </w:p>
-    <w:bookmarkEnd w:id="80"/>
-    <w:bookmarkStart w:id="81" w:name="exr-sum-rules"/>
+    <w:bookmarkEnd w:id="82"/>
+    <w:bookmarkStart w:id="83" w:name="exr-sum-rules"/>
     <w:p>
       <w:pPr>
         <w:pStyle w:val="BodyText"/>
@@ -22758,7 +22843,7 @@
           <w:rPr>
             <w:rStyle w:val="Hyperlink"/>
           </w:rPr>
-          <w:t xml:space="preserve">Definition 13</w:t>
+          <w:t xml:space="preserve">Definition 14</w:t>
         </w:r>
       </w:hyperlink>
       <w:r>
@@ -22773,7 +22858,7 @@
         <w:pStyle w:val="Compact"/>
         <w:numPr>
           <w:ilvl w:val="0"/>
-          <w:numId w:val="1016"/>
+          <w:numId w:val="1015"/>
         </w:numPr>
       </w:pPr>
       <m:oMath>
@@ -22884,7 +22969,7 @@
         <w:pStyle w:val="Compact"/>
         <w:numPr>
           <w:ilvl w:val="0"/>
-          <w:numId w:val="1016"/>
+          <w:numId w:val="1015"/>
         </w:numPr>
       </w:pPr>
       <m:oMath>
@@ -23070,8 +23155,8 @@
         <w:t xml:space="preserve">Does either argument depend on there being exactly three terms?</w:t>
       </w:r>
     </w:p>
-    <w:bookmarkEnd w:id="81"/>
-    <w:bookmarkStart w:id="82" w:name="sol-sum-rules"/>
+    <w:bookmarkEnd w:id="83"/>
+    <w:bookmarkStart w:id="84" w:name="sol-sum-rules"/>
     <w:p>
       <w:pPr>
         <w:pStyle w:val="BodyText"/>
@@ -23097,7 +23182,7 @@
           <w:rPr>
             <w:rStyle w:val="Hyperlink"/>
           </w:rPr>
-          <w:t xml:space="preserve">Definition 13</w:t>
+          <w:t xml:space="preserve">Definition 14</w:t>
         </w:r>
       </w:hyperlink>
       <w:r>
@@ -23165,7 +23250,7 @@
       <w:pPr>
         <w:numPr>
           <w:ilvl w:val="0"/>
-          <w:numId w:val="1017"/>
+          <w:numId w:val="1016"/>
         </w:numPr>
       </w:pPr>
       <w:r>
@@ -23497,7 +23582,7 @@
       <w:pPr>
         <w:numPr>
           <w:ilvl w:val="0"/>
-          <w:numId w:val="1017"/>
+          <w:numId w:val="1016"/>
         </w:numPr>
       </w:pPr>
       <w:r>
@@ -24051,8 +24136,8 @@
         <w:t xml:space="preserve">the same steps work for any lower and upper limits.</w:t>
       </w:r>
     </w:p>
-    <w:bookmarkEnd w:id="82"/>
-    <w:bookmarkStart w:id="83" w:name="thm-sum-constant-factor"/>
+    <w:bookmarkEnd w:id="84"/>
+    <w:bookmarkStart w:id="85" w:name="thm-sum-constant-factor"/>
     <w:p>
       <w:pPr>
         <w:pStyle w:val="BodyText"/>
@@ -24244,7 +24329,7 @@
         </m:oMath>
       </m:oMathPara>
     </w:p>
-    <w:bookmarkEnd w:id="83"/>
+    <w:bookmarkEnd w:id="85"/>
     <w:p>
       <w:pPr>
         <w:pStyle w:val="FirstParagraph"/>
@@ -24277,7 +24362,7 @@
         <w:t xml:space="preserve">, part 1.</w:t>
       </w:r>
     </w:p>
-    <w:bookmarkStart w:id="84" w:name="thm-sum-of-sums"/>
+    <w:bookmarkStart w:id="86" w:name="thm-sum-of-sums"/>
     <w:p>
       <w:pPr>
         <w:pStyle w:val="BodyText"/>
@@ -24580,7 +24665,7 @@
         </m:oMath>
       </m:oMathPara>
     </w:p>
-    <w:bookmarkEnd w:id="84"/>
+    <w:bookmarkEnd w:id="86"/>
     <w:p>
       <w:pPr>
         <w:pStyle w:val="FirstParagraph"/>
@@ -24613,7 +24698,7 @@
         <w:t xml:space="preserve">, part 2.</w:t>
       </w:r>
     </w:p>
-    <w:bookmarkStart w:id="85" w:name="exr-sum-over-set"/>
+    <w:bookmarkStart w:id="87" w:name="exr-sum-over-set"/>
     <w:p>
       <w:pPr>
         <w:pStyle w:val="BodyText"/>
@@ -24862,7 +24947,7 @@
         <w:pStyle w:val="Compact"/>
         <w:numPr>
           <w:ilvl w:val="0"/>
-          <w:numId w:val="1018"/>
+          <w:numId w:val="1017"/>
         </w:numPr>
       </w:pPr>
       <w:r>
@@ -24955,7 +25040,7 @@
         <w:pStyle w:val="Compact"/>
         <w:numPr>
           <w:ilvl w:val="0"/>
-          <w:numId w:val="1018"/>
+          <w:numId w:val="1017"/>
         </w:numPr>
       </w:pPr>
       <w:r>
@@ -24988,8 +25073,8 @@
         <w:t xml:space="preserve">Is the total the same?</w:t>
       </w:r>
     </w:p>
-    <w:bookmarkEnd w:id="85"/>
-    <w:bookmarkStart w:id="86" w:name="sol-sum-over-set"/>
+    <w:bookmarkEnd w:id="87"/>
+    <w:bookmarkStart w:id="88" w:name="sol-sum-over-set"/>
     <w:p>
       <w:pPr>
         <w:pStyle w:val="FirstParagraph"/>
@@ -25009,7 +25094,7 @@
       <w:pPr>
         <w:numPr>
           <w:ilvl w:val="0"/>
-          <w:numId w:val="1019"/>
+          <w:numId w:val="1018"/>
         </w:numPr>
       </w:pPr>
       <w:r>
@@ -25315,7 +25400,7 @@
       <w:pPr>
         <w:numPr>
           <w:ilvl w:val="0"/>
-          <w:numId w:val="1019"/>
+          <w:numId w:val="1018"/>
         </w:numPr>
       </w:pPr>
       <w:r>
@@ -25449,8 +25534,8 @@
         <w:t xml:space="preserve">because addition does not depend on the order of the terms.</w:t>
       </w:r>
     </w:p>
-    <w:bookmarkEnd w:id="86"/>
-    <w:bookmarkStart w:id="89" w:name="def-sum-over-set"/>
+    <w:bookmarkEnd w:id="88"/>
+    <w:bookmarkStart w:id="91" w:name="def-sum-over-set"/>
     <w:p>
       <w:pPr>
         <w:pStyle w:val="FirstParagraph"/>
@@ -25460,7 +25545,7 @@
           <w:b/>
           <w:bCs/>
         </w:rPr>
-        <w:t xml:space="preserve">Definition 15 (Sum over a finite set)</w:t>
+        <w:t xml:space="preserve">Definition 16 (Sum over a finite set)</w:t>
       </w:r>
       <w:r>
         <w:t xml:space="preserve"> </w:t>
@@ -25567,7 +25652,7 @@
       <w:r>
         <w:t xml:space="preserve"> </w:t>
       </w:r>
-      <w:hyperlink r:id="rId87">
+      <w:hyperlink r:id="rId89">
         <w:r>
           <w:rPr>
             <w:rStyle w:val="Hyperlink"/>
@@ -25578,7 +25663,7 @@
       <w:r>
         <w:t xml:space="preserve"> </w:t>
       </w:r>
-      <w:hyperlink r:id="rId88">
+      <w:hyperlink r:id="rId90">
         <w:r>
           <w:rPr>
             <w:rStyle w:val="Hyperlink"/>
@@ -26065,8 +26150,8 @@
         <w:t xml:space="preserve">.</w:t>
       </w:r>
     </w:p>
-    <w:bookmarkEnd w:id="89"/>
-    <w:bookmarkStart w:id="90" w:name="rem-sum-over-set-order"/>
+    <w:bookmarkEnd w:id="91"/>
+    <w:bookmarkStart w:id="92" w:name="rem-sum-over-set-order"/>
     <w:p>
       <w:pPr>
         <w:pStyle w:val="BodyText"/>
@@ -26572,15 +26657,15 @@
           <w:rPr>
             <w:rStyle w:val="Hyperlink"/>
           </w:rPr>
-          <w:t xml:space="preserve">Definition 13</w:t>
+          <w:t xml:space="preserve">Definition 14</w:t>
         </w:r>
       </w:hyperlink>
       <w:r>
         <w:t xml:space="preserve">.</w:t>
       </w:r>
     </w:p>
-    <w:bookmarkEnd w:id="90"/>
-    <w:bookmarkStart w:id="93" w:name="rem-sum-without-set"/>
+    <w:bookmarkEnd w:id="92"/>
+    <w:bookmarkStart w:id="95" w:name="rem-sum-without-set"/>
     <w:p>
       <w:pPr>
         <w:pStyle w:val="BodyText"/>
@@ -26780,7 +26865,7 @@
       <w:r>
         <w:t xml:space="preserve"> </w:t>
       </w:r>
-      <w:hyperlink r:id="rId91">
+      <w:hyperlink r:id="rId93">
         <w:r>
           <w:rPr>
             <w:rStyle w:val="Hyperlink"/>
@@ -27005,7 +27090,7 @@
       <w:r>
         <w:t xml:space="preserve"> </w:t>
       </w:r>
-      <w:hyperlink r:id="rId92">
+      <w:hyperlink r:id="rId94">
         <w:r>
           <w:rPr>
             <w:rStyle w:val="Hyperlink"/>
@@ -27017,9 +27102,9 @@
         <w:t xml:space="preserve">).</w:t>
       </w:r>
     </w:p>
-    <w:bookmarkEnd w:id="93"/>
-    <w:bookmarkEnd w:id="94"/>
-    <w:bookmarkStart w:id="115" w:name="quotients"/>
+    <w:bookmarkEnd w:id="95"/>
+    <w:bookmarkEnd w:id="96"/>
+    <w:bookmarkStart w:id="117" w:name="quotients"/>
     <w:p>
       <w:pPr>
         <w:pStyle w:val="Heading2"/>
@@ -27028,7 +27113,7 @@
         <w:t xml:space="preserve">8 Quotients</w:t>
       </w:r>
     </w:p>
-    <w:bookmarkStart w:id="95" w:name="def-quotient"/>
+    <w:bookmarkStart w:id="97" w:name="def-quotient"/>
     <w:p>
       <w:pPr>
         <w:pStyle w:val="FirstParagraph"/>
@@ -27038,7 +27123,7 @@
           <w:b/>
           <w:bCs/>
         </w:rPr>
-        <w:t xml:space="preserve">Definition 16 (Quotient)</w:t>
+        <w:t xml:space="preserve">Definition 17 (Quotient)</w:t>
       </w:r>
       <w:r>
         <w:t xml:space="preserve"> </w:t>
@@ -27197,8 +27282,8 @@
         </m:oMath>
       </m:oMathPara>
     </w:p>
-    <w:bookmarkEnd w:id="95"/>
-    <w:bookmarkStart w:id="96" w:name="def-fraction"/>
+    <w:bookmarkEnd w:id="97"/>
+    <w:bookmarkStart w:id="98" w:name="def-fraction"/>
     <w:p>
       <w:pPr>
         <w:pStyle w:val="FirstParagraph"/>
@@ -27208,7 +27293,7 @@
           <w:b/>
           <w:bCs/>
         </w:rPr>
-        <w:t xml:space="preserve">Definition 17 (Fraction, numerator, and denominator)</w:t>
+        <w:t xml:space="preserve">Definition 18 (Fraction, numerator, and denominator)</w:t>
       </w:r>
       <w:r>
         <w:t xml:space="preserve"> </w:t>
@@ -27247,7 +27332,7 @@
           <w:rPr>
             <w:rStyle w:val="Hyperlink"/>
           </w:rPr>
-          <w:t xml:space="preserve">Definition 16</w:t>
+          <w:t xml:space="preserve">Definition 17</w:t>
         </w:r>
       </w:hyperlink>
       <w:r>
@@ -27381,8 +27466,8 @@
         <w:t xml:space="preserve">.</w:t>
       </w:r>
     </w:p>
-    <w:bookmarkEnd w:id="96"/>
-    <w:bookmarkStart w:id="97" w:name="exm-quotient"/>
+    <w:bookmarkEnd w:id="98"/>
+    <w:bookmarkStart w:id="99" w:name="exm-quotient"/>
     <w:p>
       <w:pPr>
         <w:pStyle w:val="BodyText"/>
@@ -27392,7 +27477,7 @@
           <w:b/>
           <w:bCs/>
         </w:rPr>
-        <w:t xml:space="preserve">Example 17 (A quotient)</w:t>
+        <w:t xml:space="preserve">Example 18 (A quotient)</w:t>
       </w:r>
       <w:r>
         <w:t xml:space="preserve"> </w:t>
@@ -27508,7 +27593,7 @@
           <w:rPr>
             <w:rStyle w:val="Hyperlink"/>
           </w:rPr>
-          <w:t xml:space="preserve">Definition 16</w:t>
+          <w:t xml:space="preserve">Definition 17</w:t>
         </w:r>
       </w:hyperlink>
       <w:r>
@@ -27518,8 +27603,8 @@
         <w:t xml:space="preserve">requires a nonzero denominator.</w:t>
       </w:r>
     </w:p>
-    <w:bookmarkEnd w:id="97"/>
-    <w:bookmarkStart w:id="98" w:name="def-person-years"/>
+    <w:bookmarkEnd w:id="99"/>
+    <w:bookmarkStart w:id="100" w:name="def-person-years"/>
     <w:p>
       <w:pPr>
         <w:pStyle w:val="BodyText"/>
@@ -27529,7 +27614,7 @@
           <w:b/>
           <w:bCs/>
         </w:rPr>
-        <w:t xml:space="preserve">Definition 18 (Follow-up and person-years)</w:t>
+        <w:t xml:space="preserve">Definition 19 (Follow-up and person-years)</w:t>
       </w:r>
       <w:r>
         <w:t xml:space="preserve"> </w:t>
@@ -27588,8 +27673,8 @@
         <w:t xml:space="preserve">measured in years.</w:t>
       </w:r>
     </w:p>
-    <w:bookmarkEnd w:id="98"/>
-    <w:bookmarkStart w:id="99" w:name="exm-person-years"/>
+    <w:bookmarkEnd w:id="100"/>
+    <w:bookmarkStart w:id="101" w:name="exm-person-years"/>
     <w:p>
       <w:pPr>
         <w:pStyle w:val="BodyText"/>
@@ -27599,7 +27684,7 @@
           <w:b/>
           <w:bCs/>
         </w:rPr>
-        <w:t xml:space="preserve">Example 18 (Counting person-years)</w:t>
+        <w:t xml:space="preserve">Example 19 (Counting person-years)</w:t>
       </w:r>
       <w:r>
         <w:t xml:space="preserve"> </w:t>
@@ -27770,8 +27855,8 @@
         <w:t xml:space="preserve">person-years.</w:t>
       </w:r>
     </w:p>
-    <w:bookmarkEnd w:id="99"/>
-    <w:bookmarkStart w:id="100" w:name="def-rate"/>
+    <w:bookmarkEnd w:id="101"/>
+    <w:bookmarkStart w:id="102" w:name="def-rate"/>
     <w:p>
       <w:pPr>
         <w:pStyle w:val="BodyText"/>
@@ -27781,7 +27866,7 @@
           <w:b/>
           <w:bCs/>
         </w:rPr>
-        <w:t xml:space="preserve">Definition 19 (Rate)</w:t>
+        <w:t xml:space="preserve">Definition 20 (Rate)</w:t>
       </w:r>
       <w:r>
         <w:t xml:space="preserve"> </w:t>
@@ -27822,7 +27907,7 @@
           <w:rPr>
             <w:rStyle w:val="Hyperlink"/>
           </w:rPr>
-          <w:t xml:space="preserve">Definition 18</w:t>
+          <w:t xml:space="preserve">Definition 19</w:t>
         </w:r>
       </w:hyperlink>
       <w:r>
@@ -27997,7 +28082,7 @@
         <w:t xml:space="preserve">cases per person-year.</w:t>
       </w:r>
     </w:p>
-    <w:bookmarkEnd w:id="100"/>
+    <w:bookmarkEnd w:id="102"/>
     <w:p>
       <w:pPr>
         <w:pStyle w:val="BodyText"/>
@@ -28005,7 +28090,7 @@
       <w:r>
         <w:t xml:space="preserve">cf. </w:t>
       </w:r>
-      <w:hyperlink r:id="rId101">
+      <w:hyperlink r:id="rId103">
         <w:r>
           <w:rPr>
             <w:rStyle w:val="Hyperlink"/>
@@ -28014,7 +28099,7 @@
         </w:r>
       </w:hyperlink>
     </w:p>
-    <w:bookmarkStart w:id="103" w:name="def-ratio"/>
+    <w:bookmarkStart w:id="105" w:name="def-ratio"/>
     <w:p>
       <w:pPr>
         <w:pStyle w:val="BodyText"/>
@@ -28024,7 +28109,7 @@
           <w:b/>
           <w:bCs/>
         </w:rPr>
-        <w:t xml:space="preserve">Definition 20 (Ratios)</w:t>
+        <w:t xml:space="preserve">Definition 21 (Ratios)</w:t>
       </w:r>
       <w:r>
         <w:t xml:space="preserve"> </w:t>
@@ -28056,7 +28141,7 @@
       <w:r>
         <w:t xml:space="preserve">cf. </w:t>
       </w:r>
-      <w:hyperlink r:id="rId102">
+      <w:hyperlink r:id="rId104">
         <w:r>
           <w:rPr>
             <w:rStyle w:val="Hyperlink"/>
@@ -28065,8 +28150,8 @@
         </w:r>
       </w:hyperlink>
     </w:p>
-    <w:bookmarkEnd w:id="103"/>
-    <w:bookmarkStart w:id="104" w:name="exm-ratio"/>
+    <w:bookmarkEnd w:id="105"/>
+    <w:bookmarkStart w:id="106" w:name="exm-ratio"/>
     <w:p>
       <w:pPr>
         <w:pStyle w:val="BodyText"/>
@@ -28076,7 +28161,7 @@
           <w:b/>
           <w:bCs/>
         </w:rPr>
-        <w:t xml:space="preserve">Example 19 (A ratio, and a quotient that is not one)</w:t>
+        <w:t xml:space="preserve">Example 20 (A ratio, and a quotient that is not one)</w:t>
       </w:r>
       <w:r>
         <w:t xml:space="preserve"> </w:t>
@@ -28090,7 +28175,7 @@
         <w:pStyle w:val="Compact"/>
         <w:numPr>
           <w:ilvl w:val="0"/>
-          <w:numId w:val="1020"/>
+          <w:numId w:val="1019"/>
         </w:numPr>
       </w:pPr>
       <w:r>
@@ -28182,7 +28267,7 @@
         <w:pStyle w:val="Compact"/>
         <w:numPr>
           <w:ilvl w:val="0"/>
-          <w:numId w:val="1020"/>
+          <w:numId w:val="1019"/>
         </w:numPr>
       </w:pPr>
       <w:r>
@@ -28324,8 +28409,8 @@
         <w:t xml:space="preserve">so this quotient is not a ratio.</w:t>
       </w:r>
     </w:p>
-    <w:bookmarkEnd w:id="104"/>
-    <w:bookmarkStart w:id="107" w:name="def-proportion"/>
+    <w:bookmarkEnd w:id="106"/>
+    <w:bookmarkStart w:id="109" w:name="def-proportion"/>
     <w:p>
       <w:pPr>
         <w:pStyle w:val="FirstParagraph"/>
@@ -28335,7 +28420,7 @@
           <w:b/>
           <w:bCs/>
         </w:rPr>
-        <w:t xml:space="preserve">Definition 21 (Proportion)</w:t>
+        <w:t xml:space="preserve">Definition 22 (Proportion)</w:t>
       </w:r>
       <w:r>
         <w:t xml:space="preserve"> </w:t>
@@ -28376,7 +28461,7 @@
       <w:r>
         <w:t xml:space="preserve"> </w:t>
       </w:r>
-      <w:hyperlink r:id="rId105">
+      <w:hyperlink r:id="rId107">
         <w:r>
           <w:rPr>
             <w:rStyle w:val="Hyperlink"/>
@@ -28398,7 +28483,7 @@
       <w:r>
         <w:t xml:space="preserve"> </w:t>
       </w:r>
-      <w:hyperlink r:id="rId106">
+      <w:hyperlink r:id="rId108">
         <w:r>
           <w:rPr>
             <w:rStyle w:val="Hyperlink"/>
@@ -28413,8 +28498,8 @@
         <w:t xml:space="preserve">for other meanings.</w:t>
       </w:r>
     </w:p>
-    <w:bookmarkEnd w:id="107"/>
-    <w:bookmarkStart w:id="108" w:name="exm-proportion"/>
+    <w:bookmarkEnd w:id="109"/>
+    <w:bookmarkStart w:id="110" w:name="exm-proportion"/>
     <w:p>
       <w:pPr>
         <w:pStyle w:val="BodyText"/>
@@ -28424,7 +28509,7 @@
           <w:b/>
           <w:bCs/>
         </w:rPr>
-        <w:t xml:space="preserve">Example 20 (A proportion, and a ratio that is not one)</w:t>
+        <w:t xml:space="preserve">Example 21 (A proportion, and a ratio that is not one)</w:t>
       </w:r>
       <w:r>
         <w:t xml:space="preserve"> </w:t>
@@ -28466,7 +28551,7 @@
         <w:pStyle w:val="Compact"/>
         <w:numPr>
           <w:ilvl w:val="0"/>
-          <w:numId w:val="1021"/>
+          <w:numId w:val="1020"/>
         </w:numPr>
       </w:pPr>
       <w:r>
@@ -28544,7 +28629,7 @@
         <w:pStyle w:val="Compact"/>
         <w:numPr>
           <w:ilvl w:val="0"/>
-          <w:numId w:val="1021"/>
+          <w:numId w:val="1020"/>
         </w:numPr>
       </w:pPr>
       <w:r>
@@ -28635,8 +28720,8 @@
         <w:t xml:space="preserve">non-smokers.</w:t>
       </w:r>
     </w:p>
-    <w:bookmarkEnd w:id="108"/>
-    <w:bookmarkStart w:id="110" w:name="def-proportional"/>
+    <w:bookmarkEnd w:id="110"/>
+    <w:bookmarkStart w:id="112" w:name="def-proportional"/>
     <w:p>
       <w:pPr>
         <w:pStyle w:val="FirstParagraph"/>
@@ -28646,7 +28731,7 @@
           <w:b/>
           <w:bCs/>
         </w:rPr>
-        <w:t xml:space="preserve">Definition 22 (Proportional)</w:t>
+        <w:t xml:space="preserve">Definition 23 (Proportional)</w:t>
       </w:r>
       <w:r>
         <w:t xml:space="preserve"> </w:t>
@@ -28807,7 +28892,7 @@
       <w:r>
         <w:t xml:space="preserve">(cf. </w:t>
       </w:r>
-      <w:hyperlink r:id="rId109">
+      <w:hyperlink r:id="rId111">
         <w:r>
           <w:rPr>
             <w:rStyle w:val="Hyperlink"/>
@@ -28819,8 +28904,8 @@
         <w:t xml:space="preserve">)</w:t>
       </w:r>
     </w:p>
-    <w:bookmarkEnd w:id="110"/>
-    <w:bookmarkStart w:id="111" w:name="exm-proportional"/>
+    <w:bookmarkEnd w:id="112"/>
+    <w:bookmarkStart w:id="113" w:name="exm-proportional"/>
     <w:p>
       <w:pPr>
         <w:pStyle w:val="BodyText"/>
@@ -28830,7 +28915,7 @@
           <w:b/>
           <w:bCs/>
         </w:rPr>
-        <w:t xml:space="preserve">Example 21 (Proportional and non-proportional functions)</w:t>
+        <w:t xml:space="preserve">Example 22 (Proportional and non-proportional functions)</w:t>
       </w:r>
       <w:r>
         <w:t xml:space="preserve"> </w:t>
@@ -28843,7 +28928,7 @@
       <w:pPr>
         <w:numPr>
           <w:ilvl w:val="0"/>
-          <w:numId w:val="1022"/>
+          <w:numId w:val="1021"/>
         </w:numPr>
       </w:pPr>
       <m:oMath>
@@ -29125,7 +29210,7 @@
       <w:pPr>
         <w:numPr>
           <w:ilvl w:val="0"/>
-          <w:numId w:val="1022"/>
+          <w:numId w:val="1021"/>
         </w:numPr>
       </w:pPr>
       <m:oMath>
@@ -29513,7 +29598,7 @@
         <w:t xml:space="preserve">.</w:t>
       </w:r>
     </w:p>
-    <w:bookmarkEnd w:id="111"/>
+    <w:bookmarkEnd w:id="113"/>
     <w:p>
       <w:pPr>
         <w:pStyle w:val="FirstParagraph"/>
@@ -29524,7 +29609,7 @@
       <w:r>
         <w:t xml:space="preserve"> </w:t>
       </w:r>
-      <w:hyperlink r:id="rId112">
+      <w:hyperlink r:id="rId114">
         <w:r>
           <w:rPr>
             <w:rStyle w:val="Hyperlink"/>
@@ -29533,8 +29618,8 @@
         </w:r>
       </w:hyperlink>
     </w:p>
-    <w:bookmarkStart w:id="114" w:name="refs"/>
-    <w:bookmarkStart w:id="113" w:name="ref-rudin1976principles"/>
+    <w:bookmarkStart w:id="116" w:name="refs"/>
+    <w:bookmarkStart w:id="115" w:name="ref-rudin1976principles"/>
     <w:p>
       <w:pPr>
         <w:pStyle w:val="Bibliography"/>
@@ -29556,9 +29641,9 @@
         <w:t xml:space="preserve">. 3rd ed. International Series in Pure and Applied Mathematics. McGraw-Hill.</w:t>
       </w:r>
     </w:p>
-    <w:bookmarkEnd w:id="113"/>
-    <w:bookmarkEnd w:id="114"/>
     <w:bookmarkEnd w:id="115"/>
+    <w:bookmarkEnd w:id="116"/>
+    <w:bookmarkEnd w:id="117"/>
     <w:sectPr>
       <w:footnotePr>
         <w:numRestart w:val="eachSect"/>
@@ -29951,7 +30036,34 @@
     <w:abstractNumId w:val="991"/>
   </w:num>
   <w:num w:numId="1013">
-    <w:abstractNumId w:val="991"/>
+    <w:abstractNumId w:val="99411"/>
+    <w:lvlOverride w:ilvl="0">
+      <w:startOverride w:val="1"/>
+    </w:lvlOverride>
+    <w:lvlOverride w:ilvl="1">
+      <w:startOverride w:val="1"/>
+    </w:lvlOverride>
+    <w:lvlOverride w:ilvl="2">
+      <w:startOverride w:val="1"/>
+    </w:lvlOverride>
+    <w:lvlOverride w:ilvl="3">
+      <w:startOverride w:val="1"/>
+    </w:lvlOverride>
+    <w:lvlOverride w:ilvl="4">
+      <w:startOverride w:val="1"/>
+    </w:lvlOverride>
+    <w:lvlOverride w:ilvl="5">
+      <w:startOverride w:val="1"/>
+    </w:lvlOverride>
+    <w:lvlOverride w:ilvl="6">
+      <w:startOverride w:val="1"/>
+    </w:lvlOverride>
+    <w:lvlOverride w:ilvl="7">
+      <w:startOverride w:val="1"/>
+    </w:lvlOverride>
+    <w:lvlOverride w:ilvl="8">
+      <w:startOverride w:val="1"/>
+    </w:lvlOverride>
   </w:num>
   <w:num w:numId="1014">
     <w:abstractNumId w:val="99411"/>
@@ -30104,42 +30216,12 @@
     </w:lvlOverride>
   </w:num>
   <w:num w:numId="1019">
-    <w:abstractNumId w:val="99411"/>
-    <w:lvlOverride w:ilvl="0">
-      <w:startOverride w:val="1"/>
-    </w:lvlOverride>
-    <w:lvlOverride w:ilvl="1">
-      <w:startOverride w:val="1"/>
-    </w:lvlOverride>
-    <w:lvlOverride w:ilvl="2">
-      <w:startOverride w:val="1"/>
-    </w:lvlOverride>
-    <w:lvlOverride w:ilvl="3">
-      <w:startOverride w:val="1"/>
-    </w:lvlOverride>
-    <w:lvlOverride w:ilvl="4">
-      <w:startOverride w:val="1"/>
-    </w:lvlOverride>
-    <w:lvlOverride w:ilvl="5">
-      <w:startOverride w:val="1"/>
-    </w:lvlOverride>
-    <w:lvlOverride w:ilvl="6">
-      <w:startOverride w:val="1"/>
-    </w:lvlOverride>
-    <w:lvlOverride w:ilvl="7">
-      <w:startOverride w:val="1"/>
-    </w:lvlOverride>
-    <w:lvlOverride w:ilvl="8">
-      <w:startOverride w:val="1"/>
-    </w:lvlOverride>
+    <w:abstractNumId w:val="991"/>
   </w:num>
   <w:num w:numId="1020">
     <w:abstractNumId w:val="991"/>
   </w:num>
   <w:num w:numId="1021">
-    <w:abstractNumId w:val="991"/>
-  </w:num>
-  <w:num w:numId="1022">
     <w:abstractNumId w:val="991"/>
   </w:num>
 </w:numbering>

</xml_diff>

<commit_message>
Deploying to gh-pages from @ Morrison-Lab/mds@c5145e7219b8c10d1fd95d6378718f45f9e12e33 🚀
</commit_message>
<xml_diff>
--- a/algebra-sums.docx
+++ b/algebra-sums.docx
@@ -15,7 +15,7 @@
         <w:pStyle w:val="Date"/>
       </w:pPr>
       <w:r>
-        <w:t xml:space="preserve">Last modified: 2026-10-16 10:58:47 (PDT)</w:t>
+        <w:t xml:space="preserve">Last modified: 2026-10-16 18:32:13 (PDT)</w:t>
       </w:r>
     </w:p>
     <w:bookmarkStart w:id="31" w:name="sec-convexity"/>
@@ -32300,7 +32300,7 @@
           <w:rPr>
             <w:rStyle w:val="Hyperlink"/>
           </w:rPr>
-          <w:t xml:space="preserve">Image and range</w:t>
+          <w:t xml:space="preserve">Range</w:t>
         </w:r>
       </w:hyperlink>
       <w:r>

</xml_diff>

<commit_message>
Deploying to gh-pages from @ Morrison-Lab/mds@324606ae4e6abd955edef157ce1e1261cd6f8980 🚀
</commit_message>
<xml_diff>
--- a/algebra-sums.docx
+++ b/algebra-sums.docx
@@ -15,7 +15,7 @@
         <w:pStyle w:val="Date"/>
       </w:pPr>
       <w:r>
-        <w:t xml:space="preserve">Last modified: 2026-10-18 13:21:32 (PDT)</w:t>
+        <w:t xml:space="preserve">Last modified: 2026-10-18 16:43:42 (PDT)</w:t>
       </w:r>
     </w:p>
     <w:bookmarkStart w:id="31" w:name="sec-convexity"/>
@@ -17720,7 +17720,7 @@
     </w:p>
     <w:bookmarkEnd w:id="68"/>
     <w:bookmarkEnd w:id="69"/>
-    <w:bookmarkStart w:id="82" w:name="sums-and-products-together"/>
+    <w:bookmarkStart w:id="84" w:name="sums-and-products-together"/>
     <w:p>
       <w:pPr>
         <w:pStyle w:val="Heading2"/>
@@ -20423,7 +20423,7 @@
       </w:r>
     </w:p>
     <w:bookmarkEnd w:id="79"/>
-    <w:bookmarkStart w:id="80" w:name="thm-square-of-a-sum"/>
+    <w:bookmarkStart w:id="80" w:name="thm-product-of-sums"/>
     <w:p>
       <w:pPr>
         <w:pStyle w:val="BodyText"/>
@@ -20433,7 +20433,1217 @@
           <w:b/>
           <w:bCs/>
         </w:rPr>
-        <w:t xml:space="preserve">Theorem 12 (Square of a sum)</w:t>
+        <w:t xml:space="preserve">Theorem 12 (Product of two sums (FOIL))</w:t>
+      </w:r>
+      <w:r>
+        <w:t xml:space="preserve"> </w:t>
+      </w:r>
+      <w:r>
+        <w:t xml:space="preserve">For any numbers</w:t>
+      </w:r>
+      <w:r>
+        <w:t xml:space="preserve"> </w:t>
+      </w:r>
+      <m:oMath>
+        <m:r>
+          <m:t>a</m:t>
+        </m:r>
+      </m:oMath>
+      <w:r>
+        <w:t xml:space="preserve">,</w:t>
+      </w:r>
+      <w:r>
+        <w:t xml:space="preserve"> </w:t>
+      </w:r>
+      <m:oMath>
+        <m:r>
+          <m:t>b</m:t>
+        </m:r>
+      </m:oMath>
+      <w:r>
+        <w:t xml:space="preserve">,</w:t>
+      </w:r>
+      <w:r>
+        <w:t xml:space="preserve"> </w:t>
+      </w:r>
+      <m:oMath>
+        <m:r>
+          <m:t>c</m:t>
+        </m:r>
+      </m:oMath>
+      <w:r>
+        <w:t xml:space="preserve"> </w:t>
+      </w:r>
+      <w:r>
+        <w:t xml:space="preserve">and</w:t>
+      </w:r>
+      <w:r>
+        <w:t xml:space="preserve"> </w:t>
+      </w:r>
+      <m:oMath>
+        <m:r>
+          <m:t>d</m:t>
+        </m:r>
+      </m:oMath>
+      <w:r>
+        <w:t xml:space="preserve">,</w:t>
+      </w:r>
+    </w:p>
+    <w:p>
+      <w:pPr>
+        <w:pStyle w:val="BodyText"/>
+      </w:pPr>
+      <m:oMathPara>
+        <m:oMathParaPr>
+          <m:jc m:val="center"/>
+        </m:oMathParaPr>
+        <m:oMath>
+          <m:r>
+            <m:rPr>
+              <m:sty m:val="p"/>
+            </m:rPr>
+            <m:t>(</m:t>
+          </m:r>
+          <m:r>
+            <m:t>a</m:t>
+          </m:r>
+          <m:r>
+            <m:rPr>
+              <m:sty m:val="p"/>
+            </m:rPr>
+            <m:t>+</m:t>
+          </m:r>
+          <m:r>
+            <m:t>b</m:t>
+          </m:r>
+          <m:r>
+            <m:rPr>
+              <m:sty m:val="p"/>
+            </m:rPr>
+            <m:t>)</m:t>
+          </m:r>
+          <m:r>
+            <m:rPr>
+              <m:sty m:val="p"/>
+            </m:rPr>
+            <m:t>(</m:t>
+          </m:r>
+          <m:r>
+            <m:t>c</m:t>
+          </m:r>
+          <m:r>
+            <m:rPr>
+              <m:sty m:val="p"/>
+            </m:rPr>
+            <m:t>+</m:t>
+          </m:r>
+          <m:r>
+            <m:t>d</m:t>
+          </m:r>
+          <m:r>
+            <m:rPr>
+              <m:sty m:val="p"/>
+            </m:rPr>
+            <m:t>)</m:t>
+          </m:r>
+          <m:r>
+            <m:rPr>
+              <m:sty m:val="p"/>
+            </m:rPr>
+            <m:t>=</m:t>
+          </m:r>
+          <m:r>
+            <m:t>a</m:t>
+          </m:r>
+          <m:r>
+            <m:t>c</m:t>
+          </m:r>
+          <m:r>
+            <m:rPr>
+              <m:sty m:val="p"/>
+            </m:rPr>
+            <m:t>+</m:t>
+          </m:r>
+          <m:r>
+            <m:t>a</m:t>
+          </m:r>
+          <m:r>
+            <m:t>d</m:t>
+          </m:r>
+          <m:r>
+            <m:rPr>
+              <m:sty m:val="p"/>
+            </m:rPr>
+            <m:t>+</m:t>
+          </m:r>
+          <m:r>
+            <m:t>b</m:t>
+          </m:r>
+          <m:r>
+            <m:t>c</m:t>
+          </m:r>
+          <m:r>
+            <m:rPr>
+              <m:sty m:val="p"/>
+            </m:rPr>
+            <m:t>+</m:t>
+          </m:r>
+          <m:r>
+            <m:t>b</m:t>
+          </m:r>
+          <m:r>
+            <m:t>d</m:t>
+          </m:r>
+          <m:r>
+            <m:rPr>
+              <m:sty m:val="p"/>
+            </m:rPr>
+            <m:t>.</m:t>
+          </m:r>
+        </m:oMath>
+      </m:oMathPara>
+    </w:p>
+    <w:p>
+      <w:pPr>
+        <w:pStyle w:val="FirstParagraph"/>
+      </w:pPr>
+      <w:r>
+        <w:t xml:space="preserve">The four products pair the</w:t>
+      </w:r>
+      <w:r>
+        <w:t xml:space="preserve"> </w:t>
+      </w:r>
+      <w:r>
+        <w:rPr>
+          <w:b/>
+          <w:bCs/>
+        </w:rPr>
+        <w:t xml:space="preserve">F</w:t>
+      </w:r>
+      <w:r>
+        <w:t xml:space="preserve">irst terms (</w:t>
+      </w:r>
+      <m:oMath>
+        <m:r>
+          <m:t>a</m:t>
+        </m:r>
+        <m:r>
+          <m:t>c</m:t>
+        </m:r>
+      </m:oMath>
+      <w:r>
+        <w:t xml:space="preserve">), the</w:t>
+      </w:r>
+      <w:r>
+        <w:t xml:space="preserve"> </w:t>
+      </w:r>
+      <w:r>
+        <w:rPr>
+          <w:b/>
+          <w:bCs/>
+        </w:rPr>
+        <w:t xml:space="preserve">O</w:t>
+      </w:r>
+      <w:r>
+        <w:t xml:space="preserve">uter terms (</w:t>
+      </w:r>
+      <m:oMath>
+        <m:r>
+          <m:t>a</m:t>
+        </m:r>
+        <m:r>
+          <m:t>d</m:t>
+        </m:r>
+      </m:oMath>
+      <w:r>
+        <w:t xml:space="preserve">), the</w:t>
+      </w:r>
+      <w:r>
+        <w:t xml:space="preserve"> </w:t>
+      </w:r>
+      <w:r>
+        <w:rPr>
+          <w:b/>
+          <w:bCs/>
+        </w:rPr>
+        <w:t xml:space="preserve">I</w:t>
+      </w:r>
+      <w:r>
+        <w:t xml:space="preserve">nner terms (</w:t>
+      </w:r>
+      <m:oMath>
+        <m:r>
+          <m:t>b</m:t>
+        </m:r>
+        <m:r>
+          <m:t>c</m:t>
+        </m:r>
+      </m:oMath>
+      <w:r>
+        <w:t xml:space="preserve">) and the</w:t>
+      </w:r>
+      <w:r>
+        <w:t xml:space="preserve"> </w:t>
+      </w:r>
+      <w:r>
+        <w:rPr>
+          <w:b/>
+          <w:bCs/>
+        </w:rPr>
+        <w:t xml:space="preserve">L</w:t>
+      </w:r>
+      <w:r>
+        <w:t xml:space="preserve">ast terms (</w:t>
+      </w:r>
+      <m:oMath>
+        <m:r>
+          <m:t>b</m:t>
+        </m:r>
+        <m:r>
+          <m:t>d</m:t>
+        </m:r>
+      </m:oMath>
+      <w:r>
+        <w:t xml:space="preserve">),</w:t>
+      </w:r>
+      <w:r>
+        <w:t xml:space="preserve"> </w:t>
+      </w:r>
+      <w:r>
+        <w:t xml:space="preserve">which gives this rule its name,</w:t>
+      </w:r>
+      <w:r>
+        <w:t xml:space="preserve"> </w:t>
+      </w:r>
+      <w:r>
+        <w:rPr>
+          <w:b/>
+          <w:bCs/>
+        </w:rPr>
+        <w:t xml:space="preserve">FOIL</w:t>
+      </w:r>
+      <w:r>
+        <w:t xml:space="preserve">.</w:t>
+      </w:r>
+    </w:p>
+    <w:bookmarkEnd w:id="80"/>
+    <w:p>
+      <w:pPr>
+        <w:pStyle w:val="BodyText"/>
+      </w:pPr>
+      <w:r>
+        <w:rPr>
+          <w:i/>
+          <w:iCs/>
+        </w:rPr>
+        <w:t xml:space="preserve">Proof</w:t>
+      </w:r>
+      <w:r>
+        <w:t xml:space="preserve">. </w:t>
+      </w:r>
+    </w:p>
+    <w:p>
+      <w:pPr>
+        <w:pStyle w:val="BodyText"/>
+      </w:pPr>
+      <m:oMathPara>
+        <m:oMathParaPr>
+          <m:jc m:val="center"/>
+        </m:oMathParaPr>
+        <m:oMath>
+          <m:eqArr>
+            <m:e>
+              <m:r>
+                <m:rPr>
+                  <m:sty m:val="p"/>
+                </m:rPr>
+                <m:t>(</m:t>
+              </m:r>
+              <m:r>
+                <m:t>a</m:t>
+              </m:r>
+              <m:r>
+                <m:rPr>
+                  <m:sty m:val="p"/>
+                </m:rPr>
+                <m:t>+</m:t>
+              </m:r>
+              <m:r>
+                <m:t>b</m:t>
+              </m:r>
+              <m:r>
+                <m:rPr>
+                  <m:sty m:val="p"/>
+                </m:rPr>
+                <m:t>)</m:t>
+              </m:r>
+              <m:r>
+                <m:rPr>
+                  <m:sty m:val="p"/>
+                </m:rPr>
+                <m:t>(</m:t>
+              </m:r>
+              <m:r>
+                <m:t>c</m:t>
+              </m:r>
+              <m:r>
+                <m:rPr>
+                  <m:sty m:val="p"/>
+                </m:rPr>
+                <m:t>+</m:t>
+              </m:r>
+              <m:r>
+                <m:t>d</m:t>
+              </m:r>
+              <m:r>
+                <m:rPr>
+                  <m:sty m:val="p"/>
+                </m:rPr>
+                <m:t>)</m:t>
+              </m:r>
+              <m:r>
+                <m:t>&amp;</m:t>
+              </m:r>
+              <m:r>
+                <m:rPr>
+                  <m:sty m:val="p"/>
+                </m:rPr>
+                <m:t>=</m:t>
+              </m:r>
+              <m:r>
+                <m:rPr>
+                  <m:sty m:val="p"/>
+                </m:rPr>
+                <m:t>(</m:t>
+              </m:r>
+              <m:r>
+                <m:t>a</m:t>
+              </m:r>
+              <m:r>
+                <m:rPr>
+                  <m:sty m:val="p"/>
+                </m:rPr>
+                <m:t>+</m:t>
+              </m:r>
+              <m:r>
+                <m:t>b</m:t>
+              </m:r>
+              <m:r>
+                <m:rPr>
+                  <m:sty m:val="p"/>
+                </m:rPr>
+                <m:t>)</m:t>
+              </m:r>
+              <m:r>
+                <m:t> </m:t>
+              </m:r>
+              <m:r>
+                <m:t>c</m:t>
+              </m:r>
+              <m:r>
+                <m:rPr>
+                  <m:sty m:val="p"/>
+                </m:rPr>
+                <m:t>+</m:t>
+              </m:r>
+              <m:r>
+                <m:rPr>
+                  <m:sty m:val="p"/>
+                </m:rPr>
+                <m:t>(</m:t>
+              </m:r>
+              <m:r>
+                <m:t>a</m:t>
+              </m:r>
+              <m:r>
+                <m:rPr>
+                  <m:sty m:val="p"/>
+                </m:rPr>
+                <m:t>+</m:t>
+              </m:r>
+              <m:r>
+                <m:t>b</m:t>
+              </m:r>
+              <m:r>
+                <m:rPr>
+                  <m:sty m:val="p"/>
+                </m:rPr>
+                <m:t>)</m:t>
+              </m:r>
+              <m:r>
+                <m:t> </m:t>
+              </m:r>
+              <m:r>
+                <m:t>d</m:t>
+              </m:r>
+              <m:r>
+                <m:t>&amp;</m:t>
+              </m:r>
+              <m:r>
+                <m:t>&amp;</m:t>
+              </m:r>
+              <m:r>
+                <m:rPr>
+                  <m:nor/>
+                  <m:sty m:val="p"/>
+                </m:rPr>
+                <m:t>(distributive law, </m:t>
+              </m:r>
+              <m:r>
+                <m:rPr>
+                  <m:nor/>
+                  <m:sty m:val="p"/>
+                </m:rPr>
+                <m:t>Theorem 11</m:t>
+              </m:r>
+              <m:r>
+                <m:rPr>
+                  <m:nor/>
+                  <m:sty m:val="p"/>
+                </m:rPr>
+                <m:t>)</m:t>
+              </m:r>
+            </m:e>
+            <m:e>
+              <m:r>
+                <m:t>&amp;</m:t>
+              </m:r>
+              <m:r>
+                <m:rPr>
+                  <m:sty m:val="p"/>
+                </m:rPr>
+                <m:t>=</m:t>
+              </m:r>
+              <m:r>
+                <m:rPr>
+                  <m:sty m:val="p"/>
+                </m:rPr>
+                <m:t>(</m:t>
+              </m:r>
+              <m:r>
+                <m:t>a</m:t>
+              </m:r>
+              <m:r>
+                <m:t>c</m:t>
+              </m:r>
+              <m:r>
+                <m:rPr>
+                  <m:sty m:val="p"/>
+                </m:rPr>
+                <m:t>+</m:t>
+              </m:r>
+              <m:r>
+                <m:t>b</m:t>
+              </m:r>
+              <m:r>
+                <m:t>c</m:t>
+              </m:r>
+              <m:r>
+                <m:rPr>
+                  <m:sty m:val="p"/>
+                </m:rPr>
+                <m:t>)</m:t>
+              </m:r>
+              <m:r>
+                <m:rPr>
+                  <m:sty m:val="p"/>
+                </m:rPr>
+                <m:t>+</m:t>
+              </m:r>
+              <m:r>
+                <m:rPr>
+                  <m:sty m:val="p"/>
+                </m:rPr>
+                <m:t>(</m:t>
+              </m:r>
+              <m:r>
+                <m:t>a</m:t>
+              </m:r>
+              <m:r>
+                <m:t>d</m:t>
+              </m:r>
+              <m:r>
+                <m:rPr>
+                  <m:sty m:val="p"/>
+                </m:rPr>
+                <m:t>+</m:t>
+              </m:r>
+              <m:r>
+                <m:t>b</m:t>
+              </m:r>
+              <m:r>
+                <m:t>d</m:t>
+              </m:r>
+              <m:r>
+                <m:rPr>
+                  <m:sty m:val="p"/>
+                </m:rPr>
+                <m:t>)</m:t>
+              </m:r>
+              <m:r>
+                <m:t>&amp;</m:t>
+              </m:r>
+              <m:r>
+                <m:t>&amp;</m:t>
+              </m:r>
+              <m:r>
+                <m:rPr>
+                  <m:nor/>
+                  <m:sty m:val="p"/>
+                </m:rPr>
+                <m:t>(distributive law, twice)</m:t>
+              </m:r>
+            </m:e>
+            <m:e>
+              <m:r>
+                <m:t>&amp;</m:t>
+              </m:r>
+              <m:r>
+                <m:rPr>
+                  <m:sty m:val="p"/>
+                </m:rPr>
+                <m:t>=</m:t>
+              </m:r>
+              <m:r>
+                <m:t>a</m:t>
+              </m:r>
+              <m:r>
+                <m:t>c</m:t>
+              </m:r>
+              <m:r>
+                <m:rPr>
+                  <m:sty m:val="p"/>
+                </m:rPr>
+                <m:t>+</m:t>
+              </m:r>
+              <m:r>
+                <m:t>a</m:t>
+              </m:r>
+              <m:r>
+                <m:t>d</m:t>
+              </m:r>
+              <m:r>
+                <m:rPr>
+                  <m:sty m:val="p"/>
+                </m:rPr>
+                <m:t>+</m:t>
+              </m:r>
+              <m:r>
+                <m:t>b</m:t>
+              </m:r>
+              <m:r>
+                <m:t>c</m:t>
+              </m:r>
+              <m:r>
+                <m:rPr>
+                  <m:sty m:val="p"/>
+                </m:rPr>
+                <m:t>+</m:t>
+              </m:r>
+              <m:r>
+                <m:t>b</m:t>
+              </m:r>
+              <m:r>
+                <m:t>d</m:t>
+              </m:r>
+              <m:r>
+                <m:t>&amp;</m:t>
+              </m:r>
+              <m:r>
+                <m:t>&amp;</m:t>
+              </m:r>
+              <m:r>
+                <m:rPr>
+                  <m:nor/>
+                  <m:sty m:val="p"/>
+                </m:rPr>
+                <m:t>(commutative and associative laws)</m:t>
+              </m:r>
+            </m:e>
+          </m:eqArr>
+        </m:oMath>
+      </m:oMathPara>
+    </w:p>
+    <w:bookmarkStart w:id="81" w:name="exm-product-of-sums"/>
+    <w:p>
+      <w:pPr>
+        <w:pStyle w:val="FirstParagraph"/>
+      </w:pPr>
+      <w:r>
+        <w:rPr>
+          <w:b/>
+          <w:bCs/>
+        </w:rPr>
+        <w:t xml:space="preserve">Example 18 (Checking FOIL)</w:t>
+      </w:r>
+      <w:r>
+        <w:t xml:space="preserve"> </w:t>
+      </w:r>
+      <w:r>
+        <w:t xml:space="preserve">With</w:t>
+      </w:r>
+      <w:r>
+        <w:t xml:space="preserve"> </w:t>
+      </w:r>
+      <m:oMath>
+        <m:r>
+          <m:t>a</m:t>
+        </m:r>
+        <m:r>
+          <m:rPr>
+            <m:sty m:val="p"/>
+          </m:rPr>
+          <m:t>=</m:t>
+        </m:r>
+        <m:r>
+          <m:t>1</m:t>
+        </m:r>
+      </m:oMath>
+      <w:r>
+        <w:t xml:space="preserve">,</w:t>
+      </w:r>
+      <w:r>
+        <w:t xml:space="preserve"> </w:t>
+      </w:r>
+      <m:oMath>
+        <m:r>
+          <m:t>b</m:t>
+        </m:r>
+        <m:r>
+          <m:rPr>
+            <m:sty m:val="p"/>
+          </m:rPr>
+          <m:t>=</m:t>
+        </m:r>
+        <m:r>
+          <m:t>2</m:t>
+        </m:r>
+      </m:oMath>
+      <w:r>
+        <w:t xml:space="preserve">,</w:t>
+      </w:r>
+      <w:r>
+        <w:t xml:space="preserve"> </w:t>
+      </w:r>
+      <m:oMath>
+        <m:r>
+          <m:t>c</m:t>
+        </m:r>
+        <m:r>
+          <m:rPr>
+            <m:sty m:val="p"/>
+          </m:rPr>
+          <m:t>=</m:t>
+        </m:r>
+        <m:r>
+          <m:t>3</m:t>
+        </m:r>
+      </m:oMath>
+      <w:r>
+        <w:t xml:space="preserve"> </w:t>
+      </w:r>
+      <w:r>
+        <w:t xml:space="preserve">and</w:t>
+      </w:r>
+      <w:r>
+        <w:t xml:space="preserve"> </w:t>
+      </w:r>
+      <m:oMath>
+        <m:r>
+          <m:t>d</m:t>
+        </m:r>
+        <m:r>
+          <m:rPr>
+            <m:sty m:val="p"/>
+          </m:rPr>
+          <m:t>=</m:t>
+        </m:r>
+        <m:r>
+          <m:t>4</m:t>
+        </m:r>
+      </m:oMath>
+      <w:r>
+        <w:t xml:space="preserve">,</w:t>
+      </w:r>
+    </w:p>
+    <w:p>
+      <w:pPr>
+        <w:pStyle w:val="BodyText"/>
+      </w:pPr>
+      <m:oMathPara>
+        <m:oMathParaPr>
+          <m:jc m:val="center"/>
+        </m:oMathParaPr>
+        <m:oMath>
+          <m:eqArr>
+            <m:e>
+              <m:r>
+                <m:rPr>
+                  <m:sty m:val="p"/>
+                </m:rPr>
+                <m:t>(</m:t>
+              </m:r>
+              <m:r>
+                <m:t>1</m:t>
+              </m:r>
+              <m:r>
+                <m:rPr>
+                  <m:sty m:val="p"/>
+                </m:rPr>
+                <m:t>+</m:t>
+              </m:r>
+              <m:r>
+                <m:t>2</m:t>
+              </m:r>
+              <m:r>
+                <m:rPr>
+                  <m:sty m:val="p"/>
+                </m:rPr>
+                <m:t>)</m:t>
+              </m:r>
+              <m:r>
+                <m:rPr>
+                  <m:sty m:val="p"/>
+                </m:rPr>
+                <m:t>(</m:t>
+              </m:r>
+              <m:r>
+                <m:t>3</m:t>
+              </m:r>
+              <m:r>
+                <m:rPr>
+                  <m:sty m:val="p"/>
+                </m:rPr>
+                <m:t>+</m:t>
+              </m:r>
+              <m:r>
+                <m:t>4</m:t>
+              </m:r>
+              <m:r>
+                <m:rPr>
+                  <m:sty m:val="p"/>
+                </m:rPr>
+                <m:t>)</m:t>
+              </m:r>
+              <m:r>
+                <m:t>&amp;</m:t>
+              </m:r>
+              <m:r>
+                <m:rPr>
+                  <m:sty m:val="p"/>
+                </m:rPr>
+                <m:t>=</m:t>
+              </m:r>
+              <m:r>
+                <m:t>3</m:t>
+              </m:r>
+              <m:r>
+                <m:rPr>
+                  <m:sty m:val="p"/>
+                </m:rPr>
+                <m:t>⋅</m:t>
+              </m:r>
+              <m:r>
+                <m:t>7</m:t>
+              </m:r>
+            </m:e>
+            <m:e>
+              <m:r>
+                <m:t>&amp;</m:t>
+              </m:r>
+              <m:r>
+                <m:rPr>
+                  <m:sty m:val="p"/>
+                </m:rPr>
+                <m:t>=</m:t>
+              </m:r>
+              <m:r>
+                <m:t>21</m:t>
+              </m:r>
+              <m:r>
+                <m:rPr>
+                  <m:sty m:val="p"/>
+                </m:rPr>
+                <m:t>,</m:t>
+              </m:r>
+            </m:e>
+          </m:eqArr>
+        </m:oMath>
+      </m:oMathPara>
+    </w:p>
+    <w:p>
+      <w:pPr>
+        <w:pStyle w:val="FirstParagraph"/>
+      </w:pPr>
+      <w:r>
+        <w:t xml:space="preserve">and</w:t>
+      </w:r>
+    </w:p>
+    <w:p>
+      <w:pPr>
+        <w:pStyle w:val="BodyText"/>
+      </w:pPr>
+      <m:oMathPara>
+        <m:oMathParaPr>
+          <m:jc m:val="center"/>
+        </m:oMathParaPr>
+        <m:oMath>
+          <m:eqArr>
+            <m:e>
+              <m:r>
+                <m:t>1</m:t>
+              </m:r>
+              <m:r>
+                <m:rPr>
+                  <m:sty m:val="p"/>
+                </m:rPr>
+                <m:t>⋅</m:t>
+              </m:r>
+              <m:r>
+                <m:t>3</m:t>
+              </m:r>
+              <m:r>
+                <m:rPr>
+                  <m:sty m:val="p"/>
+                </m:rPr>
+                <m:t>+</m:t>
+              </m:r>
+              <m:r>
+                <m:t>1</m:t>
+              </m:r>
+              <m:r>
+                <m:rPr>
+                  <m:sty m:val="p"/>
+                </m:rPr>
+                <m:t>⋅</m:t>
+              </m:r>
+              <m:r>
+                <m:t>4</m:t>
+              </m:r>
+              <m:r>
+                <m:rPr>
+                  <m:sty m:val="p"/>
+                </m:rPr>
+                <m:t>+</m:t>
+              </m:r>
+              <m:r>
+                <m:t>2</m:t>
+              </m:r>
+              <m:r>
+                <m:rPr>
+                  <m:sty m:val="p"/>
+                </m:rPr>
+                <m:t>⋅</m:t>
+              </m:r>
+              <m:r>
+                <m:t>3</m:t>
+              </m:r>
+              <m:r>
+                <m:rPr>
+                  <m:sty m:val="p"/>
+                </m:rPr>
+                <m:t>+</m:t>
+              </m:r>
+              <m:r>
+                <m:t>2</m:t>
+              </m:r>
+              <m:r>
+                <m:rPr>
+                  <m:sty m:val="p"/>
+                </m:rPr>
+                <m:t>⋅</m:t>
+              </m:r>
+              <m:r>
+                <m:t>4</m:t>
+              </m:r>
+              <m:r>
+                <m:t>&amp;</m:t>
+              </m:r>
+              <m:r>
+                <m:rPr>
+                  <m:sty m:val="p"/>
+                </m:rPr>
+                <m:t>=</m:t>
+              </m:r>
+              <m:r>
+                <m:t>3</m:t>
+              </m:r>
+              <m:r>
+                <m:rPr>
+                  <m:sty m:val="p"/>
+                </m:rPr>
+                <m:t>+</m:t>
+              </m:r>
+              <m:r>
+                <m:t>4</m:t>
+              </m:r>
+              <m:r>
+                <m:rPr>
+                  <m:sty m:val="p"/>
+                </m:rPr>
+                <m:t>+</m:t>
+              </m:r>
+              <m:r>
+                <m:t>6</m:t>
+              </m:r>
+              <m:r>
+                <m:rPr>
+                  <m:sty m:val="p"/>
+                </m:rPr>
+                <m:t>+</m:t>
+              </m:r>
+              <m:r>
+                <m:t>8</m:t>
+              </m:r>
+            </m:e>
+            <m:e>
+              <m:r>
+                <m:t>&amp;</m:t>
+              </m:r>
+              <m:r>
+                <m:rPr>
+                  <m:sty m:val="p"/>
+                </m:rPr>
+                <m:t>=</m:t>
+              </m:r>
+              <m:r>
+                <m:t>21</m:t>
+              </m:r>
+              <m:r>
+                <m:rPr>
+                  <m:sty m:val="p"/>
+                </m:rPr>
+                <m:t>.</m:t>
+              </m:r>
+            </m:e>
+          </m:eqArr>
+        </m:oMath>
+      </m:oMathPara>
+    </w:p>
+    <w:p>
+      <w:pPr>
+        <w:pStyle w:val="FirstParagraph"/>
+      </w:pPr>
+      <w:r>
+        <w:t xml:space="preserve">Setting</w:t>
+      </w:r>
+      <w:r>
+        <w:t xml:space="preserve"> </w:t>
+      </w:r>
+      <m:oMath>
+        <m:r>
+          <m:t>c</m:t>
+        </m:r>
+        <m:r>
+          <m:rPr>
+            <m:sty m:val="p"/>
+          </m:rPr>
+          <m:t>=</m:t>
+        </m:r>
+        <m:r>
+          <m:t>a</m:t>
+        </m:r>
+      </m:oMath>
+      <w:r>
+        <w:t xml:space="preserve"> </w:t>
+      </w:r>
+      <w:r>
+        <w:t xml:space="preserve">and</w:t>
+      </w:r>
+      <w:r>
+        <w:t xml:space="preserve"> </w:t>
+      </w:r>
+      <m:oMath>
+        <m:r>
+          <m:t>d</m:t>
+        </m:r>
+        <m:r>
+          <m:rPr>
+            <m:sty m:val="p"/>
+          </m:rPr>
+          <m:t>=</m:t>
+        </m:r>
+        <m:r>
+          <m:t>b</m:t>
+        </m:r>
+      </m:oMath>
+      <w:r>
+        <w:t xml:space="preserve"> </w:t>
+      </w:r>
+      <w:r>
+        <w:t xml:space="preserve">gives</w:t>
+      </w:r>
+      <w:r>
+        <w:t xml:space="preserve"> </w:t>
+      </w:r>
+      <m:oMath>
+        <m:r>
+          <m:rPr>
+            <m:sty m:val="p"/>
+          </m:rPr>
+          <m:t>(</m:t>
+        </m:r>
+        <m:r>
+          <m:t>a</m:t>
+        </m:r>
+        <m:r>
+          <m:rPr>
+            <m:sty m:val="p"/>
+          </m:rPr>
+          <m:t>+</m:t>
+        </m:r>
+        <m:r>
+          <m:t>b</m:t>
+        </m:r>
+        <m:sSup>
+          <m:e>
+            <m:r>
+              <m:rPr>
+                <m:sty m:val="p"/>
+              </m:rPr>
+              <m:t>)</m:t>
+            </m:r>
+          </m:e>
+          <m:sup>
+            <m:r>
+              <m:t>2</m:t>
+            </m:r>
+          </m:sup>
+        </m:sSup>
+        <m:r>
+          <m:rPr>
+            <m:sty m:val="p"/>
+          </m:rPr>
+          <m:t>=</m:t>
+        </m:r>
+        <m:sSup>
+          <m:e>
+            <m:r>
+              <m:t>a</m:t>
+            </m:r>
+          </m:e>
+          <m:sup>
+            <m:r>
+              <m:t>2</m:t>
+            </m:r>
+          </m:sup>
+        </m:sSup>
+        <m:r>
+          <m:rPr>
+            <m:sty m:val="p"/>
+          </m:rPr>
+          <m:t>+</m:t>
+        </m:r>
+        <m:r>
+          <m:t>a</m:t>
+        </m:r>
+        <m:r>
+          <m:t>b</m:t>
+        </m:r>
+        <m:r>
+          <m:rPr>
+            <m:sty m:val="p"/>
+          </m:rPr>
+          <m:t>+</m:t>
+        </m:r>
+        <m:r>
+          <m:t>b</m:t>
+        </m:r>
+        <m:r>
+          <m:t>a</m:t>
+        </m:r>
+        <m:r>
+          <m:rPr>
+            <m:sty m:val="p"/>
+          </m:rPr>
+          <m:t>+</m:t>
+        </m:r>
+        <m:sSup>
+          <m:e>
+            <m:r>
+              <m:t>b</m:t>
+            </m:r>
+          </m:e>
+          <m:sup>
+            <m:r>
+              <m:t>2</m:t>
+            </m:r>
+          </m:sup>
+        </m:sSup>
+      </m:oMath>
+      <w:r>
+        <w:t xml:space="preserve">,</w:t>
+      </w:r>
+      <w:r>
+        <w:t xml:space="preserve"> </w:t>
+      </w:r>
+      <w:r>
+        <w:t xml:space="preserve">which is the</w:t>
+      </w:r>
+      <w:r>
+        <w:t xml:space="preserve"> </w:t>
+      </w:r>
+      <w:hyperlink w:anchor="thm-square-of-a-sum">
+        <w:r>
+          <w:rPr>
+            <w:rStyle w:val="Hyperlink"/>
+          </w:rPr>
+          <w:t xml:space="preserve">square of a sum</w:t>
+        </w:r>
+      </w:hyperlink>
+      <w:r>
+        <w:t xml:space="preserve"> </w:t>
+      </w:r>
+      <w:r>
+        <w:t xml:space="preserve">once</w:t>
+      </w:r>
+      <w:r>
+        <w:t xml:space="preserve"> </w:t>
+      </w:r>
+      <m:oMath>
+        <m:r>
+          <m:t>a</m:t>
+        </m:r>
+        <m:r>
+          <m:t>b</m:t>
+        </m:r>
+      </m:oMath>
+      <w:r>
+        <w:t xml:space="preserve"> </w:t>
+      </w:r>
+      <w:r>
+        <w:t xml:space="preserve">and</w:t>
+      </w:r>
+      <w:r>
+        <w:t xml:space="preserve"> </w:t>
+      </w:r>
+      <m:oMath>
+        <m:r>
+          <m:t>b</m:t>
+        </m:r>
+        <m:r>
+          <m:t>a</m:t>
+        </m:r>
+      </m:oMath>
+      <w:r>
+        <w:t xml:space="preserve"> </w:t>
+      </w:r>
+      <w:r>
+        <w:t xml:space="preserve">are combined.</w:t>
+      </w:r>
+    </w:p>
+    <w:bookmarkEnd w:id="81"/>
+    <w:bookmarkStart w:id="82" w:name="thm-square-of-a-sum"/>
+    <w:p>
+      <w:pPr>
+        <w:pStyle w:val="BodyText"/>
+      </w:pPr>
+      <w:r>
+        <w:rPr>
+          <w:b/>
+          <w:bCs/>
+        </w:rPr>
+        <w:t xml:space="preserve">Theorem 13 (Square of a sum)</w:t>
       </w:r>
       <w:r>
         <w:t xml:space="preserve"> </w:t>
@@ -20563,7 +21773,7 @@
         </m:oMath>
       </m:oMathPara>
     </w:p>
-    <w:bookmarkEnd w:id="80"/>
+    <w:bookmarkEnd w:id="82"/>
     <w:p>
       <w:pPr>
         <w:pStyle w:val="FirstParagraph"/>
@@ -20596,7 +21806,7 @@
         <w:t xml:space="preserve">.</w:t>
       </w:r>
     </w:p>
-    <w:bookmarkStart w:id="81" w:name="rem-square-of-a-difference"/>
+    <w:bookmarkStart w:id="83" w:name="rem-square-of-a-difference"/>
     <w:p>
       <w:pPr>
         <w:pStyle w:val="BodyText"/>
@@ -20656,7 +21866,7 @@
           <w:rPr>
             <w:rStyle w:val="Hyperlink"/>
           </w:rPr>
-          <w:t xml:space="preserve">Theorem 12</w:t>
+          <w:t xml:space="preserve">Theorem 13</w:t>
         </w:r>
       </w:hyperlink>
       <w:r>
@@ -21133,9 +22343,9 @@
         </m:oMath>
       </m:oMathPara>
     </w:p>
-    <w:bookmarkEnd w:id="81"/>
-    <w:bookmarkEnd w:id="82"/>
-    <w:bookmarkStart w:id="101" w:name="sec-summation"/>
+    <w:bookmarkEnd w:id="83"/>
+    <w:bookmarkEnd w:id="84"/>
+    <w:bookmarkStart w:id="103" w:name="sec-summation"/>
     <w:p>
       <w:pPr>
         <w:pStyle w:val="Heading2"/>
@@ -21144,7 +22354,7 @@
         <w:t xml:space="preserve">7 Summation notation</w:t>
       </w:r>
     </w:p>
-    <w:bookmarkStart w:id="83" w:name="exr-expand-a-sum"/>
+    <w:bookmarkStart w:id="85" w:name="exr-expand-a-sum"/>
     <w:p>
       <w:pPr>
         <w:pStyle w:val="FirstParagraph"/>
@@ -21396,8 +22606,8 @@
         <w:t xml:space="preserve">symbol.</w:t>
       </w:r>
     </w:p>
-    <w:bookmarkEnd w:id="83"/>
-    <w:bookmarkStart w:id="84" w:name="sol-expand-a-sum"/>
+    <w:bookmarkEnd w:id="85"/>
+    <w:bookmarkStart w:id="86" w:name="sol-expand-a-sum"/>
     <w:p>
       <w:pPr>
         <w:pStyle w:val="FirstParagraph"/>
@@ -22111,8 +23321,8 @@
         </m:oMath>
       </m:oMathPara>
     </w:p>
-    <w:bookmarkEnd w:id="84"/>
-    <w:bookmarkStart w:id="85" w:name="def-summation"/>
+    <w:bookmarkEnd w:id="86"/>
+    <w:bookmarkStart w:id="87" w:name="def-summation"/>
     <w:p>
       <w:pPr>
         <w:pStyle w:val="FirstParagraph"/>
@@ -22530,8 +23740,8 @@
         <w:t xml:space="preserve">.</w:t>
       </w:r>
     </w:p>
-    <w:bookmarkEnd w:id="85"/>
-    <w:bookmarkStart w:id="86" w:name="def-summation-index"/>
+    <w:bookmarkEnd w:id="87"/>
+    <w:bookmarkStart w:id="88" w:name="def-summation-index"/>
     <w:p>
       <w:pPr>
         <w:pStyle w:val="BodyText"/>
@@ -22643,8 +23853,8 @@
         <w:t xml:space="preserve">of the sum.</w:t>
       </w:r>
     </w:p>
-    <w:bookmarkEnd w:id="86"/>
-    <w:bookmarkStart w:id="87" w:name="rem-summation-index"/>
+    <w:bookmarkEnd w:id="88"/>
+    <w:bookmarkStart w:id="89" w:name="rem-summation-index"/>
     <w:p>
       <w:pPr>
         <w:pStyle w:val="BodyText"/>
@@ -22971,8 +24181,8 @@
         </m:oMath>
       </m:oMathPara>
     </w:p>
-    <w:bookmarkEnd w:id="87"/>
-    <w:bookmarkStart w:id="88" w:name="def-empty-sum"/>
+    <w:bookmarkEnd w:id="89"/>
+    <w:bookmarkStart w:id="90" w:name="def-empty-sum"/>
     <w:p>
       <w:pPr>
         <w:pStyle w:val="FirstParagraph"/>
@@ -23163,8 +24373,8 @@
         <w:t xml:space="preserve">.</w:t>
       </w:r>
     </w:p>
-    <w:bookmarkEnd w:id="88"/>
-    <w:bookmarkStart w:id="89" w:name="exr-sum-rules"/>
+    <w:bookmarkEnd w:id="90"/>
+    <w:bookmarkStart w:id="91" w:name="exr-sum-rules"/>
     <w:p>
       <w:pPr>
         <w:pStyle w:val="BodyText"/>
@@ -23640,8 +24850,8 @@
         <w:t xml:space="preserve">Does either argument depend on there being exactly three terms?</w:t>
       </w:r>
     </w:p>
-    <w:bookmarkEnd w:id="89"/>
-    <w:bookmarkStart w:id="90" w:name="sol-sum-rules"/>
+    <w:bookmarkEnd w:id="91"/>
+    <w:bookmarkStart w:id="92" w:name="sol-sum-rules"/>
     <w:p>
       <w:pPr>
         <w:pStyle w:val="BodyText"/>
@@ -24621,8 +25831,8 @@
         <w:t xml:space="preserve">the same steps work for any lower and upper limits.</w:t>
       </w:r>
     </w:p>
-    <w:bookmarkEnd w:id="90"/>
-    <w:bookmarkStart w:id="91" w:name="thm-sum-constant-factor"/>
+    <w:bookmarkEnd w:id="92"/>
+    <w:bookmarkStart w:id="93" w:name="thm-sum-constant-factor"/>
     <w:p>
       <w:pPr>
         <w:pStyle w:val="BodyText"/>
@@ -24632,7 +25842,7 @@
           <w:b/>
           <w:bCs/>
         </w:rPr>
-        <w:t xml:space="preserve">Theorem 13 (A constant factor comes out of a sum)</w:t>
+        <w:t xml:space="preserve">Theorem 14 (A constant factor comes out of a sum)</w:t>
       </w:r>
       <w:r>
         <w:t xml:space="preserve"> </w:t>
@@ -24814,7 +26024,7 @@
         </m:oMath>
       </m:oMathPara>
     </w:p>
-    <w:bookmarkEnd w:id="91"/>
+    <w:bookmarkEnd w:id="93"/>
     <w:p>
       <w:pPr>
         <w:pStyle w:val="FirstParagraph"/>
@@ -24847,7 +26057,7 @@
         <w:t xml:space="preserve">, part 1.</w:t>
       </w:r>
     </w:p>
-    <w:bookmarkStart w:id="92" w:name="thm-sum-of-sums"/>
+    <w:bookmarkStart w:id="94" w:name="thm-sum-of-sums"/>
     <w:p>
       <w:pPr>
         <w:pStyle w:val="BodyText"/>
@@ -24857,7 +26067,7 @@
           <w:b/>
           <w:bCs/>
         </w:rPr>
-        <w:t xml:space="preserve">Theorem 14 (A sum of sums splits)</w:t>
+        <w:t xml:space="preserve">Theorem 15 (A sum of sums splits)</w:t>
       </w:r>
       <w:r>
         <w:t xml:space="preserve"> </w:t>
@@ -25150,7 +26360,7 @@
         </m:oMath>
       </m:oMathPara>
     </w:p>
-    <w:bookmarkEnd w:id="92"/>
+    <w:bookmarkEnd w:id="94"/>
     <w:p>
       <w:pPr>
         <w:pStyle w:val="FirstParagraph"/>
@@ -25183,7 +26393,7 @@
         <w:t xml:space="preserve">, part 2.</w:t>
       </w:r>
     </w:p>
-    <w:bookmarkStart w:id="93" w:name="exr-sum-over-set"/>
+    <w:bookmarkStart w:id="95" w:name="exr-sum-over-set"/>
     <w:p>
       <w:pPr>
         <w:pStyle w:val="BodyText"/>
@@ -25558,8 +26768,8 @@
         <w:t xml:space="preserve">Is the total the same?</w:t>
       </w:r>
     </w:p>
-    <w:bookmarkEnd w:id="93"/>
-    <w:bookmarkStart w:id="94" w:name="sol-sum-over-set"/>
+    <w:bookmarkEnd w:id="95"/>
+    <w:bookmarkStart w:id="96" w:name="sol-sum-over-set"/>
     <w:p>
       <w:pPr>
         <w:pStyle w:val="FirstParagraph"/>
@@ -26019,8 +27229,8 @@
         <w:t xml:space="preserve">because addition does not depend on the order of the terms.</w:t>
       </w:r>
     </w:p>
-    <w:bookmarkEnd w:id="94"/>
-    <w:bookmarkStart w:id="97" w:name="def-sum-over-set"/>
+    <w:bookmarkEnd w:id="96"/>
+    <w:bookmarkStart w:id="99" w:name="def-sum-over-set"/>
     <w:p>
       <w:pPr>
         <w:pStyle w:val="FirstParagraph"/>
@@ -26137,7 +27347,7 @@
       <w:r>
         <w:t xml:space="preserve"> </w:t>
       </w:r>
-      <w:hyperlink r:id="rId95">
+      <w:hyperlink r:id="rId97">
         <w:r>
           <w:rPr>
             <w:rStyle w:val="Hyperlink"/>
@@ -26148,7 +27358,7 @@
       <w:r>
         <w:t xml:space="preserve"> </w:t>
       </w:r>
-      <w:hyperlink r:id="rId96">
+      <w:hyperlink r:id="rId98">
         <w:r>
           <w:rPr>
             <w:rStyle w:val="Hyperlink"/>
@@ -26559,8 +27769,8 @@
         <w:t xml:space="preserve">.</w:t>
       </w:r>
     </w:p>
-    <w:bookmarkEnd w:id="97"/>
-    <w:bookmarkStart w:id="98" w:name="rem-sum-over-set-order"/>
+    <w:bookmarkEnd w:id="99"/>
+    <w:bookmarkStart w:id="100" w:name="rem-sum-over-set-order"/>
     <w:p>
       <w:pPr>
         <w:pStyle w:val="BodyText"/>
@@ -27073,8 +28283,8 @@
         <w:t xml:space="preserve">.</w:t>
       </w:r>
     </w:p>
-    <w:bookmarkEnd w:id="98"/>
-    <w:bookmarkStart w:id="99" w:name="rem-sum-without-set"/>
+    <w:bookmarkEnd w:id="100"/>
+    <w:bookmarkStart w:id="101" w:name="rem-sum-without-set"/>
     <w:p>
       <w:pPr>
         <w:pStyle w:val="BodyText"/>
@@ -27511,8 +28721,8 @@
         <w:t xml:space="preserve">).</w:t>
       </w:r>
     </w:p>
-    <w:bookmarkEnd w:id="99"/>
-    <w:bookmarkStart w:id="100" w:name="exm-sum-over-empty-set"/>
+    <w:bookmarkEnd w:id="101"/>
+    <w:bookmarkStart w:id="102" w:name="exm-sum-over-empty-set"/>
     <w:p>
       <w:pPr>
         <w:pStyle w:val="BodyText"/>
@@ -27522,7 +28732,7 @@
           <w:b/>
           <w:bCs/>
         </w:rPr>
-        <w:t xml:space="preserve">Example 18 (A sum over the empty set)</w:t>
+        <w:t xml:space="preserve">Example 19 (A sum over the empty set)</w:t>
       </w:r>
       <w:r>
         <w:t xml:space="preserve"> </w:t>
@@ -27601,9 +28811,9 @@
         <w:t xml:space="preserve">.</w:t>
       </w:r>
     </w:p>
-    <w:bookmarkEnd w:id="100"/>
-    <w:bookmarkEnd w:id="101"/>
-    <w:bookmarkStart w:id="124" w:name="quotients"/>
+    <w:bookmarkEnd w:id="102"/>
+    <w:bookmarkEnd w:id="103"/>
+    <w:bookmarkStart w:id="126" w:name="quotients"/>
     <w:p>
       <w:pPr>
         <w:pStyle w:val="Heading2"/>
@@ -27612,7 +28822,7 @@
         <w:t xml:space="preserve">8 Quotients</w:t>
       </w:r>
     </w:p>
-    <w:bookmarkStart w:id="102" w:name="def-quotient"/>
+    <w:bookmarkStart w:id="104" w:name="def-quotient"/>
     <w:p>
       <w:pPr>
         <w:pStyle w:val="FirstParagraph"/>
@@ -27781,8 +28991,8 @@
         </m:oMath>
       </m:oMathPara>
     </w:p>
-    <w:bookmarkEnd w:id="102"/>
-    <w:bookmarkStart w:id="103" w:name="def-fraction"/>
+    <w:bookmarkEnd w:id="104"/>
+    <w:bookmarkStart w:id="105" w:name="def-fraction"/>
     <w:p>
       <w:pPr>
         <w:pStyle w:val="FirstParagraph"/>
@@ -27851,8 +29061,8 @@
         <w:t xml:space="preserve">.</w:t>
       </w:r>
     </w:p>
-    <w:bookmarkEnd w:id="103"/>
-    <w:bookmarkStart w:id="104" w:name="def-numerator"/>
+    <w:bookmarkEnd w:id="105"/>
+    <w:bookmarkStart w:id="106" w:name="def-numerator"/>
     <w:p>
       <w:pPr>
         <w:pStyle w:val="BodyText"/>
@@ -27935,8 +29145,8 @@
         <w:t xml:space="preserve">.</w:t>
       </w:r>
     </w:p>
-    <w:bookmarkEnd w:id="104"/>
-    <w:bookmarkStart w:id="105" w:name="def-denominator"/>
+    <w:bookmarkEnd w:id="106"/>
+    <w:bookmarkStart w:id="107" w:name="def-denominator"/>
     <w:p>
       <w:pPr>
         <w:pStyle w:val="BodyText"/>
@@ -28019,8 +29229,8 @@
         <w:t xml:space="preserve">.</w:t>
       </w:r>
     </w:p>
-    <w:bookmarkEnd w:id="105"/>
-    <w:bookmarkStart w:id="106" w:name="exm-fraction"/>
+    <w:bookmarkEnd w:id="107"/>
+    <w:bookmarkStart w:id="108" w:name="exm-fraction"/>
     <w:p>
       <w:pPr>
         <w:pStyle w:val="BodyText"/>
@@ -28030,7 +29240,7 @@
           <w:b/>
           <w:bCs/>
         </w:rPr>
-        <w:t xml:space="preserve">Example 19 (Numerator and denominator of a fraction)</w:t>
+        <w:t xml:space="preserve">Example 20 (Numerator and denominator of a fraction)</w:t>
       </w:r>
       <w:r>
         <w:t xml:space="preserve"> </w:t>
@@ -28090,8 +29300,8 @@
         <w:t xml:space="preserve">.</w:t>
       </w:r>
     </w:p>
-    <w:bookmarkEnd w:id="106"/>
-    <w:bookmarkStart w:id="107" w:name="exm-quotient"/>
+    <w:bookmarkEnd w:id="108"/>
+    <w:bookmarkStart w:id="109" w:name="exm-quotient"/>
     <w:p>
       <w:pPr>
         <w:pStyle w:val="BodyText"/>
@@ -28101,7 +29311,7 @@
           <w:b/>
           <w:bCs/>
         </w:rPr>
-        <w:t xml:space="preserve">Example 20 (A quotient)</w:t>
+        <w:t xml:space="preserve">Example 21 (A quotient)</w:t>
       </w:r>
       <w:r>
         <w:t xml:space="preserve"> </w:t>
@@ -28227,8 +29437,8 @@
         <w:t xml:space="preserve">requires a nonzero denominator.</w:t>
       </w:r>
     </w:p>
-    <w:bookmarkEnd w:id="107"/>
-    <w:bookmarkStart w:id="108" w:name="def-follow-up"/>
+    <w:bookmarkEnd w:id="109"/>
+    <w:bookmarkStart w:id="110" w:name="def-follow-up"/>
     <w:p>
       <w:pPr>
         <w:pStyle w:val="BodyText"/>
@@ -28269,8 +29479,8 @@
         <w:t xml:space="preserve">is the length of time the study observes that participant.</w:t>
       </w:r>
     </w:p>
-    <w:bookmarkEnd w:id="108"/>
-    <w:bookmarkStart w:id="109" w:name="def-person-years"/>
+    <w:bookmarkEnd w:id="110"/>
+    <w:bookmarkStart w:id="111" w:name="def-person-years"/>
     <w:p>
       <w:pPr>
         <w:pStyle w:val="BodyText"/>
@@ -28328,8 +29538,8 @@
         <w:t xml:space="preserve">measured in years.</w:t>
       </w:r>
     </w:p>
-    <w:bookmarkEnd w:id="109"/>
-    <w:bookmarkStart w:id="110" w:name="exm-person-years"/>
+    <w:bookmarkEnd w:id="111"/>
+    <w:bookmarkStart w:id="112" w:name="exm-person-years"/>
     <w:p>
       <w:pPr>
         <w:pStyle w:val="BodyText"/>
@@ -28339,7 +29549,7 @@
           <w:b/>
           <w:bCs/>
         </w:rPr>
-        <w:t xml:space="preserve">Example 21 (Counting person-years)</w:t>
+        <w:t xml:space="preserve">Example 22 (Counting person-years)</w:t>
       </w:r>
       <w:r>
         <w:t xml:space="preserve"> </w:t>
@@ -28510,8 +29720,8 @@
         <w:t xml:space="preserve">person-years.</w:t>
       </w:r>
     </w:p>
-    <w:bookmarkEnd w:id="110"/>
-    <w:bookmarkStart w:id="111" w:name="def-rate"/>
+    <w:bookmarkEnd w:id="112"/>
+    <w:bookmarkStart w:id="113" w:name="def-rate"/>
     <w:p>
       <w:pPr>
         <w:pStyle w:val="BodyText"/>
@@ -28737,7 +29947,7 @@
         <w:t xml:space="preserve">cases per person-year.</w:t>
       </w:r>
     </w:p>
-    <w:bookmarkEnd w:id="111"/>
+    <w:bookmarkEnd w:id="113"/>
     <w:p>
       <w:pPr>
         <w:pStyle w:val="BodyText"/>
@@ -28745,7 +29955,7 @@
       <w:r>
         <w:t xml:space="preserve">cf. </w:t>
       </w:r>
-      <w:hyperlink r:id="rId112">
+      <w:hyperlink r:id="rId114">
         <w:r>
           <w:rPr>
             <w:rStyle w:val="Hyperlink"/>
@@ -28754,7 +29964,7 @@
         </w:r>
       </w:hyperlink>
     </w:p>
-    <w:bookmarkStart w:id="114" w:name="def-ratio"/>
+    <w:bookmarkStart w:id="116" w:name="def-ratio"/>
     <w:p>
       <w:pPr>
         <w:pStyle w:val="BodyText"/>
@@ -28796,7 +30006,7 @@
       <w:r>
         <w:t xml:space="preserve">cf. </w:t>
       </w:r>
-      <w:hyperlink r:id="rId113">
+      <w:hyperlink r:id="rId115">
         <w:r>
           <w:rPr>
             <w:rStyle w:val="Hyperlink"/>
@@ -28805,8 +30015,8 @@
         </w:r>
       </w:hyperlink>
     </w:p>
-    <w:bookmarkEnd w:id="114"/>
-    <w:bookmarkStart w:id="115" w:name="exm-ratio"/>
+    <w:bookmarkEnd w:id="116"/>
+    <w:bookmarkStart w:id="117" w:name="exm-ratio"/>
     <w:p>
       <w:pPr>
         <w:pStyle w:val="BodyText"/>
@@ -28816,7 +30026,7 @@
           <w:b/>
           <w:bCs/>
         </w:rPr>
-        <w:t xml:space="preserve">Example 22 (A ratio, and a quotient that is not one)</w:t>
+        <w:t xml:space="preserve">Example 23 (A ratio, and a quotient that is not one)</w:t>
       </w:r>
       <w:r>
         <w:t xml:space="preserve"> </w:t>
@@ -29064,8 +30274,8 @@
         <w:t xml:space="preserve">so this quotient is not a ratio.</w:t>
       </w:r>
     </w:p>
-    <w:bookmarkEnd w:id="115"/>
-    <w:bookmarkStart w:id="118" w:name="def-proportion"/>
+    <w:bookmarkEnd w:id="117"/>
+    <w:bookmarkStart w:id="120" w:name="def-proportion"/>
     <w:p>
       <w:pPr>
         <w:pStyle w:val="FirstParagraph"/>
@@ -29116,7 +30326,7 @@
       <w:r>
         <w:t xml:space="preserve"> </w:t>
       </w:r>
-      <w:hyperlink r:id="rId116">
+      <w:hyperlink r:id="rId118">
         <w:r>
           <w:rPr>
             <w:rStyle w:val="Hyperlink"/>
@@ -29138,7 +30348,7 @@
       <w:r>
         <w:t xml:space="preserve"> </w:t>
       </w:r>
-      <w:hyperlink r:id="rId117">
+      <w:hyperlink r:id="rId119">
         <w:r>
           <w:rPr>
             <w:rStyle w:val="Hyperlink"/>
@@ -29153,8 +30363,8 @@
         <w:t xml:space="preserve">for other meanings.</w:t>
       </w:r>
     </w:p>
-    <w:bookmarkEnd w:id="118"/>
-    <w:bookmarkStart w:id="119" w:name="exm-proportion"/>
+    <w:bookmarkEnd w:id="120"/>
+    <w:bookmarkStart w:id="121" w:name="exm-proportion"/>
     <w:p>
       <w:pPr>
         <w:pStyle w:val="BodyText"/>
@@ -29164,7 +30374,7 @@
           <w:b/>
           <w:bCs/>
         </w:rPr>
-        <w:t xml:space="preserve">Example 23 (A proportion, and a ratio that is not one)</w:t>
+        <w:t xml:space="preserve">Example 24 (A proportion, and a ratio that is not one)</w:t>
       </w:r>
       <w:r>
         <w:t xml:space="preserve"> </w:t>
@@ -29375,8 +30585,8 @@
         <w:t xml:space="preserve">non-smokers.</w:t>
       </w:r>
     </w:p>
-    <w:bookmarkEnd w:id="119"/>
-    <w:bookmarkStart w:id="121" w:name="def-proportional"/>
+    <w:bookmarkEnd w:id="121"/>
+    <w:bookmarkStart w:id="123" w:name="def-proportional"/>
     <w:p>
       <w:pPr>
         <w:pStyle w:val="FirstParagraph"/>
@@ -29547,7 +30757,7 @@
       <w:r>
         <w:t xml:space="preserve">(cf. </w:t>
       </w:r>
-      <w:hyperlink r:id="rId120">
+      <w:hyperlink r:id="rId122">
         <w:r>
           <w:rPr>
             <w:rStyle w:val="Hyperlink"/>
@@ -29559,8 +30769,8 @@
         <w:t xml:space="preserve">)</w:t>
       </w:r>
     </w:p>
-    <w:bookmarkEnd w:id="121"/>
-    <w:bookmarkStart w:id="122" w:name="exm-proportional"/>
+    <w:bookmarkEnd w:id="123"/>
+    <w:bookmarkStart w:id="124" w:name="exm-proportional"/>
     <w:p>
       <w:pPr>
         <w:pStyle w:val="BodyText"/>
@@ -29570,7 +30780,7 @@
           <w:b/>
           <w:bCs/>
         </w:rPr>
-        <w:t xml:space="preserve">Example 24 (Proportional and non-proportional functions)</w:t>
+        <w:t xml:space="preserve">Example 25 (Proportional and non-proportional functions)</w:t>
       </w:r>
       <w:r>
         <w:t xml:space="preserve"> </w:t>
@@ -30253,7 +31463,7 @@
         <w:t xml:space="preserve">.</w:t>
       </w:r>
     </w:p>
-    <w:bookmarkEnd w:id="122"/>
+    <w:bookmarkEnd w:id="124"/>
     <w:p>
       <w:pPr>
         <w:pStyle w:val="FirstParagraph"/>
@@ -30264,7 +31474,7 @@
       <w:r>
         <w:t xml:space="preserve"> </w:t>
       </w:r>
-      <w:hyperlink r:id="rId123">
+      <w:hyperlink r:id="rId125">
         <w:r>
           <w:rPr>
             <w:rStyle w:val="Hyperlink"/>
@@ -30273,8 +31483,8 @@
         </w:r>
       </w:hyperlink>
     </w:p>
-    <w:bookmarkEnd w:id="124"/>
-    <w:bookmarkStart w:id="171" w:name="sec-notational-shorthands"/>
+    <w:bookmarkEnd w:id="126"/>
+    <w:bookmarkStart w:id="173" w:name="sec-notational-shorthands"/>
     <w:p>
       <w:pPr>
         <w:pStyle w:val="Heading2"/>
@@ -30283,7 +31493,7 @@
         <w:t xml:space="preserve">9 Limits of sums and notational shorthands</w:t>
       </w:r>
     </w:p>
-    <w:bookmarkStart w:id="126" w:name="def-lower-upper-limits"/>
+    <w:bookmarkStart w:id="128" w:name="def-lower-upper-limits"/>
     <w:p>
       <w:pPr>
         <w:pStyle w:val="FirstParagraph"/>
@@ -30411,7 +31621,7 @@
       <w:r>
         <w:t xml:space="preserve"> </w:t>
       </w:r>
-      <w:hyperlink r:id="rId125">
+      <w:hyperlink r:id="rId127">
         <w:r>
           <w:rPr>
             <w:rStyle w:val="Hyperlink"/>
@@ -30511,8 +31721,8 @@
         <w:t xml:space="preserve">In both, the lower limit is written below the symbol.</w:t>
       </w:r>
     </w:p>
-    <w:bookmarkEnd w:id="126"/>
-    <w:bookmarkStart w:id="127" w:name="def-upper-limit"/>
+    <w:bookmarkEnd w:id="128"/>
+    <w:bookmarkStart w:id="129" w:name="def-upper-limit"/>
     <w:p>
       <w:pPr>
         <w:pStyle w:val="BodyText"/>
@@ -30640,7 +31850,7 @@
       <w:r>
         <w:t xml:space="preserve"> </w:t>
       </w:r>
-      <w:hyperlink r:id="rId125">
+      <w:hyperlink r:id="rId127">
         <w:r>
           <w:rPr>
             <w:rStyle w:val="Hyperlink"/>
@@ -30740,8 +31950,8 @@
         <w:t xml:space="preserve">In both, the upper limit is written above the symbol.</w:t>
       </w:r>
     </w:p>
-    <w:bookmarkEnd w:id="127"/>
-    <w:bookmarkStart w:id="128" w:name="def-limits-of-integration"/>
+    <w:bookmarkEnd w:id="129"/>
+    <w:bookmarkStart w:id="130" w:name="def-limits-of-integration"/>
     <w:p>
       <w:pPr>
         <w:pStyle w:val="BodyText"/>
@@ -30762,7 +31972,7 @@
       <w:r>
         <w:t xml:space="preserve"> </w:t>
       </w:r>
-      <w:hyperlink r:id="rId125">
+      <w:hyperlink r:id="rId127">
         <w:r>
           <w:rPr>
             <w:rStyle w:val="Hyperlink"/>
@@ -30895,8 +32105,8 @@
         <w:t xml:space="preserve">.</w:t>
       </w:r>
     </w:p>
-    <w:bookmarkEnd w:id="128"/>
-    <w:bookmarkStart w:id="129" w:name="exm-lower-upper-limits"/>
+    <w:bookmarkEnd w:id="130"/>
+    <w:bookmarkStart w:id="131" w:name="exm-lower-upper-limits"/>
     <w:p>
       <w:pPr>
         <w:pStyle w:val="BodyText"/>
@@ -30906,7 +32116,7 @@
           <w:b/>
           <w:bCs/>
         </w:rPr>
-        <w:t xml:space="preserve">Example 25 (Reading off limits)</w:t>
+        <w:t xml:space="preserve">Example 26 (Reading off limits)</w:t>
       </w:r>
       <w:r>
         <w:t xml:space="preserve"> </w:t>
@@ -31167,8 +32377,8 @@
         <w:t xml:space="preserve">.</w:t>
       </w:r>
     </w:p>
-    <w:bookmarkEnd w:id="129"/>
-    <w:bookmarkStart w:id="132" w:name="rem-limits-two-meanings"/>
+    <w:bookmarkEnd w:id="131"/>
+    <w:bookmarkStart w:id="134" w:name="rem-limits-two-meanings"/>
     <w:p>
       <w:pPr>
         <w:pStyle w:val="FirstParagraph"/>
@@ -31235,7 +32445,7 @@
       <w:r>
         <w:t xml:space="preserve"> </w:t>
       </w:r>
-      <w:hyperlink r:id="rId130">
+      <w:hyperlink r:id="rId132">
         <w:r>
           <w:rPr>
             <w:rStyle w:val="Hyperlink"/>
@@ -31252,7 +32462,7 @@
       <w:r>
         <w:t xml:space="preserve"> </w:t>
       </w:r>
-      <w:hyperlink r:id="rId131">
+      <w:hyperlink r:id="rId133">
         <w:r>
           <w:rPr>
             <w:rStyle w:val="Hyperlink"/>
@@ -31442,8 +32652,8 @@
         <w:t xml:space="preserve">is sent to infinity by a calculus limit.</w:t>
       </w:r>
     </w:p>
-    <w:bookmarkEnd w:id="132"/>
-    <w:bookmarkStart w:id="133" w:name="def-notational-shorthand"/>
+    <w:bookmarkEnd w:id="134"/>
+    <w:bookmarkStart w:id="135" w:name="def-notational-shorthand"/>
     <w:p>
       <w:pPr>
         <w:pStyle w:val="BodyText"/>
@@ -31496,8 +32706,8 @@
         <w:t xml:space="preserve">and relies on the reader to supply the missing part from context.</w:t>
       </w:r>
     </w:p>
-    <w:bookmarkEnd w:id="133"/>
-    <w:bookmarkStart w:id="134" w:name="def-full-form"/>
+    <w:bookmarkEnd w:id="135"/>
+    <w:bookmarkStart w:id="136" w:name="def-full-form"/>
     <w:p>
       <w:pPr>
         <w:pStyle w:val="BodyText"/>
@@ -31549,7 +32759,7 @@
         <w:t xml:space="preserve">is the expression with every part written out.</w:t>
       </w:r>
     </w:p>
-    <w:bookmarkEnd w:id="134"/>
+    <w:bookmarkEnd w:id="136"/>
     <w:tbl>
       <w:tblPr>
         <w:tblStyle w:val="Table"/>
@@ -31591,18 +32801,18 @@
                 <wp:inline>
                   <wp:extent cx="152400" cy="152400"/>
                   <wp:effectExtent b="0" l="0" r="0" t="0"/>
-                  <wp:docPr descr="" title="" id="136" name="Picture"/>
+                  <wp:docPr descr="" title="" id="138" name="Picture"/>
                   <a:graphic>
                     <a:graphicData uri="http://schemas.openxmlformats.org/drawingml/2006/picture">
                       <pic:pic>
                         <pic:nvPicPr>
-                          <pic:cNvPr descr="/opt/quarto/share/formats/docx/note.png" id="137" name="Picture"/>
+                          <pic:cNvPr descr="/opt/quarto/share/formats/docx/note.png" id="139" name="Picture"/>
                           <pic:cNvPicPr>
                             <a:picLocks noChangeArrowheads="1" noChangeAspect="1"/>
                           </pic:cNvPicPr>
                         </pic:nvPicPr>
                         <pic:blipFill>
-                          <a:blip r:embed="rId135"/>
+                          <a:blip r:embed="rId137"/>
                           <a:stretch>
                             <a:fillRect/>
                           </a:stretch>
@@ -32002,7 +33212,7 @@
         </w:tc>
       </w:tr>
     </w:tbl>
-    <w:bookmarkStart w:id="138" w:name="def-range-of-variable"/>
+    <w:bookmarkStart w:id="140" w:name="def-range-of-variable"/>
     <w:p>
       <w:pPr>
         <w:pStyle w:val="FirstParagraph"/>
@@ -32098,7 +33308,7 @@
         <w:t xml:space="preserve">can take.</w:t>
       </w:r>
     </w:p>
-    <w:bookmarkEnd w:id="138"/>
+    <w:bookmarkEnd w:id="140"/>
     <w:p>
       <w:pPr>
         <w:pStyle w:val="BodyText"/>
@@ -32214,7 +33424,7 @@
       <w:r>
         <w:t xml:space="preserve"> </w:t>
       </w:r>
-      <w:hyperlink r:id="rId139">
+      <w:hyperlink r:id="rId141">
         <w:r>
           <w:rPr>
             <w:rStyle w:val="Hyperlink"/>
@@ -32382,7 +33592,7 @@
       <w:r>
         <w:t xml:space="preserve">(</w:t>
       </w:r>
-      <w:hyperlink r:id="rId140">
+      <w:hyperlink r:id="rId142">
         <w:r>
           <w:rPr>
             <w:rStyle w:val="Hyperlink"/>
@@ -32844,7 +34054,7 @@
       <w:tr>
         <w:tc>
           <w:tcPr/>
-          <w:bookmarkStart w:id="141" w:name="tbl-notational-shorthands"/>
+          <w:bookmarkStart w:id="143" w:name="tbl-notational-shorthands"/>
           <w:p>
             <w:pPr>
               <w:jc w:val="center"/>
@@ -34490,12 +35700,12 @@
               </w:tc>
             </w:tr>
           </w:tbl>
-          <w:bookmarkEnd w:id="141"/>
+          <w:bookmarkEnd w:id="143"/>
           <w:p/>
         </w:tc>
       </w:tr>
     </w:tbl>
-    <w:bookmarkStart w:id="143" w:name="rem-indefinite-integral-not-shorthand"/>
+    <w:bookmarkStart w:id="145" w:name="rem-indefinite-integral-not-shorthand"/>
     <w:p>
       <w:pPr>
         <w:pStyle w:val="BodyText"/>
@@ -34607,7 +35817,7 @@
       <w:r>
         <w:t xml:space="preserve"> </w:t>
       </w:r>
-      <w:hyperlink r:id="rId142">
+      <w:hyperlink r:id="rId144">
         <w:r>
           <w:rPr>
             <w:rStyle w:val="Hyperlink"/>
@@ -34768,8 +35978,8 @@
         <w:t xml:space="preserve">Writing the limits out tells the reader which of the two is meant.</w:t>
       </w:r>
     </w:p>
-    <w:bookmarkEnd w:id="143"/>
-    <w:bookmarkStart w:id="144" w:name="exm-expand-index-shorthand"/>
+    <w:bookmarkEnd w:id="145"/>
+    <w:bookmarkStart w:id="146" w:name="exm-expand-index-shorthand"/>
     <w:p>
       <w:pPr>
         <w:pStyle w:val="BodyText"/>
@@ -34779,7 +35989,7 @@
           <w:b/>
           <w:bCs/>
         </w:rPr>
-        <w:t xml:space="preserve">Example 26 (Writing out an index shorthand)</w:t>
+        <w:t xml:space="preserve">Example 27 (Writing out an index shorthand)</w:t>
       </w:r>
       <w:r>
         <w:t xml:space="preserve"> </w:t>
@@ -35215,9 +36425,9 @@
         </m:oMath>
       </m:oMathPara>
     </w:p>
-    <w:bookmarkEnd w:id="144"/>
-    <w:bookmarkStart w:id="170" w:name="refs"/>
-    <w:bookmarkStart w:id="146" w:name="ref-wikipedia_line_segment"/>
+    <w:bookmarkEnd w:id="146"/>
+    <w:bookmarkStart w:id="172" w:name="refs"/>
+    <w:bookmarkStart w:id="148" w:name="ref-wikipedia_line_segment"/>
     <w:p>
       <w:pPr>
         <w:pStyle w:val="Bibliography"/>
@@ -35264,7 +36474,7 @@
       <w:r>
         <w:t xml:space="preserve"> </w:t>
       </w:r>
-      <w:hyperlink r:id="rId145">
+      <w:hyperlink r:id="rId147">
         <w:r>
           <w:rPr>
             <w:rStyle w:val="Hyperlink"/>
@@ -35273,8 +36483,8 @@
         </w:r>
       </w:hyperlink>
     </w:p>
-    <w:bookmarkEnd w:id="146"/>
-    <w:bookmarkStart w:id="148" w:name="ref-wikipedia_chord_geometry"/>
+    <w:bookmarkEnd w:id="148"/>
+    <w:bookmarkStart w:id="150" w:name="ref-wikipedia_chord_geometry"/>
     <w:p>
       <w:pPr>
         <w:pStyle w:val="Bibliography"/>
@@ -35321,7 +36531,7 @@
       <w:r>
         <w:t xml:space="preserve"> </w:t>
       </w:r>
-      <w:hyperlink r:id="rId147">
+      <w:hyperlink r:id="rId149">
         <w:r>
           <w:rPr>
             <w:rStyle w:val="Hyperlink"/>
@@ -35330,8 +36540,8 @@
         </w:r>
       </w:hyperlink>
     </w:p>
-    <w:bookmarkEnd w:id="148"/>
-    <w:bookmarkStart w:id="150" w:name="ref-wikipedia_convex_function"/>
+    <w:bookmarkEnd w:id="150"/>
+    <w:bookmarkStart w:id="152" w:name="ref-wikipedia_convex_function"/>
     <w:p>
       <w:pPr>
         <w:pStyle w:val="Bibliography"/>
@@ -35378,7 +36588,7 @@
       <w:r>
         <w:t xml:space="preserve"> </w:t>
       </w:r>
-      <w:hyperlink r:id="rId149">
+      <w:hyperlink r:id="rId151">
         <w:r>
           <w:rPr>
             <w:rStyle w:val="Hyperlink"/>
@@ -35387,8 +36597,8 @@
         </w:r>
       </w:hyperlink>
     </w:p>
-    <w:bookmarkEnd w:id="150"/>
-    <w:bookmarkStart w:id="152" w:name="ref-wikipedia_jensens_inequality"/>
+    <w:bookmarkEnd w:id="152"/>
+    <w:bookmarkStart w:id="154" w:name="ref-wikipedia_jensens_inequality"/>
     <w:p>
       <w:pPr>
         <w:pStyle w:val="Bibliography"/>
@@ -35435,7 +36645,7 @@
       <w:r>
         <w:t xml:space="preserve"> </w:t>
       </w:r>
-      <w:hyperlink r:id="rId151">
+      <w:hyperlink r:id="rId153">
         <w:r>
           <w:rPr>
             <w:rStyle w:val="Hyperlink"/>
@@ -35444,8 +36654,8 @@
         </w:r>
       </w:hyperlink>
     </w:p>
-    <w:bookmarkEnd w:id="152"/>
-    <w:bookmarkStart w:id="154" w:name="ref-wikipedia_upper_and_lower_bounds"/>
+    <w:bookmarkEnd w:id="154"/>
+    <w:bookmarkStart w:id="156" w:name="ref-wikipedia_upper_and_lower_bounds"/>
     <w:p>
       <w:pPr>
         <w:pStyle w:val="Bibliography"/>
@@ -35492,7 +36702,7 @@
       <w:r>
         <w:t xml:space="preserve"> </w:t>
       </w:r>
-      <w:hyperlink r:id="rId153">
+      <w:hyperlink r:id="rId155">
         <w:r>
           <w:rPr>
             <w:rStyle w:val="Hyperlink"/>
@@ -35501,8 +36711,8 @@
         </w:r>
       </w:hyperlink>
     </w:p>
-    <w:bookmarkEnd w:id="154"/>
-    <w:bookmarkStart w:id="156" w:name="ref-wikipedia_least_upper_bound_property"/>
+    <w:bookmarkEnd w:id="156"/>
+    <w:bookmarkStart w:id="158" w:name="ref-wikipedia_least_upper_bound_property"/>
     <w:p>
       <w:pPr>
         <w:pStyle w:val="Bibliography"/>
@@ -35549,7 +36759,7 @@
       <w:r>
         <w:t xml:space="preserve"> </w:t>
       </w:r>
-      <w:hyperlink r:id="rId155">
+      <w:hyperlink r:id="rId157">
         <w:r>
           <w:rPr>
             <w:rStyle w:val="Hyperlink"/>
@@ -35558,8 +36768,8 @@
         </w:r>
       </w:hyperlink>
     </w:p>
-    <w:bookmarkEnd w:id="156"/>
-    <w:bookmarkStart w:id="157" w:name="ref-rudin1976principles"/>
+    <w:bookmarkEnd w:id="158"/>
+    <w:bookmarkStart w:id="159" w:name="ref-rudin1976principles"/>
     <w:p>
       <w:pPr>
         <w:pStyle w:val="Bibliography"/>
@@ -35590,8 +36800,8 @@
         <w:t xml:space="preserve">, 3rd ed. in International series in pure and applied mathematics. New York: McGraw-Hill, 1976.</w:t>
       </w:r>
     </w:p>
-    <w:bookmarkEnd w:id="157"/>
-    <w:bookmarkStart w:id="159" w:name="ref-wikipedia_infimum_and_supremum"/>
+    <w:bookmarkEnd w:id="159"/>
+    <w:bookmarkStart w:id="161" w:name="ref-wikipedia_infimum_and_supremum"/>
     <w:p>
       <w:pPr>
         <w:pStyle w:val="Bibliography"/>
@@ -35638,7 +36848,7 @@
       <w:r>
         <w:t xml:space="preserve"> </w:t>
       </w:r>
-      <w:hyperlink r:id="rId158">
+      <w:hyperlink r:id="rId160">
         <w:r>
           <w:rPr>
             <w:rStyle w:val="Hyperlink"/>
@@ -35647,8 +36857,8 @@
         </w:r>
       </w:hyperlink>
     </w:p>
-    <w:bookmarkEnd w:id="159"/>
-    <w:bookmarkStart w:id="161" w:name="ref-wikipedia_identity_element"/>
+    <w:bookmarkEnd w:id="161"/>
+    <w:bookmarkStart w:id="163" w:name="ref-wikipedia_identity_element"/>
     <w:p>
       <w:pPr>
         <w:pStyle w:val="Bibliography"/>
@@ -35695,7 +36905,7 @@
       <w:r>
         <w:t xml:space="preserve"> </w:t>
       </w:r>
-      <w:hyperlink r:id="rId160">
+      <w:hyperlink r:id="rId162">
         <w:r>
           <w:rPr>
             <w:rStyle w:val="Hyperlink"/>
@@ -35704,8 +36914,8 @@
         </w:r>
       </w:hyperlink>
     </w:p>
-    <w:bookmarkEnd w:id="161"/>
-    <w:bookmarkStart w:id="163" w:name="ref-wikipedia_commutative_property"/>
+    <w:bookmarkEnd w:id="163"/>
+    <w:bookmarkStart w:id="165" w:name="ref-wikipedia_commutative_property"/>
     <w:p>
       <w:pPr>
         <w:pStyle w:val="Bibliography"/>
@@ -35752,7 +36962,7 @@
       <w:r>
         <w:t xml:space="preserve"> </w:t>
       </w:r>
-      <w:hyperlink r:id="rId162">
+      <w:hyperlink r:id="rId164">
         <w:r>
           <w:rPr>
             <w:rStyle w:val="Hyperlink"/>
@@ -35761,8 +36971,8 @@
         </w:r>
       </w:hyperlink>
     </w:p>
-    <w:bookmarkEnd w:id="163"/>
-    <w:bookmarkStart w:id="165" w:name="ref-wikipedia_associative_property"/>
+    <w:bookmarkEnd w:id="165"/>
+    <w:bookmarkStart w:id="167" w:name="ref-wikipedia_associative_property"/>
     <w:p>
       <w:pPr>
         <w:pStyle w:val="Bibliography"/>
@@ -35809,7 +37019,7 @@
       <w:r>
         <w:t xml:space="preserve"> </w:t>
       </w:r>
-      <w:hyperlink r:id="rId164">
+      <w:hyperlink r:id="rId166">
         <w:r>
           <w:rPr>
             <w:rStyle w:val="Hyperlink"/>
@@ -35818,8 +37028,8 @@
         </w:r>
       </w:hyperlink>
     </w:p>
-    <w:bookmarkEnd w:id="165"/>
-    <w:bookmarkStart w:id="167" w:name="ref-wikipedia_distributive_property"/>
+    <w:bookmarkEnd w:id="167"/>
+    <w:bookmarkStart w:id="169" w:name="ref-wikipedia_distributive_property"/>
     <w:p>
       <w:pPr>
         <w:pStyle w:val="Bibliography"/>
@@ -35866,7 +37076,7 @@
       <w:r>
         <w:t xml:space="preserve"> </w:t>
       </w:r>
-      <w:hyperlink r:id="rId166">
+      <w:hyperlink r:id="rId168">
         <w:r>
           <w:rPr>
             <w:rStyle w:val="Hyperlink"/>
@@ -35875,8 +37085,8 @@
         </w:r>
       </w:hyperlink>
     </w:p>
-    <w:bookmarkEnd w:id="167"/>
-    <w:bookmarkStart w:id="169" w:name="ref-wikipedia_like_terms"/>
+    <w:bookmarkEnd w:id="169"/>
+    <w:bookmarkStart w:id="171" w:name="ref-wikipedia_like_terms"/>
     <w:p>
       <w:pPr>
         <w:pStyle w:val="Bibliography"/>
@@ -35923,7 +37133,7 @@
       <w:r>
         <w:t xml:space="preserve"> </w:t>
       </w:r>
-      <w:hyperlink r:id="rId168">
+      <w:hyperlink r:id="rId170">
         <w:r>
           <w:rPr>
             <w:rStyle w:val="Hyperlink"/>
@@ -35932,9 +37142,9 @@
         </w:r>
       </w:hyperlink>
     </w:p>
-    <w:bookmarkEnd w:id="169"/>
-    <w:bookmarkEnd w:id="170"/>
     <w:bookmarkEnd w:id="171"/>
+    <w:bookmarkEnd w:id="172"/>
+    <w:bookmarkEnd w:id="173"/>
     <w:sectPr>
       <w:footnotePr>
         <w:numRestart w:val="eachSect"/>

</xml_diff>

<commit_message>
Deploying to gh-pages from @ Morrison-Lab/mds@d72ee93cbacc940382319efa8ad6b378d0c3532c 🚀
</commit_message>
<xml_diff>
--- a/algebra-sums.docx
+++ b/algebra-sums.docx
@@ -15,7 +15,7 @@
         <w:pStyle w:val="Date"/>
       </w:pPr>
       <w:r>
-        <w:t xml:space="preserve">Last modified: 2026-10-19 23:31:34 (PDT)</w:t>
+        <w:t xml:space="preserve">Last modified: 2026-10-20 00:42:48 (PDT)</w:t>
       </w:r>
     </w:p>
     <w:bookmarkStart w:id="31" w:name="sec-convexity"/>
@@ -16116,44 +16116,7 @@
         <w:t xml:space="preserve"> </w:t>
       </w:r>
       <w:r>
-        <w:t xml:space="preserve">Some sources, including the titles of</w:t>
-      </w:r>
-      <w:r>
-        <w:t xml:space="preserve"> </w:t>
-      </w:r>
-      <w:hyperlink w:anchor="thm-sum-symmetric">
-        <w:r>
-          <w:rPr>
-            <w:rStyle w:val="Hyperlink"/>
-          </w:rPr>
-          <w:t xml:space="preserve">Theorem 5</w:t>
-        </w:r>
-      </w:hyperlink>
-      <w:r>
-        <w:t xml:space="preserve"> </w:t>
-      </w:r>
-      <w:r>
-        <w:t xml:space="preserve">and</w:t>
-      </w:r>
-      <w:r>
-        <w:t xml:space="preserve"> </w:t>
-      </w:r>
-      <w:hyperlink w:anchor="thm-prod-symmetric">
-        <w:r>
-          <w:rPr>
-            <w:rStyle w:val="Hyperlink"/>
-          </w:rPr>
-          <w:t xml:space="preserve">Theorem 8</w:t>
-        </w:r>
-      </w:hyperlink>
-      <w:r>
-        <w:t xml:space="preserve">,</w:t>
-      </w:r>
-      <w:r>
-        <w:t xml:space="preserve"> </w:t>
-      </w:r>
-      <w:r>
-        <w:t xml:space="preserve">call a commutative operation</w:t>
+        <w:t xml:space="preserve">Some sources call a commutative operation</w:t>
       </w:r>
       <w:r>
         <w:t xml:space="preserve"> </w:t>
@@ -16166,7 +16129,37 @@
         <w:t xml:space="preserve">symmetric</w:t>
       </w:r>
       <w:r>
+        <w:t xml:space="preserve">,</w:t>
+      </w:r>
+      <w:r>
+        <w:t xml:space="preserve"> </w:t>
+      </w:r>
+      <w:r>
+        <w:t xml:space="preserve">as in the theorem titles</w:t>
+      </w:r>
+      <w:r>
+        <w:t xml:space="preserve"> </w:t>
+      </w:r>
+      <w:r>
+        <w:t xml:space="preserve">“Sums are symmetric”</w:t>
+      </w:r>
+      <w:r>
+        <w:t xml:space="preserve"> </w:t>
+      </w:r>
+      <w:r>
+        <w:t xml:space="preserve">and</w:t>
+      </w:r>
+      <w:r>
+        <w:t xml:space="preserve"> </w:t>
+      </w:r>
+      <w:r>
+        <w:t xml:space="preserve">“Products are symmetric”</w:t>
+      </w:r>
+      <w:r>
         <w:t xml:space="preserve">.</w:t>
+      </w:r>
+      <w:r>
+        <w:t xml:space="preserve"> </w:t>
       </w:r>
     </w:p>
     <w:bookmarkEnd w:id="55"/>
@@ -18275,426 +18268,10 @@
       </w:r>
     </w:p>
     <w:bookmarkEnd w:id="71"/>
-    <w:bookmarkStart w:id="72" w:name="def-distributive"/>
+    <w:bookmarkStart w:id="72" w:name="thm-mult-distr"/>
     <w:p>
       <w:pPr>
         <w:pStyle w:val="BodyText"/>
-      </w:pPr>
-      <w:r>
-        <w:rPr>
-          <w:b/>
-          <w:bCs/>
-        </w:rPr>
-        <w:t xml:space="preserve">Definition 16 (Distributive law)</w:t>
-      </w:r>
-      <w:r>
-        <w:t xml:space="preserve"> </w:t>
-      </w:r>
-      <w:r>
-        <w:t xml:space="preserve">The</w:t>
-      </w:r>
-      <w:r>
-        <w:t xml:space="preserve"> </w:t>
-      </w:r>
-      <w:r>
-        <w:rPr>
-          <w:b/>
-          <w:bCs/>
-        </w:rPr>
-        <w:t xml:space="preserve">distributive law</w:t>
-      </w:r>
-      <w:r>
-        <w:t xml:space="preserve"> </w:t>
-      </w:r>
-      <w:r>
-        <w:t xml:space="preserve">[12]</w:t>
-      </w:r>
-      <w:r>
-        <w:t xml:space="preserve"> </w:t>
-      </w:r>
-      <w:r>
-        <w:t xml:space="preserve">is the statement that multiplication distributes over addition</w:t>
-      </w:r>
-      <w:r>
-        <w:t xml:space="preserve"> </w:t>
-      </w:r>
-      <w:r>
-        <w:t xml:space="preserve">(</w:t>
-      </w:r>
-      <w:hyperlink w:anchor="def-distributes-over">
-        <w:r>
-          <w:rPr>
-            <w:rStyle w:val="Hyperlink"/>
-          </w:rPr>
-          <w:t xml:space="preserve">Definition 15</w:t>
-        </w:r>
-      </w:hyperlink>
-      <w:r>
-        <w:t xml:space="preserve">):</w:t>
-      </w:r>
-      <w:r>
-        <w:t xml:space="preserve"> </w:t>
-      </w:r>
-      <m:oMath>
-        <m:r>
-          <m:t>a</m:t>
-        </m:r>
-        <m:r>
-          <m:rPr>
-            <m:sty m:val="p"/>
-          </m:rPr>
-          <m:t>×</m:t>
-        </m:r>
-        <m:r>
-          <m:rPr>
-            <m:sty m:val="p"/>
-          </m:rPr>
-          <m:t>(</m:t>
-        </m:r>
-        <m:r>
-          <m:t>b</m:t>
-        </m:r>
-        <m:r>
-          <m:rPr>
-            <m:sty m:val="p"/>
-          </m:rPr>
-          <m:t>+</m:t>
-        </m:r>
-        <m:r>
-          <m:t>c</m:t>
-        </m:r>
-        <m:r>
-          <m:rPr>
-            <m:sty m:val="p"/>
-          </m:rPr>
-          <m:t>)</m:t>
-        </m:r>
-        <m:r>
-          <m:rPr>
-            <m:sty m:val="p"/>
-          </m:rPr>
-          <m:t>=</m:t>
-        </m:r>
-        <m:r>
-          <m:rPr>
-            <m:sty m:val="p"/>
-          </m:rPr>
-          <m:t>(</m:t>
-        </m:r>
-        <m:r>
-          <m:t>a</m:t>
-        </m:r>
-        <m:r>
-          <m:rPr>
-            <m:sty m:val="p"/>
-          </m:rPr>
-          <m:t>×</m:t>
-        </m:r>
-        <m:r>
-          <m:t>b</m:t>
-        </m:r>
-        <m:r>
-          <m:rPr>
-            <m:sty m:val="p"/>
-          </m:rPr>
-          <m:t>)</m:t>
-        </m:r>
-        <m:r>
-          <m:rPr>
-            <m:sty m:val="p"/>
-          </m:rPr>
-          <m:t>+</m:t>
-        </m:r>
-        <m:r>
-          <m:rPr>
-            <m:sty m:val="p"/>
-          </m:rPr>
-          <m:t>(</m:t>
-        </m:r>
-        <m:r>
-          <m:t>a</m:t>
-        </m:r>
-        <m:r>
-          <m:rPr>
-            <m:sty m:val="p"/>
-          </m:rPr>
-          <m:t>×</m:t>
-        </m:r>
-        <m:r>
-          <m:t>c</m:t>
-        </m:r>
-        <m:r>
-          <m:rPr>
-            <m:sty m:val="p"/>
-          </m:rPr>
-          <m:t>)</m:t>
-        </m:r>
-      </m:oMath>
-      <w:r>
-        <w:t xml:space="preserve"> </w:t>
-      </w:r>
-      <w:r>
-        <w:t xml:space="preserve">(</w:t>
-      </w:r>
-      <w:hyperlink w:anchor="thm-mult-distr">
-        <w:r>
-          <w:rPr>
-            <w:rStyle w:val="Hyperlink"/>
-          </w:rPr>
-          <w:t xml:space="preserve">Theorem 11</w:t>
-        </w:r>
-      </w:hyperlink>
-      <w:r>
-        <w:t xml:space="preserve">).</w:t>
-      </w:r>
-      <w:r>
-        <w:t xml:space="preserve"> </w:t>
-      </w:r>
-      <w:r>
-        <w:t xml:space="preserve">We then say multiplication is</w:t>
-      </w:r>
-      <w:r>
-        <w:t xml:space="preserve"> </w:t>
-      </w:r>
-      <w:r>
-        <w:rPr>
-          <w:b/>
-          <w:bCs/>
-        </w:rPr>
-        <w:t xml:space="preserve">distributive</w:t>
-      </w:r>
-      <w:r>
-        <w:t xml:space="preserve">.</w:t>
-      </w:r>
-    </w:p>
-    <w:bookmarkEnd w:id="72"/>
-    <w:bookmarkStart w:id="73" w:name="exm-distributive"/>
-    <w:p>
-      <w:pPr>
-        <w:pStyle w:val="BodyText"/>
-      </w:pPr>
-      <w:r>
-        <w:rPr>
-          <w:b/>
-          <w:bCs/>
-        </w:rPr>
-        <w:t xml:space="preserve">Example 16 (Multiplication distributes over addition)</w:t>
-      </w:r>
-    </w:p>
-    <w:p>
-      <w:pPr>
-        <w:pStyle w:val="BodyText"/>
-      </w:pPr>
-      <m:oMathPara>
-        <m:oMathParaPr>
-          <m:jc m:val="center"/>
-        </m:oMathParaPr>
-        <m:oMath>
-          <m:eqArr>
-            <m:e>
-              <m:r>
-                <m:t>3</m:t>
-              </m:r>
-              <m:r>
-                <m:rPr>
-                  <m:sty m:val="p"/>
-                </m:rPr>
-                <m:t>×</m:t>
-              </m:r>
-              <m:r>
-                <m:rPr>
-                  <m:sty m:val="p"/>
-                </m:rPr>
-                <m:t>(</m:t>
-              </m:r>
-              <m:r>
-                <m:t>4</m:t>
-              </m:r>
-              <m:r>
-                <m:rPr>
-                  <m:sty m:val="p"/>
-                </m:rPr>
-                <m:t>+</m:t>
-              </m:r>
-              <m:r>
-                <m:t>5</m:t>
-              </m:r>
-              <m:r>
-                <m:rPr>
-                  <m:sty m:val="p"/>
-                </m:rPr>
-                <m:t>)</m:t>
-              </m:r>
-              <m:r>
-                <m:t>&amp;</m:t>
-              </m:r>
-              <m:r>
-                <m:rPr>
-                  <m:sty m:val="p"/>
-                </m:rPr>
-                <m:t>=</m:t>
-              </m:r>
-              <m:r>
-                <m:t>3</m:t>
-              </m:r>
-              <m:r>
-                <m:rPr>
-                  <m:sty m:val="p"/>
-                </m:rPr>
-                <m:t>×</m:t>
-              </m:r>
-              <m:r>
-                <m:t>9</m:t>
-              </m:r>
-            </m:e>
-            <m:e>
-              <m:r>
-                <m:t>&amp;</m:t>
-              </m:r>
-              <m:r>
-                <m:rPr>
-                  <m:sty m:val="p"/>
-                </m:rPr>
-                <m:t>=</m:t>
-              </m:r>
-              <m:r>
-                <m:t>27</m:t>
-              </m:r>
-              <m:r>
-                <m:rPr>
-                  <m:sty m:val="p"/>
-                </m:rPr>
-                <m:t>,</m:t>
-              </m:r>
-            </m:e>
-          </m:eqArr>
-        </m:oMath>
-      </m:oMathPara>
-    </w:p>
-    <w:p>
-      <w:pPr>
-        <w:pStyle w:val="FirstParagraph"/>
-      </w:pPr>
-      <w:r>
-        <w:t xml:space="preserve">and</w:t>
-      </w:r>
-    </w:p>
-    <w:p>
-      <w:pPr>
-        <w:pStyle w:val="BodyText"/>
-      </w:pPr>
-      <m:oMathPara>
-        <m:oMathParaPr>
-          <m:jc m:val="center"/>
-        </m:oMathParaPr>
-        <m:oMath>
-          <m:eqArr>
-            <m:e>
-              <m:r>
-                <m:rPr>
-                  <m:sty m:val="p"/>
-                </m:rPr>
-                <m:t>(</m:t>
-              </m:r>
-              <m:r>
-                <m:t>3</m:t>
-              </m:r>
-              <m:r>
-                <m:rPr>
-                  <m:sty m:val="p"/>
-                </m:rPr>
-                <m:t>×</m:t>
-              </m:r>
-              <m:r>
-                <m:t>4</m:t>
-              </m:r>
-              <m:r>
-                <m:rPr>
-                  <m:sty m:val="p"/>
-                </m:rPr>
-                <m:t>)</m:t>
-              </m:r>
-              <m:r>
-                <m:rPr>
-                  <m:sty m:val="p"/>
-                </m:rPr>
-                <m:t>+</m:t>
-              </m:r>
-              <m:r>
-                <m:rPr>
-                  <m:sty m:val="p"/>
-                </m:rPr>
-                <m:t>(</m:t>
-              </m:r>
-              <m:r>
-                <m:t>3</m:t>
-              </m:r>
-              <m:r>
-                <m:rPr>
-                  <m:sty m:val="p"/>
-                </m:rPr>
-                <m:t>×</m:t>
-              </m:r>
-              <m:r>
-                <m:t>5</m:t>
-              </m:r>
-              <m:r>
-                <m:rPr>
-                  <m:sty m:val="p"/>
-                </m:rPr>
-                <m:t>)</m:t>
-              </m:r>
-              <m:r>
-                <m:t>&amp;</m:t>
-              </m:r>
-              <m:r>
-                <m:rPr>
-                  <m:sty m:val="p"/>
-                </m:rPr>
-                <m:t>=</m:t>
-              </m:r>
-              <m:r>
-                <m:t>12</m:t>
-              </m:r>
-              <m:r>
-                <m:rPr>
-                  <m:sty m:val="p"/>
-                </m:rPr>
-                <m:t>+</m:t>
-              </m:r>
-              <m:r>
-                <m:t>15</m:t>
-              </m:r>
-            </m:e>
-            <m:e>
-              <m:r>
-                <m:t>&amp;</m:t>
-              </m:r>
-              <m:r>
-                <m:rPr>
-                  <m:sty m:val="p"/>
-                </m:rPr>
-                <m:t>=</m:t>
-              </m:r>
-              <m:r>
-                <m:t>27</m:t>
-              </m:r>
-              <m:r>
-                <m:rPr>
-                  <m:sty m:val="p"/>
-                </m:rPr>
-                <m:t>.</m:t>
-              </m:r>
-            </m:e>
-          </m:eqArr>
-        </m:oMath>
-      </m:oMathPara>
-    </w:p>
-    <w:bookmarkEnd w:id="73"/>
-    <w:bookmarkStart w:id="74" w:name="thm-mult-distr"/>
-    <w:p>
-      <w:pPr>
-        <w:pStyle w:val="FirstParagraph"/>
       </w:pPr>
       <w:r>
         <w:rPr>
@@ -18764,6 +18341,422 @@
           <m:r>
             <m:t>c</m:t>
           </m:r>
+        </m:oMath>
+      </m:oMathPara>
+    </w:p>
+    <w:bookmarkEnd w:id="72"/>
+    <w:bookmarkStart w:id="73" w:name="def-distributive"/>
+    <w:p>
+      <w:pPr>
+        <w:pStyle w:val="FirstParagraph"/>
+      </w:pPr>
+      <w:r>
+        <w:rPr>
+          <w:b/>
+          <w:bCs/>
+        </w:rPr>
+        <w:t xml:space="preserve">Definition 16 (Distributive law)</w:t>
+      </w:r>
+      <w:r>
+        <w:t xml:space="preserve"> </w:t>
+      </w:r>
+      <w:r>
+        <w:t xml:space="preserve">The</w:t>
+      </w:r>
+      <w:r>
+        <w:t xml:space="preserve"> </w:t>
+      </w:r>
+      <w:r>
+        <w:rPr>
+          <w:b/>
+          <w:bCs/>
+        </w:rPr>
+        <w:t xml:space="preserve">distributive law</w:t>
+      </w:r>
+      <w:r>
+        <w:t xml:space="preserve"> </w:t>
+      </w:r>
+      <w:r>
+        <w:t xml:space="preserve">[12]</w:t>
+      </w:r>
+      <w:r>
+        <w:t xml:space="preserve"> </w:t>
+      </w:r>
+      <w:r>
+        <w:t xml:space="preserve">is the statement that multiplication distributes over addition</w:t>
+      </w:r>
+      <w:r>
+        <w:t xml:space="preserve"> </w:t>
+      </w:r>
+      <w:r>
+        <w:t xml:space="preserve">(</w:t>
+      </w:r>
+      <w:hyperlink w:anchor="def-distributes-over">
+        <w:r>
+          <w:rPr>
+            <w:rStyle w:val="Hyperlink"/>
+          </w:rPr>
+          <w:t xml:space="preserve">Definition 15</w:t>
+        </w:r>
+      </w:hyperlink>
+      <w:r>
+        <w:t xml:space="preserve">):</w:t>
+      </w:r>
+      <w:r>
+        <w:t xml:space="preserve"> </w:t>
+      </w:r>
+      <m:oMath>
+        <m:r>
+          <m:t>a</m:t>
+        </m:r>
+        <m:r>
+          <m:rPr>
+            <m:sty m:val="p"/>
+          </m:rPr>
+          <m:t>×</m:t>
+        </m:r>
+        <m:r>
+          <m:rPr>
+            <m:sty m:val="p"/>
+          </m:rPr>
+          <m:t>(</m:t>
+        </m:r>
+        <m:r>
+          <m:t>b</m:t>
+        </m:r>
+        <m:r>
+          <m:rPr>
+            <m:sty m:val="p"/>
+          </m:rPr>
+          <m:t>+</m:t>
+        </m:r>
+        <m:r>
+          <m:t>c</m:t>
+        </m:r>
+        <m:r>
+          <m:rPr>
+            <m:sty m:val="p"/>
+          </m:rPr>
+          <m:t>)</m:t>
+        </m:r>
+        <m:r>
+          <m:rPr>
+            <m:sty m:val="p"/>
+          </m:rPr>
+          <m:t>=</m:t>
+        </m:r>
+        <m:r>
+          <m:rPr>
+            <m:sty m:val="p"/>
+          </m:rPr>
+          <m:t>(</m:t>
+        </m:r>
+        <m:r>
+          <m:t>a</m:t>
+        </m:r>
+        <m:r>
+          <m:rPr>
+            <m:sty m:val="p"/>
+          </m:rPr>
+          <m:t>×</m:t>
+        </m:r>
+        <m:r>
+          <m:t>b</m:t>
+        </m:r>
+        <m:r>
+          <m:rPr>
+            <m:sty m:val="p"/>
+          </m:rPr>
+          <m:t>)</m:t>
+        </m:r>
+        <m:r>
+          <m:rPr>
+            <m:sty m:val="p"/>
+          </m:rPr>
+          <m:t>+</m:t>
+        </m:r>
+        <m:r>
+          <m:rPr>
+            <m:sty m:val="p"/>
+          </m:rPr>
+          <m:t>(</m:t>
+        </m:r>
+        <m:r>
+          <m:t>a</m:t>
+        </m:r>
+        <m:r>
+          <m:rPr>
+            <m:sty m:val="p"/>
+          </m:rPr>
+          <m:t>×</m:t>
+        </m:r>
+        <m:r>
+          <m:t>c</m:t>
+        </m:r>
+        <m:r>
+          <m:rPr>
+            <m:sty m:val="p"/>
+          </m:rPr>
+          <m:t>)</m:t>
+        </m:r>
+      </m:oMath>
+      <w:r>
+        <w:t xml:space="preserve"> </w:t>
+      </w:r>
+      <w:r>
+        <w:t xml:space="preserve">(</w:t>
+      </w:r>
+      <w:hyperlink w:anchor="thm-mult-distr">
+        <w:r>
+          <w:rPr>
+            <w:rStyle w:val="Hyperlink"/>
+          </w:rPr>
+          <w:t xml:space="preserve">Theorem 11</w:t>
+        </w:r>
+      </w:hyperlink>
+      <w:r>
+        <w:t xml:space="preserve">).</w:t>
+      </w:r>
+      <w:r>
+        <w:t xml:space="preserve"> </w:t>
+      </w:r>
+      <w:r>
+        <w:t xml:space="preserve">We then say multiplication is</w:t>
+      </w:r>
+      <w:r>
+        <w:t xml:space="preserve"> </w:t>
+      </w:r>
+      <w:r>
+        <w:rPr>
+          <w:b/>
+          <w:bCs/>
+        </w:rPr>
+        <w:t xml:space="preserve">distributive</w:t>
+      </w:r>
+      <w:r>
+        <w:t xml:space="preserve">.</w:t>
+      </w:r>
+    </w:p>
+    <w:bookmarkEnd w:id="73"/>
+    <w:bookmarkStart w:id="74" w:name="exm-distributive"/>
+    <w:p>
+      <w:pPr>
+        <w:pStyle w:val="BodyText"/>
+      </w:pPr>
+      <w:r>
+        <w:rPr>
+          <w:b/>
+          <w:bCs/>
+        </w:rPr>
+        <w:t xml:space="preserve">Example 16 (Multiplication distributes over addition)</w:t>
+      </w:r>
+    </w:p>
+    <w:p>
+      <w:pPr>
+        <w:pStyle w:val="BodyText"/>
+      </w:pPr>
+      <m:oMathPara>
+        <m:oMathParaPr>
+          <m:jc m:val="center"/>
+        </m:oMathParaPr>
+        <m:oMath>
+          <m:eqArr>
+            <m:e>
+              <m:r>
+                <m:t>3</m:t>
+              </m:r>
+              <m:r>
+                <m:rPr>
+                  <m:sty m:val="p"/>
+                </m:rPr>
+                <m:t>×</m:t>
+              </m:r>
+              <m:r>
+                <m:rPr>
+                  <m:sty m:val="p"/>
+                </m:rPr>
+                <m:t>(</m:t>
+              </m:r>
+              <m:r>
+                <m:t>4</m:t>
+              </m:r>
+              <m:r>
+                <m:rPr>
+                  <m:sty m:val="p"/>
+                </m:rPr>
+                <m:t>+</m:t>
+              </m:r>
+              <m:r>
+                <m:t>5</m:t>
+              </m:r>
+              <m:r>
+                <m:rPr>
+                  <m:sty m:val="p"/>
+                </m:rPr>
+                <m:t>)</m:t>
+              </m:r>
+              <m:r>
+                <m:t>&amp;</m:t>
+              </m:r>
+              <m:r>
+                <m:rPr>
+                  <m:sty m:val="p"/>
+                </m:rPr>
+                <m:t>=</m:t>
+              </m:r>
+              <m:r>
+                <m:t>3</m:t>
+              </m:r>
+              <m:r>
+                <m:rPr>
+                  <m:sty m:val="p"/>
+                </m:rPr>
+                <m:t>×</m:t>
+              </m:r>
+              <m:r>
+                <m:t>9</m:t>
+              </m:r>
+            </m:e>
+            <m:e>
+              <m:r>
+                <m:t>&amp;</m:t>
+              </m:r>
+              <m:r>
+                <m:rPr>
+                  <m:sty m:val="p"/>
+                </m:rPr>
+                <m:t>=</m:t>
+              </m:r>
+              <m:r>
+                <m:t>27</m:t>
+              </m:r>
+              <m:r>
+                <m:rPr>
+                  <m:sty m:val="p"/>
+                </m:rPr>
+                <m:t>,</m:t>
+              </m:r>
+            </m:e>
+          </m:eqArr>
+        </m:oMath>
+      </m:oMathPara>
+    </w:p>
+    <w:p>
+      <w:pPr>
+        <w:pStyle w:val="FirstParagraph"/>
+      </w:pPr>
+      <w:r>
+        <w:t xml:space="preserve">and</w:t>
+      </w:r>
+    </w:p>
+    <w:p>
+      <w:pPr>
+        <w:pStyle w:val="BodyText"/>
+      </w:pPr>
+      <m:oMathPara>
+        <m:oMathParaPr>
+          <m:jc m:val="center"/>
+        </m:oMathParaPr>
+        <m:oMath>
+          <m:eqArr>
+            <m:e>
+              <m:r>
+                <m:rPr>
+                  <m:sty m:val="p"/>
+                </m:rPr>
+                <m:t>(</m:t>
+              </m:r>
+              <m:r>
+                <m:t>3</m:t>
+              </m:r>
+              <m:r>
+                <m:rPr>
+                  <m:sty m:val="p"/>
+                </m:rPr>
+                <m:t>×</m:t>
+              </m:r>
+              <m:r>
+                <m:t>4</m:t>
+              </m:r>
+              <m:r>
+                <m:rPr>
+                  <m:sty m:val="p"/>
+                </m:rPr>
+                <m:t>)</m:t>
+              </m:r>
+              <m:r>
+                <m:rPr>
+                  <m:sty m:val="p"/>
+                </m:rPr>
+                <m:t>+</m:t>
+              </m:r>
+              <m:r>
+                <m:rPr>
+                  <m:sty m:val="p"/>
+                </m:rPr>
+                <m:t>(</m:t>
+              </m:r>
+              <m:r>
+                <m:t>3</m:t>
+              </m:r>
+              <m:r>
+                <m:rPr>
+                  <m:sty m:val="p"/>
+                </m:rPr>
+                <m:t>×</m:t>
+              </m:r>
+              <m:r>
+                <m:t>5</m:t>
+              </m:r>
+              <m:r>
+                <m:rPr>
+                  <m:sty m:val="p"/>
+                </m:rPr>
+                <m:t>)</m:t>
+              </m:r>
+              <m:r>
+                <m:t>&amp;</m:t>
+              </m:r>
+              <m:r>
+                <m:rPr>
+                  <m:sty m:val="p"/>
+                </m:rPr>
+                <m:t>=</m:t>
+              </m:r>
+              <m:r>
+                <m:t>12</m:t>
+              </m:r>
+              <m:r>
+                <m:rPr>
+                  <m:sty m:val="p"/>
+                </m:rPr>
+                <m:t>+</m:t>
+              </m:r>
+              <m:r>
+                <m:t>15</m:t>
+              </m:r>
+            </m:e>
+            <m:e>
+              <m:r>
+                <m:t>&amp;</m:t>
+              </m:r>
+              <m:r>
+                <m:rPr>
+                  <m:sty m:val="p"/>
+                </m:rPr>
+                <m:t>=</m:t>
+              </m:r>
+              <m:r>
+                <m:t>27</m:t>
+              </m:r>
+              <m:r>
+                <m:rPr>
+                  <m:sty m:val="p"/>
+                </m:rPr>
+                <m:t>.</m:t>
+              </m:r>
+            </m:e>
+          </m:eqArr>
         </m:oMath>
       </m:oMathPara>
     </w:p>
@@ -23717,27 +23710,19 @@
         <w:t xml:space="preserve"> </w:t>
       </w:r>
       <w:r>
-        <w:t xml:space="preserve">are its lower and upper limits,</w:t>
-      </w:r>
-      <w:r>
-        <w:t xml:space="preserve"> </w:t>
-      </w:r>
-      <w:r>
-        <w:t xml:space="preserve">defined in the</w:t>
-      </w:r>
-      <w:r>
-        <w:t xml:space="preserve"> </w:t>
-      </w:r>
-      <w:hyperlink w:anchor="def-lower-upper-limits">
-        <w:r>
-          <w:rPr>
-            <w:rStyle w:val="Hyperlink"/>
-          </w:rPr>
-          <w:t xml:space="preserve">notation for limits of a sum</w:t>
-        </w:r>
-      </w:hyperlink>
-      <w:r>
-        <w:t xml:space="preserve">.</w:t>
+        <w:t xml:space="preserve">are its lower and upper limits:</w:t>
+      </w:r>
+      <w:r>
+        <w:t xml:space="preserve"> </w:t>
+      </w:r>
+      <w:r>
+        <w:t xml:space="preserve"> </w:t>
+      </w:r>
+      <w:r>
+        <w:t xml:space="preserve">the first and last values of the index.</w:t>
+      </w:r>
+      <w:r>
+        <w:t xml:space="preserve"> </w:t>
       </w:r>
     </w:p>
     <w:bookmarkEnd w:id="87"/>

</xml_diff>

<commit_message>
Deploying to gh-pages from @ Morrison-Lab/mds@b32c13ea3f5185eed3d0bf5fa13148a2a8dc5f87 🚀
</commit_message>
<xml_diff>
--- a/algebra-sums.docx
+++ b/algebra-sums.docx
@@ -15,7 +15,7 @@
         <w:pStyle w:val="Date"/>
       </w:pPr>
       <w:r>
-        <w:t xml:space="preserve">Last modified: 2026-10-26 02:21:32 (PDT)</w:t>
+        <w:t xml:space="preserve">Last modified: 2026-10-26 03:33:07 (PDT)</w:t>
       </w:r>
     </w:p>
     <w:bookmarkStart w:id="31" w:name="sec-convexity"/>
@@ -33662,7 +33662,7 @@
         <w:t xml:space="preserve"> </w:t>
       </w:r>
       <w:r>
-        <w:t xml:space="preserve">lists shorthands you may meet in other sources,</w:t>
+        <w:t xml:space="preserve">lists shorthands you may encounter in other sources,</w:t>
       </w:r>
       <w:r>
         <w:t xml:space="preserve"> </w:t>

</xml_diff>

<commit_message>
Deploying to gh-pages from @ Morrison-Lab/mds@8e120667945cfa6267077c12499c8381f718c6fe 🚀
</commit_message>
<xml_diff>
--- a/algebra-sums.docx
+++ b/algebra-sums.docx
@@ -15,7 +15,7 @@
         <w:pStyle w:val="Date"/>
       </w:pPr>
       <w:r>
-        <w:t xml:space="preserve">Last modified: 2026-10-27 17:38:18 (PDT)</w:t>
+        <w:t xml:space="preserve">Last modified: 2026-10-27 20:53:54 (PDT)</w:t>
       </w:r>
     </w:p>
     <w:bookmarkStart w:id="31" w:name="sec-convexity"/>
@@ -22338,7 +22338,7 @@
     </w:p>
     <w:bookmarkEnd w:id="83"/>
     <w:bookmarkEnd w:id="84"/>
-    <w:bookmarkStart w:id="103" w:name="sec-summation"/>
+    <w:bookmarkStart w:id="113" w:name="sec-summation"/>
     <w:p>
       <w:pPr>
         <w:pStyle w:val="Heading2"/>
@@ -26624,11 +26624,7 @@
     </w:p>
     <w:p>
       <w:pPr>
-        <w:pStyle w:val="Compact"/>
-        <w:numPr>
-          <w:ilvl w:val="0"/>
-          <w:numId w:val="1016"/>
-        </w:numPr>
+        <w:pStyle w:val="BodyText"/>
       </w:pPr>
       <w:r>
         <w:t xml:space="preserve">Write</w:t>
@@ -26706,58 +26702,14 @@
         <w:t xml:space="preserve"> </w:t>
       </w:r>
       <w:r>
-        <w:t xml:space="preserve">symbol,</w:t>
-      </w:r>
-      <w:r>
-        <w:t xml:space="preserve"> </w:t>
-      </w:r>
-      <w:r>
-        <w:t xml:space="preserve">and compute its value.</w:t>
-      </w:r>
-    </w:p>
-    <w:p>
-      <w:pPr>
-        <w:pStyle w:val="Compact"/>
-        <w:numPr>
-          <w:ilvl w:val="0"/>
-          <w:numId w:val="1016"/>
-        </w:numPr>
-      </w:pPr>
-      <w:r>
-        <w:t xml:space="preserve">List the elements of</w:t>
-      </w:r>
-      <w:r>
-        <w:t xml:space="preserve"> </w:t>
-      </w:r>
-      <m:oMath>
-        <m:r>
-          <m:t>A</m:t>
-        </m:r>
-      </m:oMath>
-      <w:r>
-        <w:t xml:space="preserve"> </w:t>
-      </w:r>
-      <w:r>
-        <w:t xml:space="preserve">in a different order,</w:t>
-      </w:r>
-      <w:r>
-        <w:t xml:space="preserve"> </w:t>
-      </w:r>
-      <w:r>
-        <w:t xml:space="preserve">and add up the same terms in that order.</w:t>
-      </w:r>
-      <w:r>
-        <w:t xml:space="preserve"> </w:t>
-      </w:r>
-      <w:r>
-        <w:t xml:space="preserve">Is the total the same?</w:t>
+        <w:t xml:space="preserve">symbol.</w:t>
       </w:r>
     </w:p>
     <w:bookmarkEnd w:id="95"/>
     <w:bookmarkStart w:id="96" w:name="sol-sum-over-set"/>
     <w:p>
       <w:pPr>
-        <w:pStyle w:val="FirstParagraph"/>
+        <w:pStyle w:val="BodyText"/>
       </w:pPr>
       <w:r>
         <w:rPr>
@@ -26769,44 +26721,322 @@
       <w:r>
         <w:t xml:space="preserve">. </w:t>
       </w:r>
+      <w:r>
+        <w:t xml:space="preserve">Replace</w:t>
+      </w:r>
+      <w:r>
+        <w:t xml:space="preserve"> </w:t>
+      </w:r>
+      <m:oMath>
+        <m:r>
+          <m:t>x</m:t>
+        </m:r>
+      </m:oMath>
+      <w:r>
+        <w:t xml:space="preserve"> </w:t>
+      </w:r>
+      <w:r>
+        <w:t xml:space="preserve">by each element of</w:t>
+      </w:r>
+      <w:r>
+        <w:t xml:space="preserve"> </w:t>
+      </w:r>
+      <m:oMath>
+        <m:r>
+          <m:t>A</m:t>
+        </m:r>
+      </m:oMath>
+      <w:r>
+        <w:t xml:space="preserve"> </w:t>
+      </w:r>
+      <w:r>
+        <w:t xml:space="preserve">in turn, and add:</w:t>
+      </w:r>
     </w:p>
     <w:p>
       <w:pPr>
-        <w:numPr>
-          <w:ilvl w:val="0"/>
-          <w:numId w:val="1017"/>
-        </w:numPr>
+        <w:pStyle w:val="BodyText"/>
       </w:pPr>
-      <w:r>
-        <w:t xml:space="preserve">Replace</w:t>
-      </w:r>
-      <w:r>
-        <w:t xml:space="preserve"> </w:t>
-      </w:r>
-      <m:oMath>
+      <m:oMathPara>
+        <m:oMathParaPr>
+          <m:jc m:val="center"/>
+        </m:oMathParaPr>
+        <m:oMath>
+          <m:nary>
+            <m:naryPr>
+              <m:chr m:val="∑"/>
+              <m:limLoc m:val="undOvr"/>
+              <m:subHide m:val="off"/>
+              <m:supHide m:val="on"/>
+            </m:naryPr>
+            <m:sub>
+              <m:r>
+                <m:t>x</m:t>
+              </m:r>
+              <m:r>
+                <m:rPr>
+                  <m:sty m:val="p"/>
+                </m:rPr>
+                <m:t>∈</m:t>
+              </m:r>
+              <m:r>
+                <m:t>A</m:t>
+              </m:r>
+            </m:sub>
+            <m:sup>
+              <m:r>
+                <m:t>​</m:t>
+              </m:r>
+            </m:sup>
+            <m:e>
+              <m:r>
+                <m:t>f</m:t>
+              </m:r>
+            </m:e>
+          </m:nary>
+          <m:r>
+            <m:rPr>
+              <m:sty m:val="p"/>
+            </m:rPr>
+            <m:t>(</m:t>
+          </m:r>
+          <m:r>
+            <m:t>x</m:t>
+          </m:r>
+          <m:r>
+            <m:rPr>
+              <m:sty m:val="p"/>
+            </m:rPr>
+            <m:t>)</m:t>
+          </m:r>
+          <m:r>
+            <m:rPr>
+              <m:sty m:val="p"/>
+            </m:rPr>
+            <m:t>=</m:t>
+          </m:r>
+          <m:r>
+            <m:t>f</m:t>
+          </m:r>
+          <m:r>
+            <m:rPr>
+              <m:sty m:val="p"/>
+            </m:rPr>
+            <m:t>(</m:t>
+          </m:r>
+          <m:r>
+            <m:rPr>
+              <m:sty m:val="p"/>
+            </m:rPr>
+            <m:t>−</m:t>
+          </m:r>
+          <m:r>
+            <m:t>1</m:t>
+          </m:r>
+          <m:r>
+            <m:rPr>
+              <m:sty m:val="p"/>
+            </m:rPr>
+            <m:t>)</m:t>
+          </m:r>
+          <m:r>
+            <m:rPr>
+              <m:sty m:val="p"/>
+            </m:rPr>
+            <m:t>+</m:t>
+          </m:r>
+          <m:r>
+            <m:t>f</m:t>
+          </m:r>
+          <m:r>
+            <m:rPr>
+              <m:sty m:val="p"/>
+            </m:rPr>
+            <m:t>(</m:t>
+          </m:r>
+          <m:r>
+            <m:t>2</m:t>
+          </m:r>
+          <m:r>
+            <m:rPr>
+              <m:sty m:val="p"/>
+            </m:rPr>
+            <m:t>)</m:t>
+          </m:r>
+          <m:r>
+            <m:rPr>
+              <m:sty m:val="p"/>
+            </m:rPr>
+            <m:t>+</m:t>
+          </m:r>
+          <m:r>
+            <m:t>f</m:t>
+          </m:r>
+          <m:r>
+            <m:rPr>
+              <m:sty m:val="p"/>
+            </m:rPr>
+            <m:t>(</m:t>
+          </m:r>
+          <m:r>
+            <m:t>5</m:t>
+          </m:r>
+          <m:r>
+            <m:rPr>
+              <m:sty m:val="p"/>
+            </m:rPr>
+            <m:t>)</m:t>
+          </m:r>
+        </m:oMath>
+      </m:oMathPara>
+    </w:p>
+    <w:bookmarkEnd w:id="96"/>
+    <w:bookmarkStart w:id="98" w:name="exr-sum-over-set-value"/>
+    <w:p>
+      <w:pPr>
+        <w:pStyle w:val="FirstParagraph"/>
+      </w:pPr>
+      <w:r>
+        <w:rPr>
+          <w:b/>
+          <w:bCs/>
+        </w:rPr>
+        <w:t xml:space="preserve">Exercise 6 (Value of a sum over a set)</w:t>
+      </w:r>
+      <w:r>
+        <w:t xml:space="preserve"> </w:t>
+      </w:r>
+      <w:r>
+        <w:t xml:space="preserve">In the setting of</w:t>
+      </w:r>
+      <w:r>
+        <w:t xml:space="preserve"> </w:t>
+      </w:r>
+      <w:hyperlink w:anchor="exr-sum-over-set">
+        <w:r>
+          <w:rPr>
+            <w:rStyle w:val="Hyperlink"/>
+          </w:rPr>
+          <w:t xml:space="preserve">Exercise 5</w:t>
+        </w:r>
+      </w:hyperlink>
+      <w:r>
+        <w:t xml:space="preserve">,</w:t>
+      </w:r>
+      <w:r>
+        <w:t xml:space="preserve"> </w:t>
+      </w:r>
+      <w:r>
+        <w:t xml:space="preserve">find the</w:t>
+      </w:r>
+      <w:r>
+        <w:t xml:space="preserve"> </w:t>
+      </w:r>
+      <w:hyperlink r:id="rId97">
+        <w:r>
+          <w:rPr>
+            <w:rStyle w:val="Hyperlink"/>
+          </w:rPr>
+          <w:t xml:space="preserve">value</w:t>
+        </w:r>
+      </w:hyperlink>
+      <w:r>
+        <w:t xml:space="preserve"> </w:t>
+      </w:r>
+      <w:r>
+        <w:t xml:space="preserve">of</w:t>
+      </w:r>
+      <w:r>
+        <w:t xml:space="preserve"> </w:t>
+      </w:r>
+      <m:oMath>
+        <m:nary>
+          <m:naryPr>
+            <m:chr m:val="∑"/>
+            <m:limLoc m:val="undOvr"/>
+            <m:subHide m:val="off"/>
+            <m:supHide m:val="on"/>
+          </m:naryPr>
+          <m:sub>
+            <m:r>
+              <m:t>x</m:t>
+            </m:r>
+            <m:r>
+              <m:rPr>
+                <m:sty m:val="p"/>
+              </m:rPr>
+              <m:t>∈</m:t>
+            </m:r>
+            <m:r>
+              <m:t>A</m:t>
+            </m:r>
+          </m:sub>
+          <m:sup>
+            <m:r>
+              <m:t>​</m:t>
+            </m:r>
+          </m:sup>
+          <m:e>
+            <m:r>
+              <m:t>f</m:t>
+            </m:r>
+          </m:e>
+        </m:nary>
+        <m:r>
+          <m:rPr>
+            <m:sty m:val="p"/>
+          </m:rPr>
+          <m:t>(</m:t>
+        </m:r>
         <m:r>
           <m:t>x</m:t>
         </m:r>
-      </m:oMath>
-      <w:r>
-        <w:t xml:space="preserve"> </w:t>
-      </w:r>
-      <w:r>
-        <w:t xml:space="preserve">by each element of</w:t>
-      </w:r>
-      <w:r>
-        <w:t xml:space="preserve"> </w:t>
-      </w:r>
-      <m:oMath>
-        <m:r>
-          <m:t>A</m:t>
-        </m:r>
-      </m:oMath>
-      <w:r>
-        <w:t xml:space="preserve"> </w:t>
-      </w:r>
-      <w:r>
-        <w:t xml:space="preserve">in turn, and add the results:</w:t>
+        <m:r>
+          <m:rPr>
+            <m:sty m:val="p"/>
+          </m:rPr>
+          <m:t>)</m:t>
+        </m:r>
+      </m:oMath>
+      <w:r>
+        <w:t xml:space="preserve">.</w:t>
+      </w:r>
+    </w:p>
+    <w:bookmarkEnd w:id="98"/>
+    <w:bookmarkStart w:id="100" w:name="sol-sum-over-set-value"/>
+    <w:p>
+      <w:pPr>
+        <w:pStyle w:val="BodyText"/>
+      </w:pPr>
+      <w:r>
+        <w:rPr>
+          <w:i/>
+          <w:iCs/>
+        </w:rPr>
+        <w:t xml:space="preserve">Solution 6</w:t>
+      </w:r>
+      <w:r>
+        <w:t xml:space="preserve">. </w:t>
+      </w:r>
+      <w:r>
+        <w:t xml:space="preserve">Evaluate each</w:t>
+      </w:r>
+      <w:r>
+        <w:t xml:space="preserve"> </w:t>
+      </w:r>
+      <w:hyperlink r:id="rId99">
+        <w:r>
+          <w:rPr>
+            <w:rStyle w:val="Hyperlink"/>
+          </w:rPr>
+          <w:t xml:space="preserve">term</w:t>
+        </w:r>
+      </w:hyperlink>
+      <w:r>
+        <w:t xml:space="preserve"> </w:t>
+      </w:r>
+      <w:r>
+        <w:t xml:space="preserve">and add:</w:t>
       </w:r>
     </w:p>
     <w:p>
@@ -26820,38 +27050,9 @@
         <m:oMath>
           <m:eqArr>
             <m:e>
-              <m:nary>
-                <m:naryPr>
-                  <m:chr m:val="∑"/>
-                  <m:limLoc m:val="undOvr"/>
-                  <m:subHide m:val="off"/>
-                  <m:supHide m:val="on"/>
-                </m:naryPr>
-                <m:sub>
-                  <m:r>
-                    <m:t>x</m:t>
-                  </m:r>
-                  <m:r>
-                    <m:rPr>
-                      <m:sty m:val="p"/>
-                    </m:rPr>
-                    <m:t>∈</m:t>
-                  </m:r>
-                  <m:r>
-                    <m:t>A</m:t>
-                  </m:r>
-                </m:sub>
-                <m:sup>
-                  <m:r>
-                    <m:t>​</m:t>
-                  </m:r>
-                </m:sup>
-                <m:e>
-                  <m:r>
-                    <m:t>f</m:t>
-                  </m:r>
-                </m:e>
-              </m:nary>
+              <m:r>
+                <m:t>f</m:t>
+              </m:r>
               <m:r>
                 <m:rPr>
                   <m:sty m:val="p"/>
@@ -26859,7 +27060,13 @@
                 <m:t>(</m:t>
               </m:r>
               <m:r>
-                <m:t>x</m:t>
+                <m:rPr>
+                  <m:sty m:val="p"/>
+                </m:rPr>
+                <m:t>−</m:t>
+              </m:r>
+              <m:r>
+                <m:t>1</m:t>
               </m:r>
               <m:r>
                 <m:rPr>
@@ -26868,13 +27075,10 @@
                 <m:t>)</m:t>
               </m:r>
               <m:r>
-                <m:t>&amp;</m:t>
-              </m:r>
-              <m:r>
-                <m:rPr>
-                  <m:sty m:val="p"/>
-                </m:rPr>
-                <m:t>=</m:t>
+                <m:rPr>
+                  <m:sty m:val="p"/>
+                </m:rPr>
+                <m:t>+</m:t>
               </m:r>
               <m:r>
                 <m:t>f</m:t>
@@ -26886,13 +27090,7 @@
                 <m:t>(</m:t>
               </m:r>
               <m:r>
-                <m:rPr>
-                  <m:sty m:val="p"/>
-                </m:rPr>
-                <m:t>−</m:t>
-              </m:r>
-              <m:r>
-                <m:t>1</m:t>
+                <m:t>2</m:t>
               </m:r>
               <m:r>
                 <m:rPr>
@@ -26916,7 +27114,7 @@
                 <m:t>(</m:t>
               </m:r>
               <m:r>
-                <m:t>2</m:t>
+                <m:t>5</m:t>
               </m:r>
               <m:r>
                 <m:rPr>
@@ -26924,32 +27122,6 @@
                 </m:rPr>
                 <m:t>)</m:t>
               </m:r>
-              <m:r>
-                <m:rPr>
-                  <m:sty m:val="p"/>
-                </m:rPr>
-                <m:t>+</m:t>
-              </m:r>
-              <m:r>
-                <m:t>f</m:t>
-              </m:r>
-              <m:r>
-                <m:rPr>
-                  <m:sty m:val="p"/>
-                </m:rPr>
-                <m:t>(</m:t>
-              </m:r>
-              <m:r>
-                <m:t>5</m:t>
-              </m:r>
-              <m:r>
-                <m:rPr>
-                  <m:sty m:val="p"/>
-                </m:rPr>
-                <m:t>)</m:t>
-              </m:r>
-            </m:e>
-            <m:e>
               <m:r>
                 <m:t>&amp;</m:t>
               </m:r>
@@ -27076,149 +27248,385 @@
         </m:oMath>
       </m:oMathPara>
     </w:p>
-    <w:p>
-      <w:pPr>
-        <w:numPr>
-          <w:ilvl w:val="0"/>
-          <w:numId w:val="1017"/>
-        </w:numPr>
-      </w:pPr>
-      <w:r>
-        <w:t xml:space="preserve">In the order</w:t>
-      </w:r>
-      <w:r>
-        <w:t xml:space="preserve"> </w:t>
-      </w:r>
-      <m:oMath>
-        <m:r>
-          <m:t>5</m:t>
-        </m:r>
-        <m:r>
-          <m:rPr>
-            <m:sty m:val="p"/>
-          </m:rPr>
-          <m:t>,</m:t>
-        </m:r>
-        <m:r>
-          <m:rPr>
-            <m:sty m:val="p"/>
-          </m:rPr>
-          <m:t>−</m:t>
-        </m:r>
-        <m:r>
-          <m:t>1</m:t>
-        </m:r>
-        <m:r>
-          <m:rPr>
-            <m:sty m:val="p"/>
-          </m:rPr>
-          <m:t>,</m:t>
-        </m:r>
-        <m:r>
-          <m:t>2</m:t>
-        </m:r>
-      </m:oMath>
-      <w:r>
-        <w:t xml:space="preserve">, the terms are</w:t>
-      </w:r>
-      <w:r>
-        <w:t xml:space="preserve"> </w:t>
-      </w:r>
-      <m:oMath>
-        <m:r>
-          <m:t>25</m:t>
-        </m:r>
-      </m:oMath>
-      <w:r>
-        <w:t xml:space="preserve">,</w:t>
-      </w:r>
-      <w:r>
-        <w:t xml:space="preserve"> </w:t>
-      </w:r>
-      <m:oMath>
-        <m:r>
-          <m:t>1</m:t>
-        </m:r>
-      </m:oMath>
-      <w:r>
-        <w:t xml:space="preserve"> </w:t>
-      </w:r>
-      <w:r>
-        <w:t xml:space="preserve">and</w:t>
-      </w:r>
-      <w:r>
-        <w:t xml:space="preserve"> </w:t>
-      </w:r>
-      <m:oMath>
-        <m:r>
-          <m:t>4</m:t>
-        </m:r>
-      </m:oMath>
-      <w:r>
-        <w:t xml:space="preserve">.</w:t>
-      </w:r>
-      <w:r>
-        <w:t xml:space="preserve"> </w:t>
-      </w:r>
-      <w:r>
-        <w:t xml:space="preserve">Their total is</w:t>
-      </w:r>
-      <w:r>
-        <w:t xml:space="preserve"> </w:t>
-      </w:r>
-      <m:oMath>
-        <m:r>
-          <m:t>25</m:t>
-        </m:r>
-        <m:r>
-          <m:rPr>
-            <m:sty m:val="p"/>
-          </m:rPr>
-          <m:t>+</m:t>
-        </m:r>
-        <m:r>
-          <m:t>1</m:t>
-        </m:r>
-        <m:r>
-          <m:rPr>
-            <m:sty m:val="p"/>
-          </m:rPr>
-          <m:t>+</m:t>
-        </m:r>
-        <m:r>
-          <m:t>4</m:t>
-        </m:r>
-        <m:r>
-          <m:rPr>
-            <m:sty m:val="p"/>
-          </m:rPr>
-          <m:t>=</m:t>
-        </m:r>
-        <m:r>
-          <m:t>30</m:t>
-        </m:r>
-      </m:oMath>
-      <w:r>
-        <w:t xml:space="preserve">.</w:t>
-      </w:r>
-      <w:r>
-        <w:t xml:space="preserve"> </w:t>
-      </w:r>
-      <w:r>
-        <w:t xml:space="preserve">The total is the same,</w:t>
-      </w:r>
-      <w:r>
-        <w:t xml:space="preserve"> </w:t>
-      </w:r>
-      <w:r>
-        <w:t xml:space="preserve">because addition does not depend on the order of the terms.</w:t>
-      </w:r>
-    </w:p>
-    <w:bookmarkEnd w:id="96"/>
-    <w:bookmarkStart w:id="99" w:name="def-sum-over-set"/>
+    <w:bookmarkEnd w:id="100"/>
+    <w:bookmarkStart w:id="101" w:name="exr-sum-over-set-reorder"/>
     <w:p>
       <w:pPr>
         <w:pStyle w:val="FirstParagraph"/>
+      </w:pPr>
+      <w:r>
+        <w:rPr>
+          <w:b/>
+          <w:bCs/>
+        </w:rPr>
+        <w:t xml:space="preserve">Exercise 7 (List the terms in a different order)</w:t>
+      </w:r>
+      <w:r>
+        <w:t xml:space="preserve"> </w:t>
+      </w:r>
+      <w:r>
+        <w:t xml:space="preserve">In the setting of</w:t>
+      </w:r>
+      <w:r>
+        <w:t xml:space="preserve"> </w:t>
+      </w:r>
+      <w:hyperlink w:anchor="exr-sum-over-set">
+        <w:r>
+          <w:rPr>
+            <w:rStyle w:val="Hyperlink"/>
+          </w:rPr>
+          <w:t xml:space="preserve">Exercise 5</w:t>
+        </w:r>
+      </w:hyperlink>
+      <w:r>
+        <w:t xml:space="preserve">,</w:t>
+      </w:r>
+      <w:r>
+        <w:t xml:space="preserve"> </w:t>
+      </w:r>
+      <w:r>
+        <w:t xml:space="preserve">list the elements of</w:t>
+      </w:r>
+      <w:r>
+        <w:t xml:space="preserve"> </w:t>
+      </w:r>
+      <m:oMath>
+        <m:r>
+          <m:t>A</m:t>
+        </m:r>
+      </m:oMath>
+      <w:r>
+        <w:t xml:space="preserve"> </w:t>
+      </w:r>
+      <w:r>
+        <w:t xml:space="preserve">in a different order,</w:t>
+      </w:r>
+      <w:r>
+        <w:t xml:space="preserve"> </w:t>
+      </w:r>
+      <w:r>
+        <w:t xml:space="preserve">and write the</w:t>
+      </w:r>
+      <w:r>
+        <w:t xml:space="preserve"> </w:t>
+      </w:r>
+      <w:hyperlink r:id="rId99">
+        <w:r>
+          <w:rPr>
+            <w:rStyle w:val="Hyperlink"/>
+          </w:rPr>
+          <w:t xml:space="preserve">term</w:t>
+        </w:r>
+      </w:hyperlink>
+      <w:r>
+        <w:t xml:space="preserve"> </w:t>
+      </w:r>
+      <w:r>
+        <w:t xml:space="preserve">for each element in that order.</w:t>
+      </w:r>
+    </w:p>
+    <w:bookmarkEnd w:id="101"/>
+    <w:bookmarkStart w:id="102" w:name="sol-sum-over-set-reorder"/>
+    <w:p>
+      <w:pPr>
+        <w:pStyle w:val="BodyText"/>
+      </w:pPr>
+      <w:r>
+        <w:rPr>
+          <w:i/>
+          <w:iCs/>
+        </w:rPr>
+        <w:t xml:space="preserve">Solution 7</w:t>
+      </w:r>
+      <w:r>
+        <w:t xml:space="preserve">. </w:t>
+      </w:r>
+      <w:r>
+        <w:t xml:space="preserve">In the order</w:t>
+      </w:r>
+      <w:r>
+        <w:t xml:space="preserve"> </w:t>
+      </w:r>
+      <m:oMath>
+        <m:r>
+          <m:t>5</m:t>
+        </m:r>
+        <m:r>
+          <m:rPr>
+            <m:sty m:val="p"/>
+          </m:rPr>
+          <m:t>,</m:t>
+        </m:r>
+        <m:r>
+          <m:rPr>
+            <m:sty m:val="p"/>
+          </m:rPr>
+          <m:t>−</m:t>
+        </m:r>
+        <m:r>
+          <m:t>1</m:t>
+        </m:r>
+        <m:r>
+          <m:rPr>
+            <m:sty m:val="p"/>
+          </m:rPr>
+          <m:t>,</m:t>
+        </m:r>
+        <m:r>
+          <m:t>2</m:t>
+        </m:r>
+      </m:oMath>
+      <w:r>
+        <w:t xml:space="preserve">, the</w:t>
+      </w:r>
+      <w:r>
+        <w:t xml:space="preserve"> </w:t>
+      </w:r>
+      <w:hyperlink r:id="rId99">
+        <w:r>
+          <w:rPr>
+            <w:rStyle w:val="Hyperlink"/>
+          </w:rPr>
+          <w:t xml:space="preserve">terms</w:t>
+        </w:r>
+      </w:hyperlink>
+      <w:r>
+        <w:t xml:space="preserve"> </w:t>
+      </w:r>
+      <w:r>
+        <w:t xml:space="preserve">are</w:t>
+      </w:r>
+      <w:r>
+        <w:t xml:space="preserve"> </w:t>
+      </w:r>
+      <m:oMath>
+        <m:r>
+          <m:t>25</m:t>
+        </m:r>
+      </m:oMath>
+      <w:r>
+        <w:t xml:space="preserve">,</w:t>
+      </w:r>
+      <w:r>
+        <w:t xml:space="preserve"> </w:t>
+      </w:r>
+      <m:oMath>
+        <m:r>
+          <m:t>1</m:t>
+        </m:r>
+      </m:oMath>
+      <w:r>
+        <w:t xml:space="preserve"> </w:t>
+      </w:r>
+      <w:r>
+        <w:t xml:space="preserve">and</w:t>
+      </w:r>
+      <w:r>
+        <w:t xml:space="preserve"> </w:t>
+      </w:r>
+      <m:oMath>
+        <m:r>
+          <m:t>4</m:t>
+        </m:r>
+      </m:oMath>
+      <w:r>
+        <w:t xml:space="preserve">.</w:t>
+      </w:r>
+    </w:p>
+    <w:bookmarkEnd w:id="102"/>
+    <w:bookmarkStart w:id="103" w:name="exr-sum-over-set-reorder-total"/>
+    <w:p>
+      <w:pPr>
+        <w:pStyle w:val="BodyText"/>
+      </w:pPr>
+      <w:r>
+        <w:rPr>
+          <w:b/>
+          <w:bCs/>
+        </w:rPr>
+        <w:t xml:space="preserve">Exercise 8 (Add the terms in the new order)</w:t>
+      </w:r>
+      <w:r>
+        <w:t xml:space="preserve"> </w:t>
+      </w:r>
+      <w:r>
+        <w:t xml:space="preserve">In the setting of</w:t>
+      </w:r>
+      <w:r>
+        <w:t xml:space="preserve"> </w:t>
+      </w:r>
+      <w:hyperlink w:anchor="exr-sum-over-set-reorder">
+        <w:r>
+          <w:rPr>
+            <w:rStyle w:val="Hyperlink"/>
+          </w:rPr>
+          <w:t xml:space="preserve">Exercise 7</w:t>
+        </w:r>
+      </w:hyperlink>
+      <w:r>
+        <w:t xml:space="preserve">,</w:t>
+      </w:r>
+      <w:r>
+        <w:t xml:space="preserve"> </w:t>
+      </w:r>
+      <w:r>
+        <w:t xml:space="preserve">add up the</w:t>
+      </w:r>
+      <w:r>
+        <w:t xml:space="preserve"> </w:t>
+      </w:r>
+      <w:hyperlink r:id="rId99">
+        <w:r>
+          <w:rPr>
+            <w:rStyle w:val="Hyperlink"/>
+          </w:rPr>
+          <w:t xml:space="preserve">terms</w:t>
+        </w:r>
+      </w:hyperlink>
+      <w:r>
+        <w:t xml:space="preserve">.</w:t>
+      </w:r>
+    </w:p>
+    <w:bookmarkEnd w:id="103"/>
+    <w:bookmarkStart w:id="104" w:name="sol-sum-over-set-reorder-total"/>
+    <w:p>
+      <w:pPr>
+        <w:pStyle w:val="BodyText"/>
+      </w:pPr>
+      <w:r>
+        <w:rPr>
+          <w:i/>
+          <w:iCs/>
+        </w:rPr>
+        <w:t xml:space="preserve">Solution 8</w:t>
+      </w:r>
+      <w:r>
+        <w:t xml:space="preserve">. </w:t>
+      </w:r>
+      <w:r>
+        <w:t xml:space="preserve">The total is</w:t>
+      </w:r>
+      <w:r>
+        <w:t xml:space="preserve"> </w:t>
+      </w:r>
+      <m:oMath>
+        <m:r>
+          <m:t>25</m:t>
+        </m:r>
+        <m:r>
+          <m:rPr>
+            <m:sty m:val="p"/>
+          </m:rPr>
+          <m:t>+</m:t>
+        </m:r>
+        <m:r>
+          <m:t>1</m:t>
+        </m:r>
+        <m:r>
+          <m:rPr>
+            <m:sty m:val="p"/>
+          </m:rPr>
+          <m:t>+</m:t>
+        </m:r>
+        <m:r>
+          <m:t>4</m:t>
+        </m:r>
+        <m:r>
+          <m:rPr>
+            <m:sty m:val="p"/>
+          </m:rPr>
+          <m:t>=</m:t>
+        </m:r>
+        <m:r>
+          <m:t>30</m:t>
+        </m:r>
+      </m:oMath>
+      <w:r>
+        <w:t xml:space="preserve">.</w:t>
+      </w:r>
+    </w:p>
+    <w:bookmarkEnd w:id="104"/>
+    <w:bookmarkStart w:id="105" w:name="exr-sum-over-set-order-total"/>
+    <w:p>
+      <w:pPr>
+        <w:pStyle w:val="BodyText"/>
+      </w:pPr>
+      <w:r>
+        <w:rPr>
+          <w:b/>
+          <w:bCs/>
+        </w:rPr>
+        <w:t xml:space="preserve">Exercise 9 (Does the order change the total?)</w:t>
+      </w:r>
+      <w:r>
+        <w:t xml:space="preserve"> </w:t>
+      </w:r>
+      <w:r>
+        <w:t xml:space="preserve">Say whether the total in</w:t>
+      </w:r>
+      <w:r>
+        <w:t xml:space="preserve"> </w:t>
+      </w:r>
+      <w:hyperlink w:anchor="exr-sum-over-set-reorder-total">
+        <w:r>
+          <w:rPr>
+            <w:rStyle w:val="Hyperlink"/>
+          </w:rPr>
+          <w:t xml:space="preserve">Exercise 8</w:t>
+        </w:r>
+      </w:hyperlink>
+      <w:r>
+        <w:t xml:space="preserve"> </w:t>
+      </w:r>
+      <w:r>
+        <w:t xml:space="preserve">is the same as the total in</w:t>
+      </w:r>
+      <w:r>
+        <w:t xml:space="preserve"> </w:t>
+      </w:r>
+      <w:hyperlink w:anchor="exr-sum-over-set-value">
+        <w:r>
+          <w:rPr>
+            <w:rStyle w:val="Hyperlink"/>
+          </w:rPr>
+          <w:t xml:space="preserve">Exercise 6</w:t>
+        </w:r>
+      </w:hyperlink>
+      <w:r>
+        <w:t xml:space="preserve">.</w:t>
+      </w:r>
+    </w:p>
+    <w:bookmarkEnd w:id="105"/>
+    <w:bookmarkStart w:id="106" w:name="sol-sum-over-set-order-total"/>
+    <w:p>
+      <w:pPr>
+        <w:pStyle w:val="BodyText"/>
+      </w:pPr>
+      <w:r>
+        <w:rPr>
+          <w:i/>
+          <w:iCs/>
+        </w:rPr>
+        <w:t xml:space="preserve">Solution 9</w:t>
+      </w:r>
+      <w:r>
+        <w:t xml:space="preserve">. </w:t>
+      </w:r>
+      <w:r>
+        <w:t xml:space="preserve">The total is the same,</w:t>
+      </w:r>
+      <w:r>
+        <w:t xml:space="preserve"> </w:t>
+      </w:r>
+      <w:r>
+        <w:t xml:space="preserve">because addition does not depend on the order of the terms.</w:t>
+      </w:r>
+    </w:p>
+    <w:bookmarkEnd w:id="106"/>
+    <w:bookmarkStart w:id="109" w:name="def-sum-over-set"/>
+    <w:p>
+      <w:pPr>
+        <w:pStyle w:val="BodyText"/>
       </w:pPr>
       <w:r>
         <w:rPr>
@@ -27332,7 +27740,7 @@
       <w:r>
         <w:t xml:space="preserve"> </w:t>
       </w:r>
-      <w:hyperlink r:id="rId97">
+      <w:hyperlink r:id="rId107">
         <w:r>
           <w:rPr>
             <w:rStyle w:val="Hyperlink"/>
@@ -27343,7 +27751,7 @@
       <w:r>
         <w:t xml:space="preserve"> </w:t>
       </w:r>
-      <w:hyperlink r:id="rId98">
+      <w:hyperlink r:id="rId108">
         <w:r>
           <w:rPr>
             <w:rStyle w:val="Hyperlink"/>
@@ -27754,8 +28162,8 @@
         <w:t xml:space="preserve">.</w:t>
       </w:r>
     </w:p>
-    <w:bookmarkEnd w:id="99"/>
-    <w:bookmarkStart w:id="100" w:name="rem-sum-over-set-order"/>
+    <w:bookmarkEnd w:id="109"/>
+    <w:bookmarkStart w:id="110" w:name="rem-sum-over-set-order"/>
     <w:p>
       <w:pPr>
         <w:pStyle w:val="BodyText"/>
@@ -28095,16 +28503,36 @@
       <w:r>
         <w:t xml:space="preserve"> </w:t>
       </w:r>
-      <w:hyperlink w:anchor="exr-sum-over-set">
+      <w:hyperlink w:anchor="exr-sum-over-set-value">
         <w:r>
           <w:rPr>
             <w:rStyle w:val="Hyperlink"/>
           </w:rPr>
-          <w:t xml:space="preserve">Exercise 5</w:t>
+          <w:t xml:space="preserve">Exercise 6</w:t>
         </w:r>
       </w:hyperlink>
       <w:r>
-        <w:t xml:space="preserve">, part 2, shows another example.</w:t>
+        <w:t xml:space="preserve"> </w:t>
+      </w:r>
+      <w:r>
+        <w:t xml:space="preserve">and</w:t>
+      </w:r>
+      <w:r>
+        <w:t xml:space="preserve"> </w:t>
+      </w:r>
+      <w:hyperlink w:anchor="exr-sum-over-set-reorder-total">
+        <w:r>
+          <w:rPr>
+            <w:rStyle w:val="Hyperlink"/>
+          </w:rPr>
+          <w:t xml:space="preserve">Exercise 8</w:t>
+        </w:r>
+      </w:hyperlink>
+      <w:r>
+        <w:t xml:space="preserve"> </w:t>
+      </w:r>
+      <w:r>
+        <w:t xml:space="preserve">show another example.</w:t>
       </w:r>
     </w:p>
     <w:p>
@@ -28268,8 +28696,8 @@
         <w:t xml:space="preserve">.</w:t>
       </w:r>
     </w:p>
-    <w:bookmarkEnd w:id="100"/>
-    <w:bookmarkStart w:id="101" w:name="rem-sum-without-set"/>
+    <w:bookmarkEnd w:id="110"/>
+    <w:bookmarkStart w:id="111" w:name="rem-sum-without-set"/>
     <w:p>
       <w:pPr>
         <w:pStyle w:val="BodyText"/>
@@ -28706,8 +29134,8 @@
         <w:t xml:space="preserve">).</w:t>
       </w:r>
     </w:p>
-    <w:bookmarkEnd w:id="101"/>
-    <w:bookmarkStart w:id="102" w:name="exm-sum-over-empty-set"/>
+    <w:bookmarkEnd w:id="111"/>
+    <w:bookmarkStart w:id="112" w:name="exm-sum-over-empty-set"/>
     <w:p>
       <w:pPr>
         <w:pStyle w:val="BodyText"/>
@@ -28796,9 +29224,9 @@
         <w:t xml:space="preserve">.</w:t>
       </w:r>
     </w:p>
-    <w:bookmarkEnd w:id="102"/>
-    <w:bookmarkEnd w:id="103"/>
-    <w:bookmarkStart w:id="126" w:name="quotients"/>
+    <w:bookmarkEnd w:id="112"/>
+    <w:bookmarkEnd w:id="113"/>
+    <w:bookmarkStart w:id="136" w:name="quotients"/>
     <w:p>
       <w:pPr>
         <w:pStyle w:val="Heading2"/>
@@ -28807,7 +29235,7 @@
         <w:t xml:space="preserve">8 Quotients</w:t>
       </w:r>
     </w:p>
-    <w:bookmarkStart w:id="104" w:name="def-quotient"/>
+    <w:bookmarkStart w:id="114" w:name="def-quotient"/>
     <w:p>
       <w:pPr>
         <w:pStyle w:val="FirstParagraph"/>
@@ -28976,8 +29404,8 @@
         </m:oMath>
       </m:oMathPara>
     </w:p>
-    <w:bookmarkEnd w:id="104"/>
-    <w:bookmarkStart w:id="105" w:name="def-fraction"/>
+    <w:bookmarkEnd w:id="114"/>
+    <w:bookmarkStart w:id="115" w:name="def-fraction"/>
     <w:p>
       <w:pPr>
         <w:pStyle w:val="FirstParagraph"/>
@@ -29046,8 +29474,8 @@
         <w:t xml:space="preserve">.</w:t>
       </w:r>
     </w:p>
-    <w:bookmarkEnd w:id="105"/>
-    <w:bookmarkStart w:id="106" w:name="def-numerator"/>
+    <w:bookmarkEnd w:id="115"/>
+    <w:bookmarkStart w:id="116" w:name="def-numerator"/>
     <w:p>
       <w:pPr>
         <w:pStyle w:val="BodyText"/>
@@ -29130,8 +29558,8 @@
         <w:t xml:space="preserve">.</w:t>
       </w:r>
     </w:p>
-    <w:bookmarkEnd w:id="106"/>
-    <w:bookmarkStart w:id="107" w:name="def-denominator"/>
+    <w:bookmarkEnd w:id="116"/>
+    <w:bookmarkStart w:id="117" w:name="def-denominator"/>
     <w:p>
       <w:pPr>
         <w:pStyle w:val="BodyText"/>
@@ -29214,8 +29642,8 @@
         <w:t xml:space="preserve">.</w:t>
       </w:r>
     </w:p>
-    <w:bookmarkEnd w:id="107"/>
-    <w:bookmarkStart w:id="108" w:name="exm-fraction"/>
+    <w:bookmarkEnd w:id="117"/>
+    <w:bookmarkStart w:id="118" w:name="exm-fraction"/>
     <w:p>
       <w:pPr>
         <w:pStyle w:val="BodyText"/>
@@ -29285,8 +29713,8 @@
         <w:t xml:space="preserve">.</w:t>
       </w:r>
     </w:p>
-    <w:bookmarkEnd w:id="108"/>
-    <w:bookmarkStart w:id="109" w:name="exm-quotient"/>
+    <w:bookmarkEnd w:id="118"/>
+    <w:bookmarkStart w:id="119" w:name="exm-quotient"/>
     <w:p>
       <w:pPr>
         <w:pStyle w:val="BodyText"/>
@@ -29422,8 +29850,8 @@
         <w:t xml:space="preserve">requires a nonzero denominator.</w:t>
       </w:r>
     </w:p>
-    <w:bookmarkEnd w:id="109"/>
-    <w:bookmarkStart w:id="110" w:name="def-follow-up"/>
+    <w:bookmarkEnd w:id="119"/>
+    <w:bookmarkStart w:id="120" w:name="def-follow-up"/>
     <w:p>
       <w:pPr>
         <w:pStyle w:val="BodyText"/>
@@ -29464,8 +29892,8 @@
         <w:t xml:space="preserve">is the length of time the study observes that participant.</w:t>
       </w:r>
     </w:p>
-    <w:bookmarkEnd w:id="110"/>
-    <w:bookmarkStart w:id="111" w:name="def-person-years"/>
+    <w:bookmarkEnd w:id="120"/>
+    <w:bookmarkStart w:id="121" w:name="def-person-years"/>
     <w:p>
       <w:pPr>
         <w:pStyle w:val="BodyText"/>
@@ -29523,8 +29951,8 @@
         <w:t xml:space="preserve">measured in years.</w:t>
       </w:r>
     </w:p>
-    <w:bookmarkEnd w:id="111"/>
-    <w:bookmarkStart w:id="112" w:name="exm-person-years"/>
+    <w:bookmarkEnd w:id="121"/>
+    <w:bookmarkStart w:id="122" w:name="exm-person-years"/>
     <w:p>
       <w:pPr>
         <w:pStyle w:val="BodyText"/>
@@ -29705,8 +30133,8 @@
         <w:t xml:space="preserve">person-years.</w:t>
       </w:r>
     </w:p>
-    <w:bookmarkEnd w:id="112"/>
-    <w:bookmarkStart w:id="113" w:name="def-rate"/>
+    <w:bookmarkEnd w:id="122"/>
+    <w:bookmarkStart w:id="123" w:name="def-rate"/>
     <w:p>
       <w:pPr>
         <w:pStyle w:val="BodyText"/>
@@ -29932,7 +30360,7 @@
         <w:t xml:space="preserve">cases per person-year.</w:t>
       </w:r>
     </w:p>
-    <w:bookmarkEnd w:id="113"/>
+    <w:bookmarkEnd w:id="123"/>
     <w:p>
       <w:pPr>
         <w:pStyle w:val="BodyText"/>
@@ -29940,7 +30368,7 @@
       <w:r>
         <w:t xml:space="preserve">cf. </w:t>
       </w:r>
-      <w:hyperlink r:id="rId114">
+      <w:hyperlink r:id="rId124">
         <w:r>
           <w:rPr>
             <w:rStyle w:val="Hyperlink"/>
@@ -29949,7 +30377,7 @@
         </w:r>
       </w:hyperlink>
     </w:p>
-    <w:bookmarkStart w:id="116" w:name="def-ratio"/>
+    <w:bookmarkStart w:id="126" w:name="def-ratio"/>
     <w:p>
       <w:pPr>
         <w:pStyle w:val="BodyText"/>
@@ -29991,7 +30419,7 @@
       <w:r>
         <w:t xml:space="preserve">cf. </w:t>
       </w:r>
-      <w:hyperlink r:id="rId115">
+      <w:hyperlink r:id="rId125">
         <w:r>
           <w:rPr>
             <w:rStyle w:val="Hyperlink"/>
@@ -30000,8 +30428,8 @@
         </w:r>
       </w:hyperlink>
     </w:p>
-    <w:bookmarkEnd w:id="116"/>
-    <w:bookmarkStart w:id="117" w:name="exm-ratio"/>
+    <w:bookmarkEnd w:id="126"/>
+    <w:bookmarkStart w:id="127" w:name="exm-ratio"/>
     <w:p>
       <w:pPr>
         <w:pStyle w:val="BodyText"/>
@@ -30025,7 +30453,7 @@
         <w:pStyle w:val="Compact"/>
         <w:numPr>
           <w:ilvl w:val="0"/>
-          <w:numId w:val="1018"/>
+          <w:numId w:val="1016"/>
         </w:numPr>
       </w:pPr>
       <w:r>
@@ -30117,7 +30545,7 @@
         <w:pStyle w:val="Compact"/>
         <w:numPr>
           <w:ilvl w:val="0"/>
-          <w:numId w:val="1018"/>
+          <w:numId w:val="1016"/>
         </w:numPr>
       </w:pPr>
       <w:r>
@@ -30259,8 +30687,8 @@
         <w:t xml:space="preserve">so this quotient is not a ratio.</w:t>
       </w:r>
     </w:p>
-    <w:bookmarkEnd w:id="117"/>
-    <w:bookmarkStart w:id="120" w:name="def-proportion"/>
+    <w:bookmarkEnd w:id="127"/>
+    <w:bookmarkStart w:id="130" w:name="def-proportion"/>
     <w:p>
       <w:pPr>
         <w:pStyle w:val="FirstParagraph"/>
@@ -30311,7 +30739,7 @@
       <w:r>
         <w:t xml:space="preserve"> </w:t>
       </w:r>
-      <w:hyperlink r:id="rId118">
+      <w:hyperlink r:id="rId128">
         <w:r>
           <w:rPr>
             <w:rStyle w:val="Hyperlink"/>
@@ -30333,7 +30761,7 @@
       <w:r>
         <w:t xml:space="preserve"> </w:t>
       </w:r>
-      <w:hyperlink r:id="rId119">
+      <w:hyperlink r:id="rId129">
         <w:r>
           <w:rPr>
             <w:rStyle w:val="Hyperlink"/>
@@ -30348,8 +30776,8 @@
         <w:t xml:space="preserve">for other meanings.</w:t>
       </w:r>
     </w:p>
-    <w:bookmarkEnd w:id="120"/>
-    <w:bookmarkStart w:id="121" w:name="exm-proportion"/>
+    <w:bookmarkEnd w:id="130"/>
+    <w:bookmarkStart w:id="131" w:name="exm-proportion"/>
     <w:p>
       <w:pPr>
         <w:pStyle w:val="BodyText"/>
@@ -30401,7 +30829,7 @@
         <w:pStyle w:val="Compact"/>
         <w:numPr>
           <w:ilvl w:val="0"/>
-          <w:numId w:val="1019"/>
+          <w:numId w:val="1017"/>
         </w:numPr>
       </w:pPr>
       <w:r>
@@ -30479,7 +30907,7 @@
         <w:pStyle w:val="Compact"/>
         <w:numPr>
           <w:ilvl w:val="0"/>
-          <w:numId w:val="1019"/>
+          <w:numId w:val="1017"/>
         </w:numPr>
       </w:pPr>
       <w:r>
@@ -30570,8 +30998,8 @@
         <w:t xml:space="preserve">non-smokers.</w:t>
       </w:r>
     </w:p>
-    <w:bookmarkEnd w:id="121"/>
-    <w:bookmarkStart w:id="123" w:name="def-proportional"/>
+    <w:bookmarkEnd w:id="131"/>
+    <w:bookmarkStart w:id="133" w:name="def-proportional"/>
     <w:p>
       <w:pPr>
         <w:pStyle w:val="FirstParagraph"/>
@@ -30742,7 +31170,7 @@
       <w:r>
         <w:t xml:space="preserve">(cf. </w:t>
       </w:r>
-      <w:hyperlink r:id="rId122">
+      <w:hyperlink r:id="rId132">
         <w:r>
           <w:rPr>
             <w:rStyle w:val="Hyperlink"/>
@@ -30754,8 +31182,8 @@
         <w:t xml:space="preserve">)</w:t>
       </w:r>
     </w:p>
-    <w:bookmarkEnd w:id="123"/>
-    <w:bookmarkStart w:id="124" w:name="exm-proportional"/>
+    <w:bookmarkEnd w:id="133"/>
+    <w:bookmarkStart w:id="134" w:name="exm-proportional"/>
     <w:p>
       <w:pPr>
         <w:pStyle w:val="BodyText"/>
@@ -30778,7 +31206,7 @@
       <w:pPr>
         <w:numPr>
           <w:ilvl w:val="0"/>
-          <w:numId w:val="1020"/>
+          <w:numId w:val="1018"/>
         </w:numPr>
       </w:pPr>
       <m:oMath>
@@ -31060,7 +31488,7 @@
       <w:pPr>
         <w:numPr>
           <w:ilvl w:val="0"/>
-          <w:numId w:val="1020"/>
+          <w:numId w:val="1018"/>
         </w:numPr>
       </w:pPr>
       <m:oMath>
@@ -31448,7 +31876,7 @@
         <w:t xml:space="preserve">.</w:t>
       </w:r>
     </w:p>
-    <w:bookmarkEnd w:id="124"/>
+    <w:bookmarkEnd w:id="134"/>
     <w:p>
       <w:pPr>
         <w:pStyle w:val="FirstParagraph"/>
@@ -31459,7 +31887,7 @@
       <w:r>
         <w:t xml:space="preserve"> </w:t>
       </w:r>
-      <w:hyperlink r:id="rId125">
+      <w:hyperlink r:id="rId135">
         <w:r>
           <w:rPr>
             <w:rStyle w:val="Hyperlink"/>
@@ -31468,8 +31896,8 @@
         </w:r>
       </w:hyperlink>
     </w:p>
-    <w:bookmarkEnd w:id="126"/>
-    <w:bookmarkStart w:id="173" w:name="sec-notational-shorthands"/>
+    <w:bookmarkEnd w:id="136"/>
+    <w:bookmarkStart w:id="183" w:name="sec-notational-shorthands"/>
     <w:p>
       <w:pPr>
         <w:pStyle w:val="Heading2"/>
@@ -31478,7 +31906,7 @@
         <w:t xml:space="preserve">9 Limits of sums and notational shorthands</w:t>
       </w:r>
     </w:p>
-    <w:bookmarkStart w:id="128" w:name="def-lower-upper-limits"/>
+    <w:bookmarkStart w:id="138" w:name="def-lower-upper-limits"/>
     <w:p>
       <w:pPr>
         <w:pStyle w:val="FirstParagraph"/>
@@ -31606,7 +32034,7 @@
       <w:r>
         <w:t xml:space="preserve"> </w:t>
       </w:r>
-      <w:hyperlink r:id="rId127">
+      <w:hyperlink r:id="rId137">
         <w:r>
           <w:rPr>
             <w:rStyle w:val="Hyperlink"/>
@@ -31706,8 +32134,8 @@
         <w:t xml:space="preserve">In both, the lower limit is written below the symbol.</w:t>
       </w:r>
     </w:p>
-    <w:bookmarkEnd w:id="128"/>
-    <w:bookmarkStart w:id="129" w:name="def-upper-limit"/>
+    <w:bookmarkEnd w:id="138"/>
+    <w:bookmarkStart w:id="139" w:name="def-upper-limit"/>
     <w:p>
       <w:pPr>
         <w:pStyle w:val="BodyText"/>
@@ -31835,7 +32263,7 @@
       <w:r>
         <w:t xml:space="preserve"> </w:t>
       </w:r>
-      <w:hyperlink r:id="rId127">
+      <w:hyperlink r:id="rId137">
         <w:r>
           <w:rPr>
             <w:rStyle w:val="Hyperlink"/>
@@ -31935,8 +32363,8 @@
         <w:t xml:space="preserve">In both, the upper limit is written above the symbol.</w:t>
       </w:r>
     </w:p>
-    <w:bookmarkEnd w:id="129"/>
-    <w:bookmarkStart w:id="130" w:name="def-limits-of-integration"/>
+    <w:bookmarkEnd w:id="139"/>
+    <w:bookmarkStart w:id="140" w:name="def-limits-of-integration"/>
     <w:p>
       <w:pPr>
         <w:pStyle w:val="BodyText"/>
@@ -31957,7 +32385,7 @@
       <w:r>
         <w:t xml:space="preserve"> </w:t>
       </w:r>
-      <w:hyperlink r:id="rId127">
+      <w:hyperlink r:id="rId137">
         <w:r>
           <w:rPr>
             <w:rStyle w:val="Hyperlink"/>
@@ -32090,8 +32518,8 @@
         <w:t xml:space="preserve">.</w:t>
       </w:r>
     </w:p>
-    <w:bookmarkEnd w:id="130"/>
-    <w:bookmarkStart w:id="131" w:name="exm-lower-upper-limits"/>
+    <w:bookmarkEnd w:id="140"/>
+    <w:bookmarkStart w:id="141" w:name="exm-lower-upper-limits"/>
     <w:p>
       <w:pPr>
         <w:pStyle w:val="BodyText"/>
@@ -32115,7 +32543,7 @@
         <w:pStyle w:val="Compact"/>
         <w:numPr>
           <w:ilvl w:val="0"/>
-          <w:numId w:val="1021"/>
+          <w:numId w:val="1019"/>
         </w:numPr>
       </w:pPr>
       <w:r>
@@ -32290,7 +32718,7 @@
         <w:pStyle w:val="Compact"/>
         <w:numPr>
           <w:ilvl w:val="0"/>
-          <w:numId w:val="1021"/>
+          <w:numId w:val="1019"/>
         </w:numPr>
       </w:pPr>
       <w:r>
@@ -32362,8 +32790,8 @@
         <w:t xml:space="preserve">.</w:t>
       </w:r>
     </w:p>
-    <w:bookmarkEnd w:id="131"/>
-    <w:bookmarkStart w:id="134" w:name="rem-limits-two-meanings"/>
+    <w:bookmarkEnd w:id="141"/>
+    <w:bookmarkStart w:id="144" w:name="rem-limits-two-meanings"/>
     <w:p>
       <w:pPr>
         <w:pStyle w:val="FirstParagraph"/>
@@ -32430,7 +32858,7 @@
       <w:r>
         <w:t xml:space="preserve"> </w:t>
       </w:r>
-      <w:hyperlink r:id="rId132">
+      <w:hyperlink r:id="rId142">
         <w:r>
           <w:rPr>
             <w:rStyle w:val="Hyperlink"/>
@@ -32447,7 +32875,7 @@
       <w:r>
         <w:t xml:space="preserve"> </w:t>
       </w:r>
-      <w:hyperlink r:id="rId133">
+      <w:hyperlink r:id="rId143">
         <w:r>
           <w:rPr>
             <w:rStyle w:val="Hyperlink"/>
@@ -32637,8 +33065,8 @@
         <w:t xml:space="preserve">is sent to infinity by a calculus limit.</w:t>
       </w:r>
     </w:p>
-    <w:bookmarkEnd w:id="134"/>
-    <w:bookmarkStart w:id="135" w:name="def-notational-shorthand"/>
+    <w:bookmarkEnd w:id="144"/>
+    <w:bookmarkStart w:id="145" w:name="def-notational-shorthand"/>
     <w:p>
       <w:pPr>
         <w:pStyle w:val="BodyText"/>
@@ -32691,8 +33119,8 @@
         <w:t xml:space="preserve">and relies on the reader to supply the missing part from context.</w:t>
       </w:r>
     </w:p>
-    <w:bookmarkEnd w:id="135"/>
-    <w:bookmarkStart w:id="136" w:name="def-full-form"/>
+    <w:bookmarkEnd w:id="145"/>
+    <w:bookmarkStart w:id="146" w:name="def-full-form"/>
     <w:p>
       <w:pPr>
         <w:pStyle w:val="BodyText"/>
@@ -32744,7 +33172,7 @@
         <w:t xml:space="preserve">is the expression with every part written out.</w:t>
       </w:r>
     </w:p>
-    <w:bookmarkEnd w:id="136"/>
+    <w:bookmarkEnd w:id="146"/>
     <w:tbl>
       <w:tblPr>
         <w:tblStyle w:val="Table"/>
@@ -32786,18 +33214,18 @@
                 <wp:inline>
                   <wp:extent cx="152400" cy="152400"/>
                   <wp:effectExtent b="0" l="0" r="0" t="0"/>
-                  <wp:docPr descr="" title="" id="138" name="Picture"/>
+                  <wp:docPr descr="" title="" id="148" name="Picture"/>
                   <a:graphic>
                     <a:graphicData uri="http://schemas.openxmlformats.org/drawingml/2006/picture">
                       <pic:pic>
                         <pic:nvPicPr>
-                          <pic:cNvPr descr="/opt/quarto/share/formats/docx/note.png" id="139" name="Picture"/>
+                          <pic:cNvPr descr="/opt/quarto/share/formats/docx/note.png" id="149" name="Picture"/>
                           <pic:cNvPicPr>
                             <a:picLocks noChangeArrowheads="1" noChangeAspect="1"/>
                           </pic:cNvPicPr>
                         </pic:nvPicPr>
                         <pic:blipFill>
-                          <a:blip r:embed="rId137"/>
+                          <a:blip r:embed="rId147"/>
                           <a:stretch>
                             <a:fillRect/>
                           </a:stretch>
@@ -33019,7 +33447,7 @@
               <w:pStyle w:val="Compact"/>
               <w:numPr>
                 <w:ilvl w:val="0"/>
-                <w:numId w:val="1022"/>
+                <w:numId w:val="1020"/>
               </w:numPr>
             </w:pPr>
             <m:oMath>
@@ -33056,7 +33484,7 @@
               <w:pStyle w:val="Compact"/>
               <w:numPr>
                 <w:ilvl w:val="0"/>
-                <w:numId w:val="1022"/>
+                <w:numId w:val="1020"/>
               </w:numPr>
             </w:pPr>
             <m:oMath>
@@ -33197,7 +33625,7 @@
         </w:tc>
       </w:tr>
     </w:tbl>
-    <w:bookmarkStart w:id="140" w:name="def-range-of-variable"/>
+    <w:bookmarkStart w:id="150" w:name="def-range-of-variable"/>
     <w:p>
       <w:pPr>
         <w:pStyle w:val="FirstParagraph"/>
@@ -33293,7 +33721,7 @@
         <w:t xml:space="preserve">can take.</w:t>
       </w:r>
     </w:p>
-    <w:bookmarkEnd w:id="140"/>
+    <w:bookmarkEnd w:id="150"/>
     <w:p>
       <w:pPr>
         <w:pStyle w:val="BodyText"/>
@@ -33409,7 +33837,7 @@
       <w:r>
         <w:t xml:space="preserve"> </w:t>
       </w:r>
-      <w:hyperlink r:id="rId141">
+      <w:hyperlink r:id="rId151">
         <w:r>
           <w:rPr>
             <w:rStyle w:val="Hyperlink"/>
@@ -33577,7 +34005,7 @@
       <w:r>
         <w:t xml:space="preserve">(</w:t>
       </w:r>
-      <w:hyperlink r:id="rId142">
+      <w:hyperlink r:id="rId152">
         <w:r>
           <w:rPr>
             <w:rStyle w:val="Hyperlink"/>
@@ -34039,7 +34467,7 @@
       <w:tr>
         <w:tc>
           <w:tcPr/>
-          <w:bookmarkStart w:id="143" w:name="tbl-notational-shorthands"/>
+          <w:bookmarkStart w:id="153" w:name="tbl-notational-shorthands"/>
           <w:p>
             <w:pPr>
               <w:jc w:val="center"/>
@@ -35685,12 +36113,12 @@
               </w:tc>
             </w:tr>
           </w:tbl>
-          <w:bookmarkEnd w:id="143"/>
+          <w:bookmarkEnd w:id="153"/>
           <w:p/>
         </w:tc>
       </w:tr>
     </w:tbl>
-    <w:bookmarkStart w:id="145" w:name="rem-indefinite-integral-not-shorthand"/>
+    <w:bookmarkStart w:id="155" w:name="rem-indefinite-integral-not-shorthand"/>
     <w:p>
       <w:pPr>
         <w:pStyle w:val="BodyText"/>
@@ -35802,7 +36230,7 @@
       <w:r>
         <w:t xml:space="preserve"> </w:t>
       </w:r>
-      <w:hyperlink r:id="rId144">
+      <w:hyperlink r:id="rId154">
         <w:r>
           <w:rPr>
             <w:rStyle w:val="Hyperlink"/>
@@ -35963,8 +36391,8 @@
         <w:t xml:space="preserve">Writing the limits out tells the reader which of the two is meant.</w:t>
       </w:r>
     </w:p>
-    <w:bookmarkEnd w:id="145"/>
-    <w:bookmarkStart w:id="146" w:name="exm-expand-index-shorthand"/>
+    <w:bookmarkEnd w:id="155"/>
+    <w:bookmarkStart w:id="156" w:name="exm-expand-index-shorthand"/>
     <w:p>
       <w:pPr>
         <w:pStyle w:val="BodyText"/>
@@ -36410,9 +36838,9 @@
         </m:oMath>
       </m:oMathPara>
     </w:p>
-    <w:bookmarkEnd w:id="146"/>
-    <w:bookmarkStart w:id="172" w:name="refs"/>
-    <w:bookmarkStart w:id="148" w:name="ref-wikipedia_line_segment"/>
+    <w:bookmarkEnd w:id="156"/>
+    <w:bookmarkStart w:id="182" w:name="refs"/>
+    <w:bookmarkStart w:id="158" w:name="ref-wikipedia_line_segment"/>
     <w:p>
       <w:pPr>
         <w:pStyle w:val="Bibliography"/>
@@ -36459,7 +36887,7 @@
       <w:r>
         <w:t xml:space="preserve"> </w:t>
       </w:r>
-      <w:hyperlink r:id="rId147">
+      <w:hyperlink r:id="rId157">
         <w:r>
           <w:rPr>
             <w:rStyle w:val="Hyperlink"/>
@@ -36468,8 +36896,8 @@
         </w:r>
       </w:hyperlink>
     </w:p>
-    <w:bookmarkEnd w:id="148"/>
-    <w:bookmarkStart w:id="150" w:name="ref-wikipedia_chord_geometry"/>
+    <w:bookmarkEnd w:id="158"/>
+    <w:bookmarkStart w:id="160" w:name="ref-wikipedia_chord_geometry"/>
     <w:p>
       <w:pPr>
         <w:pStyle w:val="Bibliography"/>
@@ -36516,7 +36944,7 @@
       <w:r>
         <w:t xml:space="preserve"> </w:t>
       </w:r>
-      <w:hyperlink r:id="rId149">
+      <w:hyperlink r:id="rId159">
         <w:r>
           <w:rPr>
             <w:rStyle w:val="Hyperlink"/>
@@ -36525,8 +36953,8 @@
         </w:r>
       </w:hyperlink>
     </w:p>
-    <w:bookmarkEnd w:id="150"/>
-    <w:bookmarkStart w:id="152" w:name="ref-wikipedia_convex_function"/>
+    <w:bookmarkEnd w:id="160"/>
+    <w:bookmarkStart w:id="162" w:name="ref-wikipedia_convex_function"/>
     <w:p>
       <w:pPr>
         <w:pStyle w:val="Bibliography"/>
@@ -36573,7 +37001,7 @@
       <w:r>
         <w:t xml:space="preserve"> </w:t>
       </w:r>
-      <w:hyperlink r:id="rId151">
+      <w:hyperlink r:id="rId161">
         <w:r>
           <w:rPr>
             <w:rStyle w:val="Hyperlink"/>
@@ -36582,8 +37010,8 @@
         </w:r>
       </w:hyperlink>
     </w:p>
-    <w:bookmarkEnd w:id="152"/>
-    <w:bookmarkStart w:id="154" w:name="ref-wikipedia_jensens_inequality"/>
+    <w:bookmarkEnd w:id="162"/>
+    <w:bookmarkStart w:id="164" w:name="ref-wikipedia_jensens_inequality"/>
     <w:p>
       <w:pPr>
         <w:pStyle w:val="Bibliography"/>
@@ -36630,7 +37058,7 @@
       <w:r>
         <w:t xml:space="preserve"> </w:t>
       </w:r>
-      <w:hyperlink r:id="rId153">
+      <w:hyperlink r:id="rId163">
         <w:r>
           <w:rPr>
             <w:rStyle w:val="Hyperlink"/>
@@ -36639,8 +37067,8 @@
         </w:r>
       </w:hyperlink>
     </w:p>
-    <w:bookmarkEnd w:id="154"/>
-    <w:bookmarkStart w:id="156" w:name="ref-wikipedia_upper_and_lower_bounds"/>
+    <w:bookmarkEnd w:id="164"/>
+    <w:bookmarkStart w:id="166" w:name="ref-wikipedia_upper_and_lower_bounds"/>
     <w:p>
       <w:pPr>
         <w:pStyle w:val="Bibliography"/>
@@ -36687,7 +37115,7 @@
       <w:r>
         <w:t xml:space="preserve"> </w:t>
       </w:r>
-      <w:hyperlink r:id="rId155">
+      <w:hyperlink r:id="rId165">
         <w:r>
           <w:rPr>
             <w:rStyle w:val="Hyperlink"/>
@@ -36696,8 +37124,8 @@
         </w:r>
       </w:hyperlink>
     </w:p>
-    <w:bookmarkEnd w:id="156"/>
-    <w:bookmarkStart w:id="158" w:name="ref-wikipedia_least_upper_bound_property"/>
+    <w:bookmarkEnd w:id="166"/>
+    <w:bookmarkStart w:id="168" w:name="ref-wikipedia_least_upper_bound_property"/>
     <w:p>
       <w:pPr>
         <w:pStyle w:val="Bibliography"/>
@@ -36744,7 +37172,7 @@
       <w:r>
         <w:t xml:space="preserve"> </w:t>
       </w:r>
-      <w:hyperlink r:id="rId157">
+      <w:hyperlink r:id="rId167">
         <w:r>
           <w:rPr>
             <w:rStyle w:val="Hyperlink"/>
@@ -36753,8 +37181,8 @@
         </w:r>
       </w:hyperlink>
     </w:p>
-    <w:bookmarkEnd w:id="158"/>
-    <w:bookmarkStart w:id="159" w:name="ref-rudin1976principles"/>
+    <w:bookmarkEnd w:id="168"/>
+    <w:bookmarkStart w:id="169" w:name="ref-rudin1976principles"/>
     <w:p>
       <w:pPr>
         <w:pStyle w:val="Bibliography"/>
@@ -36785,8 +37213,8 @@
         <w:t xml:space="preserve">, 3rd ed. in International series in pure and applied mathematics. New York: McGraw-Hill, 1976.</w:t>
       </w:r>
     </w:p>
-    <w:bookmarkEnd w:id="159"/>
-    <w:bookmarkStart w:id="161" w:name="ref-wikipedia_infimum_and_supremum"/>
+    <w:bookmarkEnd w:id="169"/>
+    <w:bookmarkStart w:id="171" w:name="ref-wikipedia_infimum_and_supremum"/>
     <w:p>
       <w:pPr>
         <w:pStyle w:val="Bibliography"/>
@@ -36833,7 +37261,7 @@
       <w:r>
         <w:t xml:space="preserve"> </w:t>
       </w:r>
-      <w:hyperlink r:id="rId160">
+      <w:hyperlink r:id="rId170">
         <w:r>
           <w:rPr>
             <w:rStyle w:val="Hyperlink"/>
@@ -36842,8 +37270,8 @@
         </w:r>
       </w:hyperlink>
     </w:p>
-    <w:bookmarkEnd w:id="161"/>
-    <w:bookmarkStart w:id="163" w:name="ref-wikipedia_identity_element"/>
+    <w:bookmarkEnd w:id="171"/>
+    <w:bookmarkStart w:id="173" w:name="ref-wikipedia_identity_element"/>
     <w:p>
       <w:pPr>
         <w:pStyle w:val="Bibliography"/>
@@ -36890,7 +37318,7 @@
       <w:r>
         <w:t xml:space="preserve"> </w:t>
       </w:r>
-      <w:hyperlink r:id="rId162">
+      <w:hyperlink r:id="rId172">
         <w:r>
           <w:rPr>
             <w:rStyle w:val="Hyperlink"/>
@@ -36899,8 +37327,8 @@
         </w:r>
       </w:hyperlink>
     </w:p>
-    <w:bookmarkEnd w:id="163"/>
-    <w:bookmarkStart w:id="165" w:name="ref-wikipedia_commutative_property"/>
+    <w:bookmarkEnd w:id="173"/>
+    <w:bookmarkStart w:id="175" w:name="ref-wikipedia_commutative_property"/>
     <w:p>
       <w:pPr>
         <w:pStyle w:val="Bibliography"/>
@@ -36947,7 +37375,7 @@
       <w:r>
         <w:t xml:space="preserve"> </w:t>
       </w:r>
-      <w:hyperlink r:id="rId164">
+      <w:hyperlink r:id="rId174">
         <w:r>
           <w:rPr>
             <w:rStyle w:val="Hyperlink"/>
@@ -36956,8 +37384,8 @@
         </w:r>
       </w:hyperlink>
     </w:p>
-    <w:bookmarkEnd w:id="165"/>
-    <w:bookmarkStart w:id="167" w:name="ref-wikipedia_associative_property"/>
+    <w:bookmarkEnd w:id="175"/>
+    <w:bookmarkStart w:id="177" w:name="ref-wikipedia_associative_property"/>
     <w:p>
       <w:pPr>
         <w:pStyle w:val="Bibliography"/>
@@ -37004,7 +37432,7 @@
       <w:r>
         <w:t xml:space="preserve"> </w:t>
       </w:r>
-      <w:hyperlink r:id="rId166">
+      <w:hyperlink r:id="rId176">
         <w:r>
           <w:rPr>
             <w:rStyle w:val="Hyperlink"/>
@@ -37013,8 +37441,8 @@
         </w:r>
       </w:hyperlink>
     </w:p>
-    <w:bookmarkEnd w:id="167"/>
-    <w:bookmarkStart w:id="169" w:name="ref-wikipedia_distributive_property"/>
+    <w:bookmarkEnd w:id="177"/>
+    <w:bookmarkStart w:id="179" w:name="ref-wikipedia_distributive_property"/>
     <w:p>
       <w:pPr>
         <w:pStyle w:val="Bibliography"/>
@@ -37061,7 +37489,7 @@
       <w:r>
         <w:t xml:space="preserve"> </w:t>
       </w:r>
-      <w:hyperlink r:id="rId168">
+      <w:hyperlink r:id="rId178">
         <w:r>
           <w:rPr>
             <w:rStyle w:val="Hyperlink"/>
@@ -37070,8 +37498,8 @@
         </w:r>
       </w:hyperlink>
     </w:p>
-    <w:bookmarkEnd w:id="169"/>
-    <w:bookmarkStart w:id="171" w:name="ref-wikipedia_like_terms"/>
+    <w:bookmarkEnd w:id="179"/>
+    <w:bookmarkStart w:id="181" w:name="ref-wikipedia_like_terms"/>
     <w:p>
       <w:pPr>
         <w:pStyle w:val="Bibliography"/>
@@ -37118,7 +37546,7 @@
       <w:r>
         <w:t xml:space="preserve"> </w:t>
       </w:r>
-      <w:hyperlink r:id="rId170">
+      <w:hyperlink r:id="rId180">
         <w:r>
           <w:rPr>
             <w:rStyle w:val="Hyperlink"/>
@@ -37127,9 +37555,9 @@
         </w:r>
       </w:hyperlink>
     </w:p>
-    <w:bookmarkEnd w:id="171"/>
-    <w:bookmarkEnd w:id="172"/>
-    <w:bookmarkEnd w:id="173"/>
+    <w:bookmarkEnd w:id="181"/>
+    <w:bookmarkEnd w:id="182"/>
+    <w:bookmarkEnd w:id="183"/>
     <w:sectPr>
       <w:footnotePr>
         <w:numRestart w:val="eachSect"/>
@@ -37639,64 +38067,10 @@
     </w:lvlOverride>
   </w:num>
   <w:num w:numId="1016">
-    <w:abstractNumId w:val="99411"/>
-    <w:lvlOverride w:ilvl="0">
-      <w:startOverride w:val="1"/>
-    </w:lvlOverride>
-    <w:lvlOverride w:ilvl="1">
-      <w:startOverride w:val="1"/>
-    </w:lvlOverride>
-    <w:lvlOverride w:ilvl="2">
-      <w:startOverride w:val="1"/>
-    </w:lvlOverride>
-    <w:lvlOverride w:ilvl="3">
-      <w:startOverride w:val="1"/>
-    </w:lvlOverride>
-    <w:lvlOverride w:ilvl="4">
-      <w:startOverride w:val="1"/>
-    </w:lvlOverride>
-    <w:lvlOverride w:ilvl="5">
-      <w:startOverride w:val="1"/>
-    </w:lvlOverride>
-    <w:lvlOverride w:ilvl="6">
-      <w:startOverride w:val="1"/>
-    </w:lvlOverride>
-    <w:lvlOverride w:ilvl="7">
-      <w:startOverride w:val="1"/>
-    </w:lvlOverride>
-    <w:lvlOverride w:ilvl="8">
-      <w:startOverride w:val="1"/>
-    </w:lvlOverride>
+    <w:abstractNumId w:val="991"/>
   </w:num>
   <w:num w:numId="1017">
-    <w:abstractNumId w:val="99411"/>
-    <w:lvlOverride w:ilvl="0">
-      <w:startOverride w:val="1"/>
-    </w:lvlOverride>
-    <w:lvlOverride w:ilvl="1">
-      <w:startOverride w:val="1"/>
-    </w:lvlOverride>
-    <w:lvlOverride w:ilvl="2">
-      <w:startOverride w:val="1"/>
-    </w:lvlOverride>
-    <w:lvlOverride w:ilvl="3">
-      <w:startOverride w:val="1"/>
-    </w:lvlOverride>
-    <w:lvlOverride w:ilvl="4">
-      <w:startOverride w:val="1"/>
-    </w:lvlOverride>
-    <w:lvlOverride w:ilvl="5">
-      <w:startOverride w:val="1"/>
-    </w:lvlOverride>
-    <w:lvlOverride w:ilvl="6">
-      <w:startOverride w:val="1"/>
-    </w:lvlOverride>
-    <w:lvlOverride w:ilvl="7">
-      <w:startOverride w:val="1"/>
-    </w:lvlOverride>
-    <w:lvlOverride w:ilvl="8">
-      <w:startOverride w:val="1"/>
-    </w:lvlOverride>
+    <w:abstractNumId w:val="991"/>
   </w:num>
   <w:num w:numId="1018">
     <w:abstractNumId w:val="991"/>
@@ -37705,12 +38079,6 @@
     <w:abstractNumId w:val="991"/>
   </w:num>
   <w:num w:numId="1020">
-    <w:abstractNumId w:val="991"/>
-  </w:num>
-  <w:num w:numId="1021">
-    <w:abstractNumId w:val="991"/>
-  </w:num>
-  <w:num w:numId="1022">
     <w:abstractNumId w:val="991"/>
   </w:num>
 </w:numbering>

</xml_diff>